<commit_message>
Add PDF regression corpus and editable export baseline
</commit_message>
<xml_diff>
--- a/output/editable.docx
+++ b/output/editable.docx
@@ -6,128 +6,545 @@
       <w:pPr>
         <w:keepLines/>
         <w:widowControl w:val="0"/>
-        <w:spacing w:before="0" w:after="0" w:lineRule="exact" w:line="499"/>
-        <w:ind w:left="1084" w:right="6139" w:firstLine="0"/>
-        <w:jc w:val="left"/>
+        <w:spacing w:before="0" w:after="0" w:line="240" w:lineRule="auto"/>
+        <w:ind w:left="3083" w:right="0" w:firstLine="0"/>
+        <w:jc w:val="center"/>
       </w:pPr>
       <w:r>
         <w:rPr>
-          <w:rFonts w:ascii="DMSans-Regular" w:hAnsi="DMSans-Regular" w:eastAsia="DMSans-Regular" w:cs="DMSans-Regular"/>
-          <w:b w:val="0"/>
+          <w:rFonts w:ascii="Century Schoolbook" w:hAnsi="Century Schoolbook" w:eastAsia="Century Schoolbook" w:cs="Century Schoolbook"/>
+          <w:b/>
           <w:i w:val="0"/>
-          <w:color w:val="000000"/>
-          <w:sz w:val="38"/>
+          <w:color w:val="2E74B5"/>
+          <w:sz w:val="72"/>
         </w:rPr>
-        <w:t>Company, Inc.</w:t>
+        <w:t>Sample PDF</w:t>
       </w:r>
     </w:p>
     <w:p>
       <w:pPr>
         <w:keepLines/>
         <w:widowControl w:val="0"/>
-        <w:spacing w:before="1920" w:after="0" w:lineRule="exact" w:line="1515"/>
-        <w:ind w:left="0" w:right="4077" w:firstLine="0"/>
+        <w:spacing w:before="286" w:after="0" w:line="240" w:lineRule="auto"/>
+        <w:ind w:left="2867" w:right="0" w:firstLine="0"/>
+        <w:jc w:val="center"/>
+      </w:pPr>
+      <w:r>
+        <w:rPr>
+          <w:rFonts w:ascii="Century Schoolbook" w:hAnsi="Century Schoolbook" w:eastAsia="Century Schoolbook" w:cs="Century Schoolbook"/>
+          <w:b w:val="0"/>
+          <w:i w:val="0"/>
+          <w:color w:val="000000"/>
+          <w:sz w:val="36"/>
+        </w:rPr>
+        <w:t xml:space="preserve">Created for testing </w:t>
+      </w:r>
+      <w:r>
+        <w:rPr>
+          <w:rFonts w:ascii="Century Schoolbook" w:hAnsi="Century Schoolbook" w:eastAsia="Century Schoolbook" w:cs="Century Schoolbook"/>
+          <w:b w:val="0"/>
+          <w:i w:val="0"/>
+          <w:color w:val="5B9BD5"/>
+          <w:sz w:val="36"/>
+        </w:rPr>
+        <w:t>PDFObject</w:t>
+      </w:r>
+    </w:p>
+    <w:p>
+      <w:pPr>
+        <w:keepLines/>
+        <w:widowControl w:val="0"/>
+        <w:spacing w:before="296" w:after="0" w:line="240" w:lineRule="auto"/>
+        <w:ind w:left="0" w:right="0" w:firstLine="0"/>
         <w:jc w:val="left"/>
       </w:pPr>
       <w:r>
         <w:rPr>
-          <w:rFonts w:ascii="Repo-Extra Bold" w:hAnsi="Repo-Extra Bold" w:eastAsia="Repo-Extra Bold" w:cs="Repo-Extra Bold"/>
-          <w:b/>
+          <w:rFonts w:ascii="Century Schoolbook" w:hAnsi="Century Schoolbook" w:eastAsia="Century Schoolbook" w:cs="Century Schoolbook"/>
+          <w:b w:val="0"/>
           <w:i w:val="0"/>
           <w:color w:val="000000"/>
-          <w:sz w:val="159"/>
+          <w:sz w:val="32"/>
         </w:rPr>
-        <w:t>Sample</w:t>
+        <w:t>This PDF is three pages long. Three long pages. Or three short pages if</w:t>
       </w:r>
       <w:r>
         <w:br/>
       </w:r>
       <w:r>
         <w:rPr>
-          <w:rFonts w:ascii="Repo-Extra Bold" w:hAnsi="Repo-Extra Bold" w:eastAsia="Repo-Extra Bold" w:cs="Repo-Extra Bold"/>
-          <w:b/>
+          <w:rFonts w:ascii="Century Schoolbook" w:hAnsi="Century Schoolbook" w:eastAsia="Century Schoolbook" w:cs="Century Schoolbook"/>
+          <w:b w:val="0"/>
           <w:i w:val="0"/>
           <w:color w:val="000000"/>
-          <w:sz w:val="159"/>
+          <w:sz w:val="32"/>
         </w:rPr>
-        <w:t>PDF</w:t>
+        <w:t>you’re optimistic. Is it the same as saying “three long minutes”, knowing</w:t>
+      </w:r>
+      <w:r>
+        <w:br/>
+      </w:r>
+      <w:r>
+        <w:rPr>
+          <w:rFonts w:ascii="Century Schoolbook" w:hAnsi="Century Schoolbook" w:eastAsia="Century Schoolbook" w:cs="Century Schoolbook"/>
+          <w:b w:val="0"/>
+          <w:i w:val="0"/>
+          <w:color w:val="000000"/>
+          <w:sz w:val="32"/>
+        </w:rPr>
+        <w:t>that all minutes are the same duration, and one cannot possibly be longer</w:t>
+      </w:r>
+      <w:r>
+        <w:br/>
+      </w:r>
+      <w:r>
+        <w:rPr>
+          <w:rFonts w:ascii="Century Schoolbook" w:hAnsi="Century Schoolbook" w:eastAsia="Century Schoolbook" w:cs="Century Schoolbook"/>
+          <w:b w:val="0"/>
+          <w:i w:val="0"/>
+          <w:color w:val="000000"/>
+          <w:sz w:val="32"/>
+        </w:rPr>
+        <w:t>than the other? If these pages are all the same size, can one possibly be</w:t>
+      </w:r>
+      <w:r>
+        <w:br/>
+      </w:r>
+      <w:r>
+        <w:rPr>
+          <w:rFonts w:ascii="Century Schoolbook" w:hAnsi="Century Schoolbook" w:eastAsia="Century Schoolbook" w:cs="Century Schoolbook"/>
+          <w:b w:val="0"/>
+          <w:i w:val="0"/>
+          <w:color w:val="000000"/>
+          <w:sz w:val="32"/>
+        </w:rPr>
+        <w:t>longer than the other?</w:t>
       </w:r>
     </w:p>
     <w:p>
       <w:pPr>
         <w:keepLines/>
         <w:widowControl w:val="0"/>
-        <w:spacing w:before="5779" w:after="0" w:lineRule="exact" w:line="743"/>
-        <w:ind w:left="0" w:right="5963" w:firstLine="0"/>
+        <w:spacing w:before="290" w:after="0" w:line="240" w:lineRule="auto"/>
+        <w:ind w:left="0" w:right="0" w:firstLine="0"/>
         <w:jc w:val="left"/>
       </w:pPr>
       <w:r>
         <w:rPr>
-          <w:rFonts w:ascii="DMSans-Regular" w:hAnsi="DMSans-Regular" w:eastAsia="DMSans-Regular" w:cs="DMSans-Regular"/>
+          <w:rFonts w:ascii="Century Schoolbook" w:hAnsi="Century Schoolbook" w:eastAsia="Century Schoolbook" w:cs="Century Schoolbook"/>
           <w:b w:val="0"/>
           <w:i w:val="0"/>
           <w:color w:val="000000"/>
-          <w:sz w:val="47"/>
+          <w:sz w:val="24"/>
         </w:rPr>
-        <w:t>Prepared By</w:t>
+        <w:t>I digress. Here’s some Latin. Lorem ipsum dolor sit amet, consectetur adipiscing elit. Integer nec</w:t>
       </w:r>
       <w:r>
         <w:br/>
       </w:r>
       <w:r>
         <w:rPr>
-          <w:rFonts w:ascii="DMSans-Regular" w:hAnsi="DMSans-Regular" w:eastAsia="DMSans-Regular" w:cs="DMSans-Regular"/>
+          <w:rFonts w:ascii="Century Schoolbook" w:hAnsi="Century Schoolbook" w:eastAsia="Century Schoolbook" w:cs="Century Schoolbook"/>
           <w:b w:val="0"/>
           <w:i w:val="0"/>
           <w:color w:val="000000"/>
-          <w:sz w:val="47"/>
+          <w:sz w:val="24"/>
         </w:rPr>
-        <w:t>Chadwick Hilarity</w:t>
+        <w:t>odio. Praesent libero. Sed cursus ante dapibus diam. Sed nisi. Nulla quis sem at nibh elementum</w:t>
+      </w:r>
+      <w:r>
+        <w:br/>
+      </w:r>
+      <w:r>
+        <w:rPr>
+          <w:rFonts w:ascii="Century Schoolbook" w:hAnsi="Century Schoolbook" w:eastAsia="Century Schoolbook" w:cs="Century Schoolbook"/>
+          <w:b w:val="0"/>
+          <w:i w:val="0"/>
+          <w:color w:val="000000"/>
+          <w:sz w:val="24"/>
+        </w:rPr>
+        <w:t>imperdiet. Duis sagittis ipsum. Praesent mauris. Fusce nec tellus sed augue semper porta. Mauris</w:t>
+      </w:r>
+      <w:r>
+        <w:br/>
+      </w:r>
+      <w:r>
+        <w:rPr>
+          <w:rFonts w:ascii="Century Schoolbook" w:hAnsi="Century Schoolbook" w:eastAsia="Century Schoolbook" w:cs="Century Schoolbook"/>
+          <w:b w:val="0"/>
+          <w:i w:val="0"/>
+          <w:color w:val="000000"/>
+          <w:sz w:val="24"/>
+        </w:rPr>
+        <w:t>massa. Vestibulum lacinia arcu eget nulla. Class aptent taciti sociosqu ad litora torquent per</w:t>
+      </w:r>
+      <w:r>
+        <w:br/>
+      </w:r>
+      <w:r>
+        <w:rPr>
+          <w:rFonts w:ascii="Century Schoolbook" w:hAnsi="Century Schoolbook" w:eastAsia="Century Schoolbook" w:cs="Century Schoolbook"/>
+          <w:b w:val="0"/>
+          <w:i w:val="0"/>
+          <w:color w:val="000000"/>
+          <w:sz w:val="24"/>
+        </w:rPr>
+        <w:t>conubia nostra, per inceptos himenaeos. Curabitur sodales ligula in libero.</w:t>
       </w:r>
     </w:p>
     <w:p>
       <w:pPr>
         <w:keepLines/>
         <w:widowControl w:val="0"/>
-        <w:spacing w:before="1622" w:after="0" w:lineRule="exact" w:line="403"/>
-        <w:ind w:left="1031" w:right="6395" w:firstLine="0"/>
+        <w:spacing w:before="288" w:after="0" w:line="240" w:lineRule="auto"/>
+        <w:ind w:left="0" w:right="0" w:firstLine="0"/>
         <w:jc w:val="left"/>
       </w:pPr>
       <w:r>
         <w:rPr>
-          <w:rFonts w:ascii="DMSans-Regular" w:hAnsi="DMSans-Regular" w:eastAsia="DMSans-Regular" w:cs="DMSans-Regular"/>
+          <w:rFonts w:ascii="Century Schoolbook" w:hAnsi="Century Schoolbook" w:eastAsia="Century Schoolbook" w:cs="Century Schoolbook"/>
           <w:b w:val="0"/>
           <w:i w:val="0"/>
           <w:color w:val="000000"/>
-          <w:sz w:val="30"/>
+          <w:sz w:val="24"/>
         </w:rPr>
-        <w:t>+123-456-7890</w:t>
+        <w:t>Sed dignissim lacinia nunc. Curabitur tortor. Pellentesque nibh. Aenean quam. In scelerisque sem</w:t>
+      </w:r>
+      <w:r>
+        <w:br/>
+      </w:r>
+      <w:r>
+        <w:rPr>
+          <w:rFonts w:ascii="Century Schoolbook" w:hAnsi="Century Schoolbook" w:eastAsia="Century Schoolbook" w:cs="Century Schoolbook"/>
+          <w:b w:val="0"/>
+          <w:i w:val="0"/>
+          <w:color w:val="000000"/>
+          <w:sz w:val="24"/>
+        </w:rPr>
+        <w:t>at dolor. Maecenas mattis. Sed convallis tristique sem. Proin ut ligula vel nunc egestas porttitor.</w:t>
+      </w:r>
+      <w:r>
+        <w:br/>
+      </w:r>
+      <w:r>
+        <w:rPr>
+          <w:rFonts w:ascii="Century Schoolbook" w:hAnsi="Century Schoolbook" w:eastAsia="Century Schoolbook" w:cs="Century Schoolbook"/>
+          <w:b w:val="0"/>
+          <w:i w:val="0"/>
+          <w:color w:val="000000"/>
+          <w:sz w:val="24"/>
+        </w:rPr>
+        <w:t>Morbi lectus risus, iaculis vel, suscipit quis, luctus non, massa. Fusce ac turpis quis ligula lacinia</w:t>
+      </w:r>
+      <w:r>
+        <w:br/>
+      </w:r>
+      <w:r>
+        <w:rPr>
+          <w:rFonts w:ascii="Century Schoolbook" w:hAnsi="Century Schoolbook" w:eastAsia="Century Schoolbook" w:cs="Century Schoolbook"/>
+          <w:b w:val="0"/>
+          <w:i w:val="0"/>
+          <w:color w:val="000000"/>
+          <w:sz w:val="24"/>
+        </w:rPr>
+        <w:t>aliquet. Mauris ipsum. Nulla metus metus, ullamcorper vel, tincidunt sed, euismod in, nibh.</w:t>
       </w:r>
     </w:p>
     <w:p>
       <w:pPr>
         <w:keepLines/>
         <w:widowControl w:val="0"/>
-        <w:spacing w:before="0" w:after="0" w:lineRule="exact" w:line="403"/>
-        <w:ind w:left="6206" w:right="0" w:firstLine="0"/>
+        <w:spacing w:before="292" w:after="0" w:line="240" w:lineRule="auto"/>
+        <w:ind w:left="0" w:right="0" w:firstLine="0"/>
         <w:jc w:val="left"/>
       </w:pPr>
       <w:r>
         <w:rPr>
-          <w:rFonts w:ascii="DMSans-Regular" w:hAnsi="DMSans-Regular" w:eastAsia="DMSans-Regular" w:cs="DMSans-Regular"/>
+          <w:rFonts w:ascii="Century Schoolbook" w:hAnsi="Century Schoolbook" w:eastAsia="Century Schoolbook" w:cs="Century Schoolbook"/>
           <w:b w:val="0"/>
           <w:i w:val="0"/>
           <w:color w:val="000000"/>
-          <w:sz w:val="30"/>
+          <w:sz w:val="24"/>
         </w:rPr>
-        <w:t>https://sample-files.com</w:t>
+        <w:t>Quisque volutpat condimentum velit. Class aptent taciti sociosqu ad litora torquent per conubia</w:t>
+      </w:r>
+      <w:r>
+        <w:br/>
+      </w:r>
+      <w:r>
+        <w:rPr>
+          <w:rFonts w:ascii="Century Schoolbook" w:hAnsi="Century Schoolbook" w:eastAsia="Century Schoolbook" w:cs="Century Schoolbook"/>
+          <w:b w:val="0"/>
+          <w:i w:val="0"/>
+          <w:color w:val="000000"/>
+          <w:sz w:val="24"/>
+        </w:rPr>
+        <w:t>nostra, per inceptos himenaeos. Nam nec ante. Sed lacinia, urna non tincidunt mattis, tortor neque</w:t>
+      </w:r>
+      <w:r>
+        <w:br/>
+      </w:r>
+      <w:r>
+        <w:rPr>
+          <w:rFonts w:ascii="Century Schoolbook" w:hAnsi="Century Schoolbook" w:eastAsia="Century Schoolbook" w:cs="Century Schoolbook"/>
+          <w:b w:val="0"/>
+          <w:i w:val="0"/>
+          <w:color w:val="000000"/>
+          <w:sz w:val="24"/>
+        </w:rPr>
+        <w:t>adipiscing diam, a cursus ipsum ante quis turpis. Nulla facilisi. Ut fringilla. Suspendisse potenti.</w:t>
+      </w:r>
+      <w:r>
+        <w:br/>
+      </w:r>
+      <w:r>
+        <w:rPr>
+          <w:rFonts w:ascii="Century Schoolbook" w:hAnsi="Century Schoolbook" w:eastAsia="Century Schoolbook" w:cs="Century Schoolbook"/>
+          <w:b w:val="0"/>
+          <w:i w:val="0"/>
+          <w:color w:val="000000"/>
+          <w:sz w:val="24"/>
+        </w:rPr>
+        <w:t>Nunc feugiat mi a tellus consequat imperdiet. Vestibulum sapien. Proin quam. Etiam ultrices.</w:t>
+      </w:r>
+    </w:p>
+    <w:p>
+      <w:pPr>
+        <w:keepLines/>
+        <w:widowControl w:val="0"/>
+        <w:spacing w:before="288" w:after="0" w:line="240" w:lineRule="auto"/>
+        <w:ind w:left="0" w:right="0" w:firstLine="0"/>
+        <w:jc w:val="left"/>
+      </w:pPr>
+      <w:r>
+        <w:rPr>
+          <w:rFonts w:ascii="Century Schoolbook" w:hAnsi="Century Schoolbook" w:eastAsia="Century Schoolbook" w:cs="Century Schoolbook"/>
+          <w:b w:val="0"/>
+          <w:i w:val="0"/>
+          <w:color w:val="000000"/>
+          <w:sz w:val="24"/>
+        </w:rPr>
+        <w:t>Suspendisse in justo eu magna luctus suscipit. Sed lectus. Integer euismod lacus luctus magna.</w:t>
+      </w:r>
+      <w:r>
+        <w:br/>
+      </w:r>
+      <w:r>
+        <w:rPr>
+          <w:rFonts w:ascii="Century Schoolbook" w:hAnsi="Century Schoolbook" w:eastAsia="Century Schoolbook" w:cs="Century Schoolbook"/>
+          <w:b w:val="0"/>
+          <w:i w:val="0"/>
+          <w:color w:val="000000"/>
+          <w:sz w:val="24"/>
+        </w:rPr>
+        <w:t>Quisque cursus, metus vitae pharetra auctor, sem massa mattis sem, at interdum magna augue</w:t>
+      </w:r>
+      <w:r>
+        <w:br/>
+      </w:r>
+      <w:r>
+        <w:rPr>
+          <w:rFonts w:ascii="Century Schoolbook" w:hAnsi="Century Schoolbook" w:eastAsia="Century Schoolbook" w:cs="Century Schoolbook"/>
+          <w:b w:val="0"/>
+          <w:i w:val="0"/>
+          <w:color w:val="000000"/>
+          <w:sz w:val="24"/>
+        </w:rPr>
+        <w:t>eget diam. Vestibulum ante ipsum primis in faucibus orci luctus et ultrices posuere cubilia Curae;</w:t>
+      </w:r>
+      <w:r>
+        <w:br/>
+      </w:r>
+      <w:r>
+        <w:rPr>
+          <w:rFonts w:ascii="Century Schoolbook" w:hAnsi="Century Schoolbook" w:eastAsia="Century Schoolbook" w:cs="Century Schoolbook"/>
+          <w:b w:val="0"/>
+          <w:i w:val="0"/>
+          <w:color w:val="000000"/>
+          <w:sz w:val="24"/>
+        </w:rPr>
+        <w:t>Morbi lacinia molestie dui. Praesent blandit dolor. Sed non quam. In vel mi sit amet augue congue</w:t>
+      </w:r>
+      <w:r>
+        <w:br/>
+      </w:r>
+      <w:r>
+        <w:rPr>
+          <w:rFonts w:ascii="Century Schoolbook" w:hAnsi="Century Schoolbook" w:eastAsia="Century Schoolbook" w:cs="Century Schoolbook"/>
+          <w:b w:val="0"/>
+          <w:i w:val="0"/>
+          <w:color w:val="000000"/>
+          <w:sz w:val="24"/>
+        </w:rPr>
+        <w:t>elementum. Morbi in ipsum sit amet pede facilisis laoreet. Donec lacus nunc, viverra nec, blandit</w:t>
+      </w:r>
+      <w:r>
+        <w:br/>
+      </w:r>
+      <w:r>
+        <w:rPr>
+          <w:rFonts w:ascii="Century Schoolbook" w:hAnsi="Century Schoolbook" w:eastAsia="Century Schoolbook" w:cs="Century Schoolbook"/>
+          <w:b w:val="0"/>
+          <w:i w:val="0"/>
+          <w:color w:val="000000"/>
+          <w:sz w:val="24"/>
+        </w:rPr>
+        <w:t>vel, egestas et, augue. Vestibulum tincidunt malesuada tellus. Ut ultrices ultrices enim. Curabitur</w:t>
+      </w:r>
+      <w:r>
+        <w:br/>
+      </w:r>
+      <w:r>
+        <w:rPr>
+          <w:rFonts w:ascii="Century Schoolbook" w:hAnsi="Century Schoolbook" w:eastAsia="Century Schoolbook" w:cs="Century Schoolbook"/>
+          <w:b w:val="0"/>
+          <w:i w:val="0"/>
+          <w:color w:val="000000"/>
+          <w:sz w:val="24"/>
+        </w:rPr>
+        <w:t>sit amet mauris.</w:t>
+      </w:r>
+    </w:p>
+    <w:p>
+      <w:pPr>
+        <w:keepLines/>
+        <w:widowControl w:val="0"/>
+        <w:spacing w:before="288" w:after="0" w:line="240" w:lineRule="auto"/>
+        <w:ind w:left="0" w:right="0" w:firstLine="0"/>
+        <w:jc w:val="left"/>
+      </w:pPr>
+      <w:r>
+        <w:rPr>
+          <w:rFonts w:ascii="Century Schoolbook" w:hAnsi="Century Schoolbook" w:eastAsia="Century Schoolbook" w:cs="Century Schoolbook"/>
+          <w:b w:val="0"/>
+          <w:i w:val="0"/>
+          <w:color w:val="000000"/>
+          <w:sz w:val="24"/>
+        </w:rPr>
+        <w:t>Morbi in dui quis est pulvinar ullamcorper. Nulla facilisi. Integer lacinia sollicitudin massa. Cras</w:t>
+      </w:r>
+      <w:r>
+        <w:br/>
+      </w:r>
+      <w:r>
+        <w:rPr>
+          <w:rFonts w:ascii="Century Schoolbook" w:hAnsi="Century Schoolbook" w:eastAsia="Century Schoolbook" w:cs="Century Schoolbook"/>
+          <w:b w:val="0"/>
+          <w:i w:val="0"/>
+          <w:color w:val="000000"/>
+          <w:sz w:val="24"/>
+        </w:rPr>
+        <w:t>metus. Sed aliquet risus a tortor. Integer id quam. Morbi mi. Quisque nisl felis, venenatis tristique,</w:t>
+      </w:r>
+      <w:r>
+        <w:br/>
+      </w:r>
+      <w:r>
+        <w:rPr>
+          <w:rFonts w:ascii="Century Schoolbook" w:hAnsi="Century Schoolbook" w:eastAsia="Century Schoolbook" w:cs="Century Schoolbook"/>
+          <w:b w:val="0"/>
+          <w:i w:val="0"/>
+          <w:color w:val="000000"/>
+          <w:sz w:val="24"/>
+        </w:rPr>
+        <w:t>dignissim in, ultrices sit amet, augue. Proin sodales libero eget ante. Nulla quam. Aenean laoreet.</w:t>
+      </w:r>
+      <w:r>
+        <w:br/>
+      </w:r>
+      <w:r>
+        <w:rPr>
+          <w:rFonts w:ascii="Century Schoolbook" w:hAnsi="Century Schoolbook" w:eastAsia="Century Schoolbook" w:cs="Century Schoolbook"/>
+          <w:b w:val="0"/>
+          <w:i w:val="0"/>
+          <w:color w:val="000000"/>
+          <w:sz w:val="24"/>
+        </w:rPr>
+        <w:t>Vestibulum nisi lectus, commodo ac, facilisis ac, ultricies eu, pede. Ut orci risus, accumsan</w:t>
+      </w:r>
+      <w:r>
+        <w:br/>
+      </w:r>
+      <w:r>
+        <w:rPr>
+          <w:rFonts w:ascii="Century Schoolbook" w:hAnsi="Century Schoolbook" w:eastAsia="Century Schoolbook" w:cs="Century Schoolbook"/>
+          <w:b w:val="0"/>
+          <w:i w:val="0"/>
+          <w:color w:val="000000"/>
+          <w:sz w:val="24"/>
+        </w:rPr>
+        <w:t>porttitor, cursus quis, aliquet eget, justo. Sed pretium blandit orci.</w:t>
+      </w:r>
+    </w:p>
+    <w:p>
+      <w:pPr>
+        <w:keepLines/>
+        <w:widowControl w:val="0"/>
+        <w:spacing w:before="288" w:after="0" w:line="240" w:lineRule="auto"/>
+        <w:ind w:left="0" w:right="0" w:firstLine="0"/>
+        <w:jc w:val="left"/>
+      </w:pPr>
+      <w:r>
+        <w:rPr>
+          <w:rFonts w:ascii="Century Schoolbook" w:hAnsi="Century Schoolbook" w:eastAsia="Century Schoolbook" w:cs="Century Schoolbook"/>
+          <w:b w:val="0"/>
+          <w:i w:val="0"/>
+          <w:color w:val="000000"/>
+          <w:sz w:val="24"/>
+        </w:rPr>
+        <w:t>Ut eu diam at pede suscipit sodales. Aenean lectus elit, fermentum non, convallis id, sagittis at,</w:t>
+      </w:r>
+      <w:r>
+        <w:br/>
+      </w:r>
+      <w:r>
+        <w:rPr>
+          <w:rFonts w:ascii="Century Schoolbook" w:hAnsi="Century Schoolbook" w:eastAsia="Century Schoolbook" w:cs="Century Schoolbook"/>
+          <w:b w:val="0"/>
+          <w:i w:val="0"/>
+          <w:color w:val="000000"/>
+          <w:sz w:val="24"/>
+        </w:rPr>
+        <w:t>neque. Nullam mauris orci, aliquet et, iaculis et, viverra vitae, ligula. Nulla ut felis in purus</w:t>
+      </w:r>
+      <w:r>
+        <w:br/>
+      </w:r>
+      <w:r>
+        <w:rPr>
+          <w:rFonts w:ascii="Century Schoolbook" w:hAnsi="Century Schoolbook" w:eastAsia="Century Schoolbook" w:cs="Century Schoolbook"/>
+          <w:b w:val="0"/>
+          <w:i w:val="0"/>
+          <w:color w:val="000000"/>
+          <w:sz w:val="24"/>
+        </w:rPr>
+        <w:t>aliquam imperdiet. Maecenas aliquet mollis lectus. Vivamus consectetuer risus et tortor. Lorem</w:t>
+      </w:r>
+    </w:p>
+    <w:p>
+      <w:pPr>
+        <w:keepLines/>
+        <w:widowControl w:val="0"/>
+        <w:spacing w:before="262" w:after="0" w:line="240" w:lineRule="auto"/>
+        <w:ind w:left="5338" w:right="0" w:firstLine="0"/>
+        <w:jc w:val="center"/>
+      </w:pPr>
+      <w:r>
+        <w:rPr>
+          <w:rFonts w:ascii="Calibri" w:hAnsi="Calibri" w:eastAsia="Calibri" w:cs="Calibri"/>
+          <w:b w:val="0"/>
+          <w:i w:val="0"/>
+          <w:color w:val="000000"/>
+          <w:sz w:val="24"/>
+        </w:rPr>
+        <w:t>1</w:t>
       </w:r>
     </w:p>
     <w:p>
       <w:pPr>
         <w:sectPr>
-          <w:pgSz w:w="12240" w:h="20160"/>
-          <w:pgMar w:top="1543" w:right="1559" w:bottom="3516" w:left="1009" w:header="0" w:footer="0" w:gutter="0"/>
+          <w:pgSz w:w="12240" w:h="15840"/>
+          <w:pgMar w:top="972" w:right="720" w:bottom="720" w:left="723" w:header="0" w:footer="0" w:gutter="0"/>
           <w:cols w:space="720"/>
           <w:docGrid w:linePitch="360"/>
         </w:sectPr>
@@ -137,437 +554,197 @@
       <w:pPr>
         <w:keepLines/>
         <w:widowControl w:val="0"/>
-        <w:spacing w:before="0" w:after="0" w:lineRule="exact" w:line="1040"/>
-        <w:ind w:left="0" w:right="1585" w:firstLine="0"/>
+        <w:spacing w:before="0" w:after="0" w:line="240" w:lineRule="auto"/>
+        <w:ind w:left="0" w:right="0" w:firstLine="0"/>
         <w:jc w:val="left"/>
       </w:pPr>
       <w:r>
         <w:rPr>
-          <w:rFonts w:ascii="Repo-Extra Bold" w:hAnsi="Repo-Extra Bold" w:eastAsia="Repo-Extra Bold" w:cs="Repo-Extra Bold"/>
-          <w:b/>
+          <w:rFonts w:ascii="Century Schoolbook" w:hAnsi="Century Schoolbook" w:eastAsia="Century Schoolbook" w:cs="Century Schoolbook"/>
+          <w:b w:val="0"/>
           <w:i w:val="0"/>
           <w:color w:val="000000"/>
-          <w:sz w:val="82"/>
+          <w:sz w:val="24"/>
         </w:rPr>
-        <w:t>Sample PDF Content</w:t>
+        <w:t>ipsum dolor sit amet, consectetur adipiscing elit. Integer nec odio. Praesent libero. Sed cursus ante dapibus diam. Sed nisi. Nulla quis sem at nibh elementum imperdiet. Duis sagittis ipsum. Praesent mauris.</w:t>
       </w:r>
     </w:p>
     <w:p>
       <w:pPr>
         <w:keepLines/>
         <w:widowControl w:val="0"/>
-        <w:spacing w:before="624" w:after="0" w:lineRule="exact" w:line="720"/>
-        <w:ind w:left="0" w:right="6491" w:firstLine="0"/>
+        <w:spacing w:before="288" w:after="0" w:line="240" w:lineRule="auto"/>
+        <w:ind w:left="0" w:right="0" w:firstLine="0"/>
         <w:jc w:val="left"/>
       </w:pPr>
       <w:r>
         <w:rPr>
-          <w:rFonts w:ascii="DMSans" w:hAnsi="DMSans" w:eastAsia="DMSans" w:cs="DMSans"/>
-          <w:b/>
+          <w:rFonts w:ascii="Century Schoolbook" w:hAnsi="Century Schoolbook" w:eastAsia="Century Schoolbook" w:cs="Century Schoolbook"/>
+          <w:b w:val="0"/>
           <w:i w:val="0"/>
           <w:color w:val="000000"/>
-          <w:sz w:val="55"/>
+          <w:sz w:val="24"/>
         </w:rPr>
-        <w:t>Introduction</w:t>
+        <w:t>Fusce nec tellus sed augue semper porta. Mauris massa. Vestibulum lacinia arcu eget nulla. Class aptent taciti sociosqu ad litora torquent per conubia nostra, per inceptos himenaeos. Curabitur sodales ligula in libero. Sed dignissim lacinia nunc. Curabitur tortor. Pellentesque nibh. Aenean quam. In scelerisque sem at dolor. Maecenas mattis. Sed convallis tristique sem.</w:t>
       </w:r>
     </w:p>
     <w:p>
       <w:pPr>
         <w:keepLines/>
         <w:widowControl w:val="0"/>
-        <w:spacing w:before="362" w:after="0" w:lineRule="exact" w:line="432"/>
-        <w:ind w:left="0" w:right="87" w:firstLine="0"/>
+        <w:spacing w:before="288" w:after="0" w:line="240" w:lineRule="auto"/>
+        <w:ind w:left="0" w:right="0" w:firstLine="0"/>
         <w:jc w:val="left"/>
       </w:pPr>
       <w:r>
         <w:rPr>
-          <w:rFonts w:ascii="DMSans-Regular" w:hAnsi="DMSans-Regular" w:eastAsia="DMSans-Regular" w:cs="DMSans-Regular"/>
+          <w:rFonts w:ascii="Century Schoolbook" w:hAnsi="Century Schoolbook" w:eastAsia="Century Schoolbook" w:cs="Century Schoolbook"/>
           <w:b w:val="0"/>
           <w:i w:val="0"/>
           <w:color w:val="000000"/>
-          <w:sz w:val="36"/>
+          <w:sz w:val="24"/>
         </w:rPr>
-        <w:t>Lorem ipsum dolor sit amet, consectetur adipiscing elit.</w:t>
-      </w:r>
-      <w:r>
-        <w:br/>
-      </w:r>
-      <w:r>
-        <w:rPr>
-          <w:rFonts w:ascii="DMSans-Regular" w:hAnsi="DMSans-Regular" w:eastAsia="DMSans-Regular" w:cs="DMSans-Regular"/>
-          <w:b w:val="0"/>
-          <w:i w:val="0"/>
-          <w:color w:val="000000"/>
-          <w:sz w:val="36"/>
-        </w:rPr>
-        <w:t xml:space="preserve"> Integer nec odio. Praesent libero. Sed cursus ante dapibu</w:t>
-      </w:r>
-      <w:r>
-        <w:br/>
-      </w:r>
-      <w:r>
-        <w:rPr>
-          <w:rFonts w:ascii="DMSans-Regular" w:hAnsi="DMSans-Regular" w:eastAsia="DMSans-Regular" w:cs="DMSans-Regular"/>
-          <w:b w:val="0"/>
-          <w:i w:val="0"/>
-          <w:color w:val="000000"/>
-          <w:sz w:val="36"/>
-        </w:rPr>
-        <w:t>s diam. Sed nisi. Nulla quis sem at nibh element</w:t>
-      </w:r>
-      <w:r>
-        <w:br/>
-      </w:r>
-      <w:r>
-        <w:rPr>
-          <w:rFonts w:ascii="DMSans-Regular" w:hAnsi="DMSans-Regular" w:eastAsia="DMSans-Regular" w:cs="DMSans-Regular"/>
-          <w:b w:val="0"/>
-          <w:i w:val="0"/>
-          <w:color w:val="000000"/>
-          <w:sz w:val="36"/>
-        </w:rPr>
-        <w:t>imperdiet.</w:t>
+        <w:t>Proin ut ligula vel nunc egestas porttitor. Morbi lectus risus, iaculis vel, suscipit quis, luctus non, massa. Fusce ac turpis quis ligula lacinia aliquet. Mauris ipsum. Nulla metus metus, ullamcorper vel, tincidunt sed, euismod in, nibh. Quisque volutpat condimentum velit. Class aptent taciti sociosqu ad litora torquent per conubia nostra, per inceptos himenaeos. Nam nec ante. Sed lacinia, urna non tincidunt mattis, tortor neque adipiscing diam, a cursus ipsum ante quis turpis. Nulla facilisi. Ut fringilla. Suspendisse potenti.</w:t>
       </w:r>
     </w:p>
     <w:p>
       <w:pPr>
         <w:keepLines/>
         <w:widowControl w:val="0"/>
-        <w:spacing w:before="616" w:after="0" w:lineRule="exact" w:line="720"/>
-        <w:ind w:left="0" w:right="6913" w:firstLine="0"/>
+        <w:spacing w:before="288" w:after="0" w:line="240" w:lineRule="auto"/>
+        <w:ind w:left="0" w:right="0" w:firstLine="0"/>
         <w:jc w:val="left"/>
       </w:pPr>
       <w:r>
         <w:rPr>
-          <w:rFonts w:ascii="DMSans" w:hAnsi="DMSans" w:eastAsia="DMSans" w:cs="DMSans"/>
-          <w:b/>
+          <w:rFonts w:ascii="Century Schoolbook" w:hAnsi="Century Schoolbook" w:eastAsia="Century Schoolbook" w:cs="Century Schoolbook"/>
+          <w:b w:val="0"/>
           <w:i w:val="0"/>
           <w:color w:val="000000"/>
-          <w:sz w:val="55"/>
+          <w:sz w:val="24"/>
         </w:rPr>
-        <w:t>Objectives</w:t>
+        <w:t>Nunc feugiat mi a tellus consequat imperdiet. Vestibulum sapien. Proin quam. Etiam ultrices. Suspendisse in justo eu magna luctus suscipit. Sed lectus. Integer euismod lacus luctus magna. Quisque cursus, metus vitae pharetra auctor, sem massa mattis sem, at interdum magna augue eget diam. Vestibulum ante ipsum primis in faucibus orci luctus et ultrices posuere cubilia Curae; Morbi lacinia molestie dui. Praesent blandit dolor. Sed non quam. In vel mi sit amet augue congue elementum. Morbi in ipsum sit amet pede facilisis laoreet.</w:t>
       </w:r>
     </w:p>
     <w:p>
       <w:pPr>
         <w:keepLines/>
         <w:widowControl w:val="0"/>
-        <w:spacing w:before="362" w:after="0" w:lineRule="exact" w:line="480"/>
-        <w:ind w:left="0" w:right="2764" w:firstLine="0"/>
+        <w:spacing w:before="288" w:after="0" w:line="240" w:lineRule="auto"/>
+        <w:ind w:left="0" w:right="0" w:firstLine="0"/>
         <w:jc w:val="left"/>
       </w:pPr>
       <w:r>
         <w:rPr>
-          <w:rFonts w:ascii="DMSans-Regular" w:hAnsi="DMSans-Regular" w:eastAsia="DMSans-Regular" w:cs="DMSans-Regular"/>
+          <w:rFonts w:ascii="Century Schoolbook" w:hAnsi="Century Schoolbook" w:eastAsia="Century Schoolbook" w:cs="Century Schoolbook"/>
           <w:b w:val="0"/>
           <w:i w:val="0"/>
           <w:color w:val="000000"/>
-          <w:sz w:val="36"/>
+          <w:sz w:val="24"/>
         </w:rPr>
-        <w:t>The main objectives of this document are:</w:t>
+        <w:t>Donec lacus nunc, viverra nec, blandit vel, egestas et, augue. Vestibulum tincidunt malesuada tellus. Ut ultrices ultrices enim. Curabitur sit amet mauris. Morbi in dui quis est pulvinar ullamcorper. Nulla facilisi. Integer lacinia sollicitudin massa. Cras metus. Sed aliquet risus a tortor. Integer id quam. Morbi mi.</w:t>
       </w:r>
     </w:p>
     <w:p>
       <w:pPr>
         <w:keepLines/>
         <w:widowControl w:val="0"/>
-        <w:spacing w:before="471" w:after="0" w:lineRule="exact" w:line="480"/>
-        <w:ind w:left="627" w:right="1579" w:firstLine="0"/>
+        <w:spacing w:before="288" w:after="0" w:line="240" w:lineRule="auto"/>
+        <w:ind w:left="0" w:right="0" w:firstLine="0"/>
         <w:jc w:val="left"/>
       </w:pPr>
       <w:r>
         <w:rPr>
-          <w:rFonts w:ascii="DMSans-Regular" w:hAnsi="DMSans-Regular" w:eastAsia="DMSans-Regular" w:cs="DMSans-Regular"/>
+          <w:rFonts w:ascii="Century Schoolbook" w:hAnsi="Century Schoolbook" w:eastAsia="Century Schoolbook" w:cs="Century Schoolbook"/>
           <w:b w:val="0"/>
           <w:i w:val="0"/>
           <w:color w:val="000000"/>
-          <w:sz w:val="36"/>
+          <w:sz w:val="24"/>
         </w:rPr>
-        <w:t>To provide a detailed overview of the project.</w:t>
+        <w:t>Lorem ipsum dolor sit amet, consectetur adipiscing elit. Integer nec odio. Praesent libero. Sed cursus ante dapibus diam. Sed nisi. Nulla quis sem at nibh elementum imperdiet. Duis sagittis ipsum. Praesent mauris. Fusce nec tellus sed augue semper porta. Mauris massa. Vestibulum lacinia arcu eget nulla. Class aptent taciti sociosqu ad litora torquent per conubia nostra, per inceptos himenaeos. Curabitur sodales ligula in libero.</w:t>
       </w:r>
     </w:p>
     <w:p>
       <w:pPr>
         <w:keepLines/>
         <w:widowControl w:val="0"/>
-        <w:spacing w:before="108" w:after="0" w:lineRule="exact" w:line="480"/>
-        <w:ind w:left="627" w:right="0" w:firstLine="0"/>
+        <w:spacing w:before="292" w:after="0" w:line="240" w:lineRule="auto"/>
+        <w:ind w:left="0" w:right="0" w:firstLine="0"/>
         <w:jc w:val="left"/>
       </w:pPr>
       <w:r>
         <w:rPr>
-          <w:rFonts w:ascii="DMSans-Regular" w:hAnsi="DMSans-Regular" w:eastAsia="DMSans-Regular" w:cs="DMSans-Regular"/>
+          <w:rFonts w:ascii="Century Schoolbook" w:hAnsi="Century Schoolbook" w:eastAsia="Century Schoolbook" w:cs="Century Schoolbook"/>
           <w:b w:val="0"/>
           <w:i w:val="0"/>
           <w:color w:val="000000"/>
-          <w:sz w:val="36"/>
+          <w:sz w:val="24"/>
         </w:rPr>
-        <w:t>To illustrate the key findings through charts and tables.</w:t>
+        <w:t>Sed dignissim lacinia nunc. Curabitur tortor. Pellentesque nibh. Aenean quam. In scelerisque sem at dolor. Maecenas mattis. Sed convallis tristique sem. Proin ut ligula vel nunc egestas porttitor. Morbi lectus risus, iaculis vel, suscipit quis, luctus non, massa. Fusce ac turpis quis ligula lacinia aliquet. Mauris ipsum. Nulla metus metus, ullamcorper vel, tincidunt sed, euismod in, nibh.</w:t>
       </w:r>
     </w:p>
     <w:p>
       <w:pPr>
         <w:keepLines/>
         <w:widowControl w:val="0"/>
-        <w:spacing w:before="108" w:after="0" w:lineRule="exact" w:line="480"/>
-        <w:ind w:left="627" w:right="1767" w:firstLine="0"/>
+        <w:spacing w:before="288" w:after="0" w:line="240" w:lineRule="auto"/>
+        <w:ind w:left="0" w:right="0" w:firstLine="0"/>
         <w:jc w:val="left"/>
       </w:pPr>
       <w:r>
         <w:rPr>
-          <w:rFonts w:ascii="DMSans-Regular" w:hAnsi="DMSans-Regular" w:eastAsia="DMSans-Regular" w:cs="DMSans-Regular"/>
+          <w:rFonts w:ascii="Century Schoolbook" w:hAnsi="Century Schoolbook" w:eastAsia="Century Schoolbook" w:cs="Century Schoolbook"/>
           <w:b w:val="0"/>
           <w:i w:val="0"/>
           <w:color w:val="000000"/>
-          <w:sz w:val="36"/>
+          <w:sz w:val="24"/>
         </w:rPr>
-        <w:t>To highlight the next steps and action items.</w:t>
+        <w:t>Quisque volutpat condimentum velit. Class aptent taciti sociosqu ad litora torquent per conubia nostra, per inceptos himenaeos. Nam nec ante. Sed lacinia, urna non tincidunt mattis, tortor neque adipiscing diam, a cursus ipsum ante quis turpis. Nulla facilisi. Ut fringilla. Suspendisse potenti. Nunc feugiat mi a tellus consequat imperdiet. Vestibulum sapien. Proin quam. Etiam ultrices.</w:t>
       </w:r>
     </w:p>
     <w:p>
       <w:pPr>
         <w:keepLines/>
         <w:widowControl w:val="0"/>
-        <w:spacing w:before="685" w:after="0" w:lineRule="exact" w:line="720"/>
-        <w:ind w:left="0" w:right="6458" w:firstLine="0"/>
+        <w:spacing w:before="288" w:after="0" w:line="240" w:lineRule="auto"/>
+        <w:ind w:left="0" w:right="0" w:firstLine="0"/>
         <w:jc w:val="left"/>
       </w:pPr>
       <w:r>
         <w:rPr>
-          <w:rFonts w:ascii="DMSans" w:hAnsi="DMSans" w:eastAsia="DMSans" w:cs="DMSans"/>
-          <w:b/>
+          <w:rFonts w:ascii="Century Schoolbook" w:hAnsi="Century Schoolbook" w:eastAsia="Century Schoolbook" w:cs="Century Schoolbook"/>
+          <w:b w:val="0"/>
           <w:i w:val="0"/>
           <w:color w:val="000000"/>
-          <w:sz w:val="55"/>
+          <w:sz w:val="24"/>
         </w:rPr>
-        <w:t>Key Findings</w:t>
+        <w:t>Suspendisse in justo eu magna luctus suscipit. Sed lectus. Integer euismod lacus luctus magna. Quisque cursus, metus vitae pharetra auctor, sem massa mattis sem, at interdum magna augue eget diam. Vestibulum ante ipsum primis in faucibus orci luctus et ultrices posuere cubilia Curae; Morbi lacinia molestie dui. Praesent blandit dolor. Sed non quam. In vel mi sit amet augue congue</w:t>
       </w:r>
     </w:p>
     <w:p>
       <w:pPr>
         <w:keepLines/>
         <w:widowControl w:val="0"/>
-        <w:spacing w:before="448" w:after="0" w:lineRule="exact" w:line="588"/>
-        <w:ind w:left="414" w:right="1411" w:firstLine="0"/>
-        <w:jc w:val="left"/>
+        <w:spacing w:before="262" w:after="0" w:line="240" w:lineRule="auto"/>
+        <w:ind w:left="5338" w:right="0" w:firstLine="0"/>
+        <w:jc w:val="center"/>
       </w:pPr>
       <w:r>
         <w:rPr>
-          <w:rFonts w:ascii="DMSans-Regular" w:hAnsi="DMSans-Regular" w:eastAsia="DMSans-Regular" w:cs="DMSans-Regular"/>
+          <w:rFonts w:ascii="Calibri" w:hAnsi="Calibri" w:eastAsia="Calibri" w:cs="Calibri"/>
           <w:b w:val="0"/>
           <w:i w:val="0"/>
           <w:color w:val="000000"/>
-          <w:sz w:val="36"/>
+          <w:sz w:val="24"/>
         </w:rPr>
-        <w:t xml:space="preserve">1. </w:t>
-      </w:r>
-      <w:r>
-        <w:rPr>
-          <w:rFonts w:ascii="DMSans" w:hAnsi="DMSans" w:eastAsia="DMSans" w:cs="DMSans"/>
-          <w:b/>
-          <w:i w:val="0"/>
-          <w:color w:val="000000"/>
-          <w:sz w:val="36"/>
-        </w:rPr>
-        <w:t>Market Analysis:</w:t>
-      </w:r>
-      <w:r>
-        <w:rPr>
-          <w:rFonts w:ascii="DMSans-Regular" w:hAnsi="DMSans-Regular" w:eastAsia="DMSans-Regular" w:cs="DMSans-Regular"/>
-          <w:b w:val="0"/>
-          <w:i w:val="0"/>
-          <w:color w:val="000000"/>
-          <w:sz w:val="36"/>
-        </w:rPr>
-        <w:t xml:space="preserve"> Lorem ipsum dolor sit amet, </w:t>
-      </w:r>
-      <w:r>
-        <w:br/>
-      </w:r>
-      <w:r>
-        <w:rPr>
-          <w:rFonts w:ascii="DMSans-Regular" w:hAnsi="DMSans-Regular" w:eastAsia="DMSans-Regular" w:cs="DMSans-Regular"/>
-          <w:b w:val="0"/>
-          <w:i w:val="0"/>
-          <w:color w:val="000000"/>
-          <w:sz w:val="36"/>
-        </w:rPr>
-        <w:t>consectetur adipiscing elit.</w:t>
-      </w:r>
-    </w:p>
-    <w:p>
-      <w:pPr>
-        <w:keepLines/>
-        <w:widowControl w:val="0"/>
-        <w:spacing w:before="108" w:after="0" w:lineRule="exact" w:line="588"/>
-        <w:ind w:left="314" w:right="433" w:firstLine="0"/>
-        <w:jc w:val="left"/>
-      </w:pPr>
-      <w:r>
-        <w:rPr>
-          <w:rFonts w:ascii="DMSans-Regular" w:hAnsi="DMSans-Regular" w:eastAsia="DMSans-Regular" w:cs="DMSans-Regular"/>
-          <w:b w:val="0"/>
-          <w:i w:val="0"/>
-          <w:color w:val="000000"/>
-          <w:sz w:val="36"/>
-        </w:rPr>
-        <w:t xml:space="preserve">2. </w:t>
-      </w:r>
-      <w:r>
-        <w:rPr>
-          <w:rFonts w:ascii="DMSans" w:hAnsi="DMSans" w:eastAsia="DMSans" w:cs="DMSans"/>
-          <w:b/>
-          <w:i w:val="0"/>
-          <w:color w:val="000000"/>
-          <w:sz w:val="36"/>
-        </w:rPr>
-        <w:t>User Insights:</w:t>
-      </w:r>
-      <w:r>
-        <w:rPr>
-          <w:rFonts w:ascii="DMSans-Regular" w:hAnsi="DMSans-Regular" w:eastAsia="DMSans-Regular" w:cs="DMSans-Regular"/>
-          <w:b w:val="0"/>
-          <w:i w:val="0"/>
-          <w:color w:val="000000"/>
-          <w:sz w:val="36"/>
-        </w:rPr>
-        <w:t xml:space="preserve"> Integer nec odio. Praesent libero. Sed </w:t>
-      </w:r>
-      <w:r>
-        <w:br/>
-      </w:r>
-      <w:r>
-        <w:rPr>
-          <w:rFonts w:ascii="DMSans-Regular" w:hAnsi="DMSans-Regular" w:eastAsia="DMSans-Regular" w:cs="DMSans-Regular"/>
-          <w:b w:val="0"/>
-          <w:i w:val="0"/>
-          <w:color w:val="000000"/>
-          <w:sz w:val="36"/>
-        </w:rPr>
-        <w:t>cursus ante dapibus diam.</w:t>
-      </w:r>
-    </w:p>
-    <w:p>
-      <w:pPr>
-        <w:keepLines/>
-        <w:widowControl w:val="0"/>
-        <w:spacing w:before="108" w:after="0" w:lineRule="exact" w:line="588"/>
-        <w:ind w:left="309" w:right="178" w:firstLine="0"/>
-        <w:jc w:val="left"/>
-      </w:pPr>
-      <w:r>
-        <w:rPr>
-          <w:rFonts w:ascii="DMSans-Regular" w:hAnsi="DMSans-Regular" w:eastAsia="DMSans-Regular" w:cs="DMSans-Regular"/>
-          <w:b w:val="0"/>
-          <w:i w:val="0"/>
-          <w:color w:val="000000"/>
-          <w:sz w:val="36"/>
-        </w:rPr>
-        <w:t xml:space="preserve">3. </w:t>
-      </w:r>
-      <w:r>
-        <w:rPr>
-          <w:rFonts w:ascii="DMSans" w:hAnsi="DMSans" w:eastAsia="DMSans" w:cs="DMSans"/>
-          <w:b/>
-          <w:i w:val="0"/>
-          <w:color w:val="000000"/>
-          <w:sz w:val="36"/>
-        </w:rPr>
-        <w:t>Technical Feasibility:</w:t>
-      </w:r>
-      <w:r>
-        <w:rPr>
-          <w:rFonts w:ascii="DMSans-Regular" w:hAnsi="DMSans-Regular" w:eastAsia="DMSans-Regular" w:cs="DMSans-Regular"/>
-          <w:b w:val="0"/>
-          <w:i w:val="0"/>
-          <w:color w:val="000000"/>
-          <w:sz w:val="36"/>
-        </w:rPr>
-        <w:t xml:space="preserve"> Sed nisi. Nulla quis sem at nibh </w:t>
-      </w:r>
-      <w:r>
-        <w:br/>
-      </w:r>
-      <w:r>
-        <w:rPr>
-          <w:rFonts w:ascii="DMSans-Regular" w:hAnsi="DMSans-Regular" w:eastAsia="DMSans-Regular" w:cs="DMSans-Regular"/>
-          <w:b w:val="0"/>
-          <w:i w:val="0"/>
-          <w:color w:val="000000"/>
-          <w:sz w:val="36"/>
-        </w:rPr>
-        <w:t>elementum imperdiet. Duis sagittis ipsum.</w:t>
-      </w:r>
-    </w:p>
-    <w:p>
-      <w:pPr>
-        <w:keepLines/>
-        <w:widowControl w:val="0"/>
-        <w:spacing w:before="685" w:after="0" w:lineRule="exact" w:line="720"/>
-        <w:ind w:left="0" w:right="6295" w:firstLine="0"/>
-        <w:jc w:val="left"/>
-      </w:pPr>
-      <w:r>
-        <w:rPr>
-          <w:rFonts w:ascii="DMSans" w:hAnsi="DMSans" w:eastAsia="DMSans" w:cs="DMSans"/>
-          <w:b/>
-          <w:i w:val="0"/>
-          <w:color w:val="000000"/>
-          <w:sz w:val="55"/>
-        </w:rPr>
-        <w:t>Methodology</w:t>
-      </w:r>
-    </w:p>
-    <w:p>
-      <w:pPr>
-        <w:keepLines/>
-        <w:widowControl w:val="0"/>
-        <w:spacing w:before="362" w:after="0" w:lineRule="exact" w:line="432"/>
-        <w:ind w:left="0" w:right="87" w:firstLine="0"/>
-        <w:jc w:val="left"/>
-      </w:pPr>
-      <w:r>
-        <w:rPr>
-          <w:rFonts w:ascii="DMSans-Regular" w:hAnsi="DMSans-Regular" w:eastAsia="DMSans-Regular" w:cs="DMSans-Regular"/>
-          <w:b w:val="0"/>
-          <w:i w:val="0"/>
-          <w:color w:val="000000"/>
-          <w:sz w:val="36"/>
-        </w:rPr>
-        <w:t>Lorem ipsum dolor sit amet, consectetur adipiscing elit.</w:t>
-      </w:r>
-      <w:r>
-        <w:br/>
-      </w:r>
-      <w:r>
-        <w:rPr>
-          <w:rFonts w:ascii="DMSans-Regular" w:hAnsi="DMSans-Regular" w:eastAsia="DMSans-Regular" w:cs="DMSans-Regular"/>
-          <w:b w:val="0"/>
-          <w:i w:val="0"/>
-          <w:color w:val="000000"/>
-          <w:sz w:val="36"/>
-        </w:rPr>
-        <w:t xml:space="preserve"> Integer nec odio. Praesent libero. Sed cursus ante dapibus </w:t>
-      </w:r>
-      <w:r>
-        <w:br/>
-      </w:r>
-      <w:r>
-        <w:rPr>
-          <w:rFonts w:ascii="DMSans-Regular" w:hAnsi="DMSans-Regular" w:eastAsia="DMSans-Regular" w:cs="DMSans-Regular"/>
-          <w:b w:val="0"/>
-          <w:i w:val="0"/>
-          <w:color w:val="000000"/>
-          <w:sz w:val="36"/>
-        </w:rPr>
-        <w:t>diam.</w:t>
+        <w:t>2</w:t>
       </w:r>
     </w:p>
     <w:p>
       <w:pPr>
         <w:sectPr>
-          <w:pgSz w:w="12240" w:h="20160"/>
-          <w:pgMar w:top="1155" w:right="1253" w:bottom="1797" w:left="1207" w:header="0" w:footer="0" w:gutter="0"/>
+          <w:pgSz w:w="12240" w:h="15840"/>
+          <w:pgMar w:top="730" w:right="720" w:bottom="720" w:left="723" w:header="0" w:footer="0" w:gutter="0"/>
           <w:cols w:space="720"/>
           <w:docGrid w:linePitch="360"/>
         </w:sectPr>
@@ -577,630 +754,138 @@
       <w:pPr>
         <w:keepLines/>
         <w:widowControl w:val="0"/>
-        <w:spacing w:before="0" w:after="0" w:lineRule="exact" w:line="773"/>
-        <w:ind w:left="0" w:right="5234" w:firstLine="0"/>
+        <w:spacing w:before="0" w:after="0" w:line="240" w:lineRule="auto"/>
+        <w:ind w:left="0" w:right="0" w:firstLine="0"/>
         <w:jc w:val="left"/>
       </w:pPr>
       <w:r>
         <w:rPr>
-          <w:rFonts w:ascii="DMSans" w:hAnsi="DMSans" w:eastAsia="DMSans" w:cs="DMSans"/>
-          <w:b/>
+          <w:rFonts w:ascii="Century Schoolbook" w:hAnsi="Century Schoolbook" w:eastAsia="Century Schoolbook" w:cs="Century Schoolbook"/>
+          <w:b w:val="0"/>
           <w:i w:val="0"/>
           <w:color w:val="000000"/>
-          <w:sz w:val="59"/>
+          <w:sz w:val="24"/>
         </w:rPr>
-        <w:t>Data Collection</w:t>
+        <w:t>elementum. Morbi in ipsum sit amet pede facilisis laoreet. Donec lacus nunc, viverra nec, blandit vel, egestas et, augue. Vestibulum tincidunt malesuada tellus. Ut ultrices ultrices enim. Curabitur sit amet mauris.</w:t>
       </w:r>
     </w:p>
     <w:p>
       <w:pPr>
         <w:keepLines/>
         <w:widowControl w:val="0"/>
-        <w:spacing w:before="481" w:after="0" w:lineRule="exact" w:line="631"/>
-        <w:ind w:left="673" w:right="0" w:firstLine="0"/>
+        <w:spacing w:before="288" w:after="0" w:line="240" w:lineRule="auto"/>
+        <w:ind w:left="0" w:right="0" w:firstLine="0"/>
         <w:jc w:val="left"/>
       </w:pPr>
       <w:r>
         <w:rPr>
-          <w:rFonts w:ascii="DMSans" w:hAnsi="DMSans" w:eastAsia="DMSans" w:cs="DMSans"/>
-          <w:b/>
-          <w:i w:val="0"/>
-          <w:color w:val="000000"/>
-          <w:sz w:val="39"/>
-        </w:rPr>
-        <w:t>Surveys:</w:t>
-      </w:r>
-      <w:r>
-        <w:rPr>
-          <w:rFonts w:ascii="DMSans-Regular" w:hAnsi="DMSans-Regular" w:eastAsia="DMSans-Regular" w:cs="DMSans-Regular"/>
+          <w:rFonts w:ascii="Century Schoolbook" w:hAnsi="Century Schoolbook" w:eastAsia="Century Schoolbook" w:cs="Century Schoolbook"/>
           <w:b w:val="0"/>
           <w:i w:val="0"/>
           <w:color w:val="000000"/>
-          <w:sz w:val="39"/>
+          <w:sz w:val="24"/>
         </w:rPr>
-        <w:t xml:space="preserve"> Lorem ipsum dolor sit amet, consectetur </w:t>
-      </w:r>
-      <w:r>
-        <w:br/>
-      </w:r>
-      <w:r>
-        <w:rPr>
-          <w:rFonts w:ascii="DMSans-Regular" w:hAnsi="DMSans-Regular" w:eastAsia="DMSans-Regular" w:cs="DMSans-Regular"/>
-          <w:b w:val="0"/>
-          <w:i w:val="0"/>
-          <w:color w:val="000000"/>
-          <w:sz w:val="39"/>
-        </w:rPr>
-        <w:t>adipiscing elit.</w:t>
+        <w:t>Morbi in dui quis est pulvinar ullamcorper. Nulla facilisi. Integer lacinia sollicitudin massa. Cras metus. Sed aliquet risus a tortor. Integer id quam. Morbi mi. Quisque nisl felis, venenatis tristique, dignissim in, ultrices sit amet, augue. Proin sodales libero eget ante. Nulla quam. Aenean laoreet. Vestibulum nisi lectus, commodo ac, facilisis ac, ultricies eu, pede. Ut orci risus, accumsan porttitor, cursus quis, aliquet eget, justo. Sed pretium blandit orci.</w:t>
       </w:r>
     </w:p>
     <w:p>
       <w:pPr>
         <w:keepLines/>
         <w:widowControl w:val="0"/>
-        <w:spacing w:before="116" w:after="0" w:lineRule="exact" w:line="631"/>
-        <w:ind w:left="673" w:right="206" w:firstLine="0"/>
+        <w:spacing w:before="288" w:after="0" w:line="240" w:lineRule="auto"/>
+        <w:ind w:left="0" w:right="0" w:firstLine="0"/>
         <w:jc w:val="left"/>
       </w:pPr>
       <w:r>
         <w:rPr>
-          <w:rFonts w:ascii="DMSans" w:hAnsi="DMSans" w:eastAsia="DMSans" w:cs="DMSans"/>
-          <w:b/>
-          <w:i w:val="0"/>
-          <w:color w:val="000000"/>
-          <w:sz w:val="39"/>
-        </w:rPr>
-        <w:t>Interviews:</w:t>
-      </w:r>
-      <w:r>
-        <w:rPr>
-          <w:rFonts w:ascii="DMSans-Regular" w:hAnsi="DMSans-Regular" w:eastAsia="DMSans-Regular" w:cs="DMSans-Regular"/>
+          <w:rFonts w:ascii="Century Schoolbook" w:hAnsi="Century Schoolbook" w:eastAsia="Century Schoolbook" w:cs="Century Schoolbook"/>
           <w:b w:val="0"/>
           <w:i w:val="0"/>
           <w:color w:val="000000"/>
-          <w:sz w:val="39"/>
+          <w:sz w:val="24"/>
         </w:rPr>
-        <w:t xml:space="preserve"> Integer nec odio. Praesent libero. Sed </w:t>
-      </w:r>
-      <w:r>
-        <w:br/>
-      </w:r>
-      <w:r>
-        <w:rPr>
-          <w:rFonts w:ascii="DMSans-Regular" w:hAnsi="DMSans-Regular" w:eastAsia="DMSans-Regular" w:cs="DMSans-Regular"/>
-          <w:b w:val="0"/>
-          <w:i w:val="0"/>
-          <w:color w:val="000000"/>
-          <w:sz w:val="39"/>
-        </w:rPr>
-        <w:t>cursus ante dapibus diam.</w:t>
+        <w:t>Ut eu diam at pede suscipit sodales. Aenean lectus elit, fermentum non, convallis id, sagittis at, neque. Nullam mauris orci, aliquet et, iaculis et, viverra vitae, ligula. Nulla ut felis in purus aliquam imperdiet. Maecenas aliquet mollis lectus. Vivamus consectetuer risus et tortor. Lorem ipsum dolor sit amet, consectetur adipiscing elit. Integer nec odio. Praesent libero. Sed cursus ante dapibus diam. Sed nisi. Nulla quis sem at nibh elementum imperdiet. Duis sagittis ipsum. Praesent mauris.</w:t>
       </w:r>
     </w:p>
     <w:p>
       <w:pPr>
         <w:keepLines/>
         <w:widowControl w:val="0"/>
-        <w:spacing w:before="116" w:after="0" w:lineRule="exact" w:line="631"/>
-        <w:ind w:left="673" w:right="785" w:firstLine="0"/>
+        <w:spacing w:before="288" w:after="0" w:line="240" w:lineRule="auto"/>
+        <w:ind w:left="0" w:right="0" w:firstLine="0"/>
         <w:jc w:val="left"/>
       </w:pPr>
       <w:r>
         <w:rPr>
-          <w:rFonts w:ascii="DMSans" w:hAnsi="DMSans" w:eastAsia="DMSans" w:cs="DMSans"/>
-          <w:b/>
-          <w:i w:val="0"/>
-          <w:color w:val="000000"/>
-          <w:sz w:val="39"/>
-        </w:rPr>
-        <w:t>Observations:</w:t>
-      </w:r>
-      <w:r>
-        <w:rPr>
-          <w:rFonts w:ascii="DMSans-Regular" w:hAnsi="DMSans-Regular" w:eastAsia="DMSans-Regular" w:cs="DMSans-Regular"/>
+          <w:rFonts w:ascii="Century Schoolbook" w:hAnsi="Century Schoolbook" w:eastAsia="Century Schoolbook" w:cs="Century Schoolbook"/>
           <w:b w:val="0"/>
           <w:i w:val="0"/>
           <w:color w:val="000000"/>
-          <w:sz w:val="39"/>
+          <w:sz w:val="24"/>
         </w:rPr>
-        <w:t xml:space="preserve"> Sed nisi. Nulla quis sem at nibh </w:t>
-      </w:r>
-      <w:r>
-        <w:br/>
-      </w:r>
-      <w:r>
-        <w:rPr>
-          <w:rFonts w:ascii="DMSans-Regular" w:hAnsi="DMSans-Regular" w:eastAsia="DMSans-Regular" w:cs="DMSans-Regular"/>
-          <w:b w:val="0"/>
-          <w:i w:val="0"/>
-          <w:color w:val="000000"/>
-          <w:sz w:val="39"/>
-        </w:rPr>
-        <w:t>elementum imperdiet.</w:t>
+        <w:t>Fusce nec tellus sed augue semper porta. Mauris massa. Vestibulum lacinia arcu eget nulla. Class aptent taciti sociosqu ad litora torquent per conubia nostra, per inceptos himenaeos. Curabitur sodales ligula in libero. Sed dignissim lacinia nunc. Curabitur tortor. Pellentesque nibh. Aenean quam. In scelerisque sem at dolor. Maecenas mattis. Sed convallis tristique sem.</w:t>
       </w:r>
     </w:p>
     <w:p>
       <w:pPr>
         <w:keepLines/>
         <w:widowControl w:val="0"/>
-        <w:spacing w:before="736" w:after="0" w:lineRule="exact" w:line="773"/>
-        <w:ind w:left="0" w:right="5771" w:firstLine="0"/>
+        <w:spacing w:before="288" w:after="0" w:line="240" w:lineRule="auto"/>
+        <w:ind w:left="0" w:right="0" w:firstLine="0"/>
         <w:jc w:val="left"/>
       </w:pPr>
       <w:r>
         <w:rPr>
-          <w:rFonts w:ascii="DMSans" w:hAnsi="DMSans" w:eastAsia="DMSans" w:cs="DMSans"/>
-          <w:b/>
+          <w:rFonts w:ascii="Century Schoolbook" w:hAnsi="Century Schoolbook" w:eastAsia="Century Schoolbook" w:cs="Century Schoolbook"/>
+          <w:b w:val="0"/>
           <w:i w:val="0"/>
           <w:color w:val="000000"/>
-          <w:sz w:val="59"/>
+          <w:sz w:val="24"/>
         </w:rPr>
-        <w:t>Data Analysis</w:t>
+        <w:t>Proin ut ligula vel nunc egestas porttitor. Morbi lectus risus, iaculis vel, suscipit quis, luctus non, massa. Fusce ac turpis quis ligula lacinia aliquet. Mauris ipsum. Nulla metus metus, ullamcorper vel, tincidunt sed, euismod in, nibh. Quisque volutpat condimentum velit. Class aptent taciti sociosqu ad litora torquent per conubia nostra, per inceptos himenaeos. Nam nec ante. Sed lacinia, urna non tincidunt mattis, tortor neque adipiscing diam, a cursus ipsum ante quis turpis. Nulla facilisi. Ut fringilla. Suspendisse potenti.</w:t>
       </w:r>
     </w:p>
     <w:p>
       <w:pPr>
         <w:keepLines/>
         <w:widowControl w:val="0"/>
-        <w:spacing w:before="481" w:after="0" w:lineRule="exact" w:line="631"/>
-        <w:ind w:left="673" w:right="863" w:firstLine="0"/>
+        <w:spacing w:before="288" w:after="0" w:line="240" w:lineRule="auto"/>
+        <w:ind w:left="0" w:right="0" w:firstLine="0"/>
         <w:jc w:val="left"/>
       </w:pPr>
       <w:r>
         <w:rPr>
-          <w:rFonts w:ascii="DMSans" w:hAnsi="DMSans" w:eastAsia="DMSans" w:cs="DMSans"/>
-          <w:b/>
-          <w:i w:val="0"/>
-          <w:color w:val="000000"/>
-          <w:sz w:val="39"/>
-        </w:rPr>
-        <w:t>Quantitative Analysis:</w:t>
-      </w:r>
-      <w:r>
-        <w:rPr>
-          <w:rFonts w:ascii="DMSans-Regular" w:hAnsi="DMSans-Regular" w:eastAsia="DMSans-Regular" w:cs="DMSans-Regular"/>
+          <w:rFonts w:ascii="Century Schoolbook" w:hAnsi="Century Schoolbook" w:eastAsia="Century Schoolbook" w:cs="Century Schoolbook"/>
           <w:b w:val="0"/>
           <w:i w:val="0"/>
           <w:color w:val="000000"/>
-          <w:sz w:val="39"/>
+          <w:sz w:val="24"/>
         </w:rPr>
-        <w:t xml:space="preserve"> Lorem ipsum dolor sit </w:t>
-      </w:r>
-      <w:r>
-        <w:br/>
-      </w:r>
-      <w:r>
-        <w:rPr>
-          <w:rFonts w:ascii="DMSans-Regular" w:hAnsi="DMSans-Regular" w:eastAsia="DMSans-Regular" w:cs="DMSans-Regular"/>
-          <w:b w:val="0"/>
-          <w:i w:val="0"/>
-          <w:color w:val="000000"/>
-          <w:sz w:val="39"/>
-        </w:rPr>
-        <w:t>amet, consectetur adipiscing elit.</w:t>
+        <w:t>Nunc feugiat mi a tellus consequat imperdiet. Vestibulum sapien. Proin quam. Etiam ultrices. Suspendisse in justo eu magna luctus suscipit. Sed lectus. Integer euismod lacus luctus magna. Quisque cursus, metus vitae pharetra auctor, sem massa mattis sem, at interdum magna augue eget diam. Vestibulum ante ipsum primis in faucibus orci luctus et ultrices posuere cubilia Curae; Morbi lacinia molestie dui. Praesent blandit dolor. Sed non quam. In vel mi sit amet augue congue elementum. Morbi in ipsum sit amet pede facilisis laoreet.</w:t>
       </w:r>
     </w:p>
     <w:p>
       <w:pPr>
         <w:keepLines/>
         <w:widowControl w:val="0"/>
-        <w:spacing w:before="116" w:after="0" w:lineRule="exact" w:line="631"/>
-        <w:ind w:left="673" w:right="401" w:firstLine="0"/>
-        <w:jc w:val="left"/>
+        <w:spacing w:before="840" w:after="0" w:line="240" w:lineRule="auto"/>
+        <w:ind w:left="5338" w:right="0" w:firstLine="0"/>
+        <w:jc w:val="center"/>
       </w:pPr>
       <w:r>
         <w:rPr>
-          <w:rFonts w:ascii="DMSans" w:hAnsi="DMSans" w:eastAsia="DMSans" w:cs="DMSans"/>
-          <w:b/>
-          <w:i w:val="0"/>
-          <w:color w:val="000000"/>
-          <w:sz w:val="39"/>
-        </w:rPr>
-        <w:t>Qualitative Analysis:</w:t>
-      </w:r>
-      <w:r>
-        <w:rPr>
-          <w:rFonts w:ascii="DMSans-Regular" w:hAnsi="DMSans-Regular" w:eastAsia="DMSans-Regular" w:cs="DMSans-Regular"/>
+          <w:rFonts w:ascii="Calibri" w:hAnsi="Calibri" w:eastAsia="Calibri" w:cs="Calibri"/>
           <w:b w:val="0"/>
           <w:i w:val="0"/>
           <w:color w:val="000000"/>
-          <w:sz w:val="39"/>
+          <w:sz w:val="24"/>
         </w:rPr>
-        <w:t xml:space="preserve"> Integer nec odio. Praesent </w:t>
-      </w:r>
-      <w:r>
-        <w:br/>
-      </w:r>
-      <w:r>
-        <w:rPr>
-          <w:rFonts w:ascii="DMSans-Regular" w:hAnsi="DMSans-Regular" w:eastAsia="DMSans-Regular" w:cs="DMSans-Regular"/>
-          <w:b w:val="0"/>
-          <w:i w:val="0"/>
-          <w:color w:val="000000"/>
-          <w:sz w:val="39"/>
-        </w:rPr>
-        <w:t>libero. Sed cursus ante dapibus diam.</w:t>
-      </w:r>
-    </w:p>
-    <w:p>
-      <w:pPr>
-        <w:keepLines/>
-        <w:widowControl w:val="0"/>
-        <w:spacing w:before="735" w:after="0" w:lineRule="exact" w:line="773"/>
-        <w:ind w:left="0" w:right="7564" w:firstLine="0"/>
-        <w:jc w:val="left"/>
-      </w:pPr>
-      <w:r>
-        <w:rPr>
-          <w:rFonts w:ascii="DMSans" w:hAnsi="DMSans" w:eastAsia="DMSans" w:cs="DMSans"/>
-          <w:b/>
-          <w:i w:val="0"/>
-          <w:color w:val="000000"/>
-          <w:sz w:val="59"/>
-        </w:rPr>
-        <w:t>Results</w:t>
-      </w:r>
-    </w:p>
-    <w:p>
-      <w:pPr>
-        <w:keepLines/>
-        <w:widowControl w:val="0"/>
-        <w:spacing w:before="388" w:after="0" w:lineRule="exact" w:line="515"/>
-        <w:ind w:left="0" w:right="428" w:firstLine="0"/>
-        <w:jc w:val="left"/>
-      </w:pPr>
-      <w:r>
-        <w:rPr>
-          <w:rFonts w:ascii="DMSans-Regular" w:hAnsi="DMSans-Regular" w:eastAsia="DMSans-Regular" w:cs="DMSans-Regular"/>
-          <w:b w:val="0"/>
-          <w:i w:val="0"/>
-          <w:color w:val="000000"/>
-          <w:sz w:val="39"/>
-        </w:rPr>
-        <w:t>The following table summarizes the key data points:</w:t>
-      </w:r>
-    </w:p>
-    <w:p>
-      <w:pPr>
-        <w:keepLines/>
-        <w:widowControl w:val="0"/>
-        <w:spacing w:before="5050" w:after="0" w:lineRule="exact" w:line="515"/>
-        <w:ind w:left="0" w:right="2883" w:firstLine="0"/>
-        <w:jc w:val="left"/>
-      </w:pPr>
-      <w:r>
-        <w:rPr>
-          <w:rFonts w:ascii="DMSans" w:hAnsi="DMSans" w:eastAsia="DMSans" w:cs="DMSans"/>
-          <w:b w:val="0"/>
-          <w:i/>
-          <w:color w:val="000000"/>
-          <w:sz w:val="39"/>
-        </w:rPr>
-        <w:t>(Table 1: Summary of Key Data Points)</w:t>
-      </w:r>
-    </w:p>
-    <w:p>
-      <w:pPr>
-        <w:sectPr>
-          <w:pgSz w:w="12240" w:h="20160"/>
-          <w:pgMar w:top="1158" w:right="1356" w:bottom="1707" w:left="1207" w:header="0" w:footer="0" w:gutter="0"/>
-          <w:cols w:space="720"/>
-          <w:docGrid w:linePitch="360"/>
-        </w:sectPr>
-      </w:pPr>
-    </w:p>
-    <w:p>
-      <w:pPr>
-        <w:keepLines/>
-        <w:widowControl w:val="0"/>
-        <w:spacing w:before="0" w:after="0" w:lineRule="exact" w:line="750"/>
-        <w:ind w:left="0" w:right="4136" w:firstLine="0"/>
-        <w:jc w:val="left"/>
-      </w:pPr>
-      <w:r>
-        <w:rPr>
-          <w:rFonts w:ascii="DMSans" w:hAnsi="DMSans" w:eastAsia="DMSans" w:cs="DMSans"/>
-          <w:b/>
-          <w:i w:val="0"/>
-          <w:color w:val="000000"/>
-          <w:sz w:val="57"/>
-        </w:rPr>
-        <w:t>Charts and Graphs</w:t>
-      </w:r>
-    </w:p>
-    <w:p>
-      <w:pPr>
-        <w:keepLines/>
-        <w:widowControl w:val="0"/>
-        <w:spacing w:before="377" w:after="0" w:lineRule="exact" w:line="450"/>
-        <w:ind w:left="0" w:right="0" w:firstLine="0"/>
-        <w:jc w:val="left"/>
-      </w:pPr>
-      <w:r>
-        <w:rPr>
-          <w:rFonts w:ascii="DMSans-Regular" w:hAnsi="DMSans-Regular" w:eastAsia="DMSans-Regular" w:cs="DMSans-Regular"/>
-          <w:b w:val="0"/>
-          <w:i w:val="0"/>
-          <w:color w:val="000000"/>
-          <w:sz w:val="38"/>
-        </w:rPr>
-        <w:t xml:space="preserve">Below is a placeholder for a bar chart showing market </w:t>
-      </w:r>
-      <w:r>
-        <w:br/>
-      </w:r>
-      <w:r>
-        <w:rPr>
-          <w:rFonts w:ascii="DMSans-Regular" w:hAnsi="DMSans-Regular" w:eastAsia="DMSans-Regular" w:cs="DMSans-Regular"/>
-          <w:b w:val="0"/>
-          <w:i w:val="0"/>
-          <w:color w:val="000000"/>
-          <w:sz w:val="38"/>
-        </w:rPr>
-        <w:t>growth over the past five years:</w:t>
-      </w:r>
-    </w:p>
-    <w:p>
-      <w:pPr>
-        <w:keepLines/>
-        <w:widowControl w:val="0"/>
-        <w:spacing w:before="14357" w:after="0" w:lineRule="exact" w:line="500"/>
-        <w:ind w:left="0" w:right="570" w:firstLine="0"/>
-        <w:jc w:val="left"/>
-      </w:pPr>
-      <w:r>
-        <w:rPr>
-          <w:rFonts w:ascii="DMSans" w:hAnsi="DMSans" w:eastAsia="DMSans" w:cs="DMSans"/>
-          <w:b w:val="0"/>
-          <w:i/>
-          <w:color w:val="000000"/>
-          <w:sz w:val="38"/>
-        </w:rPr>
-        <w:t>(Figure 1: Market Growth Over the Past Five Years)</w:t>
-      </w:r>
-    </w:p>
-    <w:p>
-      <w:pPr>
-        <w:sectPr>
-          <w:pgSz w:w="12240" w:h="20160"/>
-          <w:pgMar w:top="1159" w:right="1739" w:bottom="2066" w:left="1209" w:header="0" w:footer="0" w:gutter="0"/>
-          <w:cols w:space="720"/>
-          <w:docGrid w:linePitch="360"/>
-        </w:sectPr>
-      </w:pPr>
-    </w:p>
-    <w:p>
-      <w:pPr>
-        <w:keepLines/>
-        <w:widowControl w:val="0"/>
-        <w:spacing w:before="0" w:after="0" w:lineRule="exact" w:line="771"/>
-        <w:ind w:left="0" w:right="6386" w:firstLine="0"/>
-        <w:jc w:val="left"/>
-      </w:pPr>
-      <w:r>
-        <w:rPr>
-          <w:rFonts w:ascii="DMSans" w:hAnsi="DMSans" w:eastAsia="DMSans" w:cs="DMSans"/>
-          <w:b/>
-          <w:i w:val="0"/>
-          <w:color w:val="000000"/>
-          <w:sz w:val="59"/>
-        </w:rPr>
-        <w:t>Conclusion</w:t>
-      </w:r>
-    </w:p>
-    <w:p>
-      <w:pPr>
-        <w:keepLines/>
-        <w:widowControl w:val="0"/>
-        <w:spacing w:before="387" w:after="0" w:lineRule="exact" w:line="462"/>
-        <w:ind w:left="0" w:right="0" w:firstLine="0"/>
-        <w:jc w:val="left"/>
-      </w:pPr>
-      <w:r>
-        <w:rPr>
-          <w:rFonts w:ascii="DMSans-Regular" w:hAnsi="DMSans-Regular" w:eastAsia="DMSans-Regular" w:cs="DMSans-Regular"/>
-          <w:b w:val="0"/>
-          <w:i w:val="0"/>
-          <w:color w:val="000000"/>
-          <w:sz w:val="39"/>
-        </w:rPr>
-        <w:t>Lorem ipsum dolor sit amet, consectetur adipiscing</w:t>
-      </w:r>
-      <w:r>
-        <w:br/>
-      </w:r>
-      <w:r>
-        <w:rPr>
-          <w:rFonts w:ascii="DMSans-Regular" w:hAnsi="DMSans-Regular" w:eastAsia="DMSans-Regular" w:cs="DMSans-Regular"/>
-          <w:b w:val="0"/>
-          <w:i w:val="0"/>
-          <w:color w:val="000000"/>
-          <w:sz w:val="39"/>
-        </w:rPr>
-        <w:t xml:space="preserve"> elit. Integer nec odio. Praesent libero. Sed cursus ant</w:t>
-      </w:r>
-      <w:r>
-        <w:br/>
-      </w:r>
-      <w:r>
-        <w:rPr>
-          <w:rFonts w:ascii="DMSans-Regular" w:hAnsi="DMSans-Regular" w:eastAsia="DMSans-Regular" w:cs="DMSans-Regular"/>
-          <w:b w:val="0"/>
-          <w:i w:val="0"/>
-          <w:color w:val="000000"/>
-          <w:sz w:val="39"/>
-        </w:rPr>
-        <w:t xml:space="preserve">e dapibus diam. Sed nisi. Nulla quis sem at nibh </w:t>
-      </w:r>
-      <w:r>
-        <w:br/>
-      </w:r>
-      <w:r>
-        <w:rPr>
-          <w:rFonts w:ascii="DMSans-Regular" w:hAnsi="DMSans-Regular" w:eastAsia="DMSans-Regular" w:cs="DMSans-Regular"/>
-          <w:b w:val="0"/>
-          <w:i w:val="0"/>
-          <w:color w:val="000000"/>
-          <w:sz w:val="39"/>
-        </w:rPr>
-        <w:t>elementum imperdiet.</w:t>
-      </w:r>
-    </w:p>
-    <w:p>
-      <w:pPr>
-        <w:keepLines/>
-        <w:widowControl w:val="0"/>
-        <w:spacing w:before="1362" w:after="0" w:lineRule="exact" w:line="771"/>
-        <w:ind w:left="0" w:right="6303" w:firstLine="0"/>
-        <w:jc w:val="left"/>
-      </w:pPr>
-      <w:r>
-        <w:rPr>
-          <w:rFonts w:ascii="DMSans" w:hAnsi="DMSans" w:eastAsia="DMSans" w:cs="DMSans"/>
-          <w:b/>
-          <w:i w:val="0"/>
-          <w:color w:val="000000"/>
-          <w:sz w:val="59"/>
-        </w:rPr>
-        <w:t>Next Steps:</w:t>
-      </w:r>
-    </w:p>
-    <w:p>
-      <w:pPr>
-        <w:keepLines/>
-        <w:widowControl w:val="0"/>
-        <w:spacing w:before="479" w:after="0" w:lineRule="exact" w:line="514"/>
-        <w:ind w:left="443" w:right="4089" w:firstLine="0"/>
-        <w:jc w:val="left"/>
-      </w:pPr>
-      <w:r>
-        <w:rPr>
-          <w:rFonts w:ascii="DMSans-Regular" w:hAnsi="DMSans-Regular" w:eastAsia="DMSans-Regular" w:cs="DMSans-Regular"/>
-          <w:b w:val="0"/>
-          <w:i w:val="0"/>
-          <w:color w:val="000000"/>
-          <w:sz w:val="39"/>
-        </w:rPr>
-        <w:t>1. Finalize the project report.</w:t>
-      </w:r>
-    </w:p>
-    <w:p>
-      <w:pPr>
-        <w:keepLines/>
-        <w:widowControl w:val="0"/>
-        <w:spacing w:before="115" w:after="0" w:lineRule="exact" w:line="514"/>
-        <w:ind w:left="336" w:right="2669" w:firstLine="0"/>
-        <w:jc w:val="left"/>
-      </w:pPr>
-      <w:r>
-        <w:rPr>
-          <w:rFonts w:ascii="DMSans-Regular" w:hAnsi="DMSans-Regular" w:eastAsia="DMSans-Regular" w:cs="DMSans-Regular"/>
-          <w:b w:val="0"/>
-          <w:i w:val="0"/>
-          <w:color w:val="000000"/>
-          <w:sz w:val="39"/>
-        </w:rPr>
-        <w:t>2. Review the findings with the team.</w:t>
-      </w:r>
-    </w:p>
-    <w:p>
-      <w:pPr>
-        <w:keepLines/>
-        <w:widowControl w:val="0"/>
-        <w:spacing w:before="115" w:after="0" w:lineRule="exact" w:line="514"/>
-        <w:ind w:left="330" w:right="1702" w:firstLine="0"/>
-        <w:jc w:val="left"/>
-      </w:pPr>
-      <w:r>
-        <w:rPr>
-          <w:rFonts w:ascii="DMSans-Regular" w:hAnsi="DMSans-Regular" w:eastAsia="DMSans-Regular" w:cs="DMSans-Regular"/>
-          <w:b w:val="0"/>
-          <w:i w:val="0"/>
-          <w:color w:val="000000"/>
-          <w:sz w:val="39"/>
-        </w:rPr>
-        <w:t>3. Present the final report to stakeholders.</w:t>
-      </w:r>
-    </w:p>
-    <w:p>
-      <w:pPr>
-        <w:keepLines/>
-        <w:widowControl w:val="0"/>
-        <w:spacing w:before="1085" w:after="0" w:lineRule="exact" w:line="771"/>
-        <w:ind w:left="0" w:right="6339" w:firstLine="0"/>
-        <w:jc w:val="left"/>
-      </w:pPr>
-      <w:r>
-        <w:rPr>
-          <w:rFonts w:ascii="DMSans" w:hAnsi="DMSans" w:eastAsia="DMSans" w:cs="DMSans"/>
-          <w:b/>
-          <w:i w:val="0"/>
-          <w:color w:val="000000"/>
-          <w:sz w:val="59"/>
-        </w:rPr>
-        <w:t>References</w:t>
-      </w:r>
-    </w:p>
-    <w:p>
-      <w:pPr>
-        <w:keepLines/>
-        <w:widowControl w:val="0"/>
-        <w:spacing w:before="775" w:after="0" w:lineRule="exact" w:line="629"/>
-        <w:ind w:left="0" w:right="0" w:firstLine="0"/>
-        <w:jc w:val="left"/>
-      </w:pPr>
-      <w:r>
-        <w:rPr>
-          <w:rFonts w:ascii="DMSans-Regular" w:hAnsi="DMSans-Regular" w:eastAsia="DMSans-Regular" w:cs="DMSans-Regular"/>
-          <w:b w:val="0"/>
-          <w:i w:val="0"/>
-          <w:color w:val="000000"/>
-          <w:sz w:val="39"/>
-        </w:rPr>
-        <w:t>Lorem ipsum dolor sit amet, consectetur adipiscing</w:t>
-      </w:r>
-      <w:r>
-        <w:br/>
-      </w:r>
-      <w:r>
-        <w:rPr>
-          <w:rFonts w:ascii="DMSans-Regular" w:hAnsi="DMSans-Regular" w:eastAsia="DMSans-Regular" w:cs="DMSans-Regular"/>
-          <w:b w:val="0"/>
-          <w:i w:val="0"/>
-          <w:color w:val="000000"/>
-          <w:sz w:val="39"/>
-        </w:rPr>
-        <w:t xml:space="preserve"> elit. Integer nec odio. Praesent libero. Sed cursus ant</w:t>
-      </w:r>
-      <w:r>
-        <w:br/>
-      </w:r>
-      <w:r>
-        <w:rPr>
-          <w:rFonts w:ascii="DMSans-Regular" w:hAnsi="DMSans-Regular" w:eastAsia="DMSans-Regular" w:cs="DMSans-Regular"/>
-          <w:b w:val="0"/>
-          <w:i w:val="0"/>
-          <w:color w:val="000000"/>
-          <w:sz w:val="39"/>
-        </w:rPr>
-        <w:t xml:space="preserve">e dapibus diam. Sed nisi. Nulla quis sem at nibh </w:t>
-      </w:r>
-      <w:r>
-        <w:br/>
-      </w:r>
-      <w:r>
-        <w:rPr>
-          <w:rFonts w:ascii="DMSans-Regular" w:hAnsi="DMSans-Regular" w:eastAsia="DMSans-Regular" w:cs="DMSans-Regular"/>
-          <w:b w:val="0"/>
-          <w:i w:val="0"/>
-          <w:color w:val="000000"/>
-          <w:sz w:val="39"/>
-        </w:rPr>
-        <w:t>elementum imperdiet.</w:t>
+        <w:t>3</w:t>
       </w:r>
     </w:p>
     <w:sectPr>
-      <w:pgSz w:w="12240" w:h="20160"/>
-      <w:pgMar w:top="1158" w:right="1351" w:bottom="6529" w:left="1346" w:header="0" w:footer="0" w:gutter="0"/>
+      <w:pgSz w:w="12240" w:h="15840"/>
+      <w:pgMar w:top="730" w:right="720" w:bottom="720" w:left="723" w:header="0" w:footer="0" w:gutter="0"/>
       <w:cols w:space="720"/>
       <w:docGrid w:linePitch="360"/>
     </w:sectPr>

</xml_diff>

<commit_message>
Step 62.9G.2 - Group list sequences and detect nesting
</commit_message>
<xml_diff>
--- a/output/editable.docx
+++ b/output/editable.docx
@@ -7,548 +7,204 @@
         <w:keepLines/>
         <w:widowControl w:val="0"/>
         <w:spacing w:before="0" w:after="0" w:line="240" w:lineRule="auto"/>
-        <w:ind w:left="3083" w:right="0" w:firstLine="0"/>
+        <w:ind w:left="0" w:right="0" w:firstLine="0"/>
         <w:jc w:val="center"/>
       </w:pPr>
       <w:r>
         <w:rPr>
-          <w:rFonts w:ascii="Century Schoolbook" w:hAnsi="Century Schoolbook" w:eastAsia="Century Schoolbook" w:cs="Century Schoolbook"/>
+          <w:rFonts w:ascii="Arial" w:hAnsi="Arial" w:eastAsia="Arial" w:cs="Arial"/>
           <w:b/>
           <w:i w:val="0"/>
-          <w:color w:val="2E74B5"/>
-          <w:sz w:val="72"/>
+          <w:color w:val="FF0000"/>
+          <w:sz w:val="36"/>
         </w:rPr>
-        <w:t>Sample PDF</w:t>
+        <w:t>PDF B</w:t>
+      </w:r>
+      <w:r>
+        <w:rPr>
+          <w:rFonts w:ascii="Arial" w:hAnsi="Arial" w:eastAsia="Arial" w:cs="Arial"/>
+          <w:b/>
+          <w:i w:val="0"/>
+          <w:color w:val="FF0000"/>
+          <w:sz w:val="29"/>
+        </w:rPr>
+        <w:t xml:space="preserve">OOKMARK </w:t>
+      </w:r>
+      <w:r>
+        <w:rPr>
+          <w:rFonts w:ascii="Arial" w:hAnsi="Arial" w:eastAsia="Arial" w:cs="Arial"/>
+          <w:b/>
+          <w:i w:val="0"/>
+          <w:color w:val="FF0000"/>
+          <w:sz w:val="36"/>
+        </w:rPr>
+        <w:t>S</w:t>
+      </w:r>
+      <w:r>
+        <w:rPr>
+          <w:rFonts w:ascii="Arial" w:hAnsi="Arial" w:eastAsia="Arial" w:cs="Arial"/>
+          <w:b/>
+          <w:i w:val="0"/>
+          <w:color w:val="FF0000"/>
+          <w:sz w:val="29"/>
+        </w:rPr>
+        <w:t>AMPLE</w:t>
       </w:r>
     </w:p>
     <w:p>
       <w:pPr>
         <w:keepLines/>
         <w:widowControl w:val="0"/>
-        <w:spacing w:before="286" w:after="0" w:line="240" w:lineRule="auto"/>
-        <w:ind w:left="2867" w:right="0" w:firstLine="0"/>
-        <w:jc w:val="center"/>
+        <w:spacing w:before="840" w:after="0" w:line="240" w:lineRule="auto"/>
+        <w:ind w:left="0" w:right="0" w:firstLine="0"/>
+        <w:jc w:val="left"/>
       </w:pPr>
       <w:r>
         <w:rPr>
-          <w:rFonts w:ascii="Century Schoolbook" w:hAnsi="Century Schoolbook" w:eastAsia="Century Schoolbook" w:cs="Century Schoolbook"/>
-          <w:b w:val="0"/>
+          <w:rFonts w:ascii="Arial" w:hAnsi="Arial" w:eastAsia="Arial" w:cs="Arial"/>
+          <w:b/>
           <w:i w:val="0"/>
-          <w:color w:val="000000"/>
-          <w:sz w:val="36"/>
+          <w:color w:val="808080"/>
+          <w:sz w:val="28"/>
         </w:rPr>
-        <w:t xml:space="preserve">Created for testing </w:t>
-      </w:r>
-      <w:r>
-        <w:rPr>
-          <w:rFonts w:ascii="Century Schoolbook" w:hAnsi="Century Schoolbook" w:eastAsia="Century Schoolbook" w:cs="Century Schoolbook"/>
-          <w:b w:val="0"/>
-          <w:i w:val="0"/>
-          <w:color w:val="5B9BD5"/>
-          <w:sz w:val="36"/>
-        </w:rPr>
-        <w:t>PDFObject</w:t>
+        <w:t>Overview</w:t>
       </w:r>
     </w:p>
     <w:p>
       <w:pPr>
         <w:keepLines/>
         <w:widowControl w:val="0"/>
-        <w:spacing w:before="296" w:after="0" w:line="240" w:lineRule="auto"/>
+        <w:spacing w:before="127" w:after="0" w:line="240" w:lineRule="auto"/>
         <w:ind w:left="0" w:right="0" w:firstLine="0"/>
-        <w:jc w:val="left"/>
+        <w:jc w:val="both"/>
       </w:pPr>
       <w:r>
         <w:rPr>
-          <w:rFonts w:ascii="Century Schoolbook" w:hAnsi="Century Schoolbook" w:eastAsia="Century Schoolbook" w:cs="Century Schoolbook"/>
+          <w:rFonts w:ascii="Arial" w:hAnsi="Arial" w:eastAsia="Arial" w:cs="Arial"/>
           <w:b w:val="0"/>
           <w:i w:val="0"/>
           <w:color w:val="000000"/>
-          <w:sz w:val="32"/>
+          <w:sz w:val="22"/>
         </w:rPr>
-        <w:t>This PDF is three pages long. Three long pages. Or three short pages if</w:t>
-      </w:r>
-      <w:r>
-        <w:br/>
-      </w:r>
-      <w:r>
-        <w:rPr>
-          <w:rFonts w:ascii="Century Schoolbook" w:hAnsi="Century Schoolbook" w:eastAsia="Century Schoolbook" w:cs="Century Schoolbook"/>
-          <w:b w:val="0"/>
-          <w:i w:val="0"/>
-          <w:color w:val="000000"/>
-          <w:sz w:val="32"/>
-        </w:rPr>
-        <w:t>you’re optimistic. Is it the same as saying “three long minutes”, knowing</w:t>
-      </w:r>
-      <w:r>
-        <w:br/>
-      </w:r>
-      <w:r>
-        <w:rPr>
-          <w:rFonts w:ascii="Century Schoolbook" w:hAnsi="Century Schoolbook" w:eastAsia="Century Schoolbook" w:cs="Century Schoolbook"/>
-          <w:b w:val="0"/>
-          <w:i w:val="0"/>
-          <w:color w:val="000000"/>
-          <w:sz w:val="32"/>
-        </w:rPr>
-        <w:t>that all minutes are the same duration, and one cannot possibly be longer</w:t>
-      </w:r>
-      <w:r>
-        <w:br/>
-      </w:r>
-      <w:r>
-        <w:rPr>
-          <w:rFonts w:ascii="Century Schoolbook" w:hAnsi="Century Schoolbook" w:eastAsia="Century Schoolbook" w:cs="Century Schoolbook"/>
-          <w:b w:val="0"/>
-          <w:i w:val="0"/>
-          <w:color w:val="000000"/>
-          <w:sz w:val="32"/>
-        </w:rPr>
-        <w:t>than the other? If these pages are all the same size, can one possibly be</w:t>
-      </w:r>
-      <w:r>
-        <w:br/>
-      </w:r>
-      <w:r>
-        <w:rPr>
-          <w:rFonts w:ascii="Century Schoolbook" w:hAnsi="Century Schoolbook" w:eastAsia="Century Schoolbook" w:cs="Century Schoolbook"/>
-          <w:b w:val="0"/>
-          <w:i w:val="0"/>
-          <w:color w:val="000000"/>
-          <w:sz w:val="32"/>
-        </w:rPr>
-        <w:t>longer than the other?</w:t>
+        <w:t>This sample consists of a simple form containing four distinct fields. The data file contains eight separate records.</w:t>
       </w:r>
     </w:p>
     <w:p>
       <w:pPr>
         <w:keepLines/>
         <w:widowControl w:val="0"/>
-        <w:spacing w:before="290" w:after="0" w:line="240" w:lineRule="auto"/>
+        <w:spacing w:before="126" w:after="0" w:line="240" w:lineRule="auto"/>
         <w:ind w:left="0" w:right="0" w:firstLine="0"/>
         <w:jc w:val="left"/>
       </w:pPr>
       <w:r>
         <w:rPr>
-          <w:rFonts w:ascii="Century Schoolbook" w:hAnsi="Century Schoolbook" w:eastAsia="Century Schoolbook" w:cs="Century Schoolbook"/>
+          <w:rFonts w:ascii="Arial" w:hAnsi="Arial" w:eastAsia="Arial" w:cs="Arial"/>
           <w:b w:val="0"/>
           <w:i w:val="0"/>
           <w:color w:val="000000"/>
-          <w:sz w:val="24"/>
+          <w:sz w:val="22"/>
         </w:rPr>
-        <w:t>I digress. Here’s some Latin. Lorem ipsum dolor sit amet, consectetur adipiscing elit. Integer nec</w:t>
-      </w:r>
-      <w:r>
-        <w:br/>
-      </w:r>
-      <w:r>
-        <w:rPr>
-          <w:rFonts w:ascii="Century Schoolbook" w:hAnsi="Century Schoolbook" w:eastAsia="Century Schoolbook" w:cs="Century Schoolbook"/>
-          <w:b w:val="0"/>
-          <w:i w:val="0"/>
-          <w:color w:val="000000"/>
-          <w:sz w:val="24"/>
-        </w:rPr>
-        <w:t>odio. Praesent libero. Sed cursus ante dapibus diam. Sed nisi. Nulla quis sem at nibh elementum</w:t>
-      </w:r>
-      <w:r>
-        <w:br/>
-      </w:r>
-      <w:r>
-        <w:rPr>
-          <w:rFonts w:ascii="Century Schoolbook" w:hAnsi="Century Schoolbook" w:eastAsia="Century Schoolbook" w:cs="Century Schoolbook"/>
-          <w:b w:val="0"/>
-          <w:i w:val="0"/>
-          <w:color w:val="000000"/>
-          <w:sz w:val="24"/>
-        </w:rPr>
-        <w:t>imperdiet. Duis sagittis ipsum. Praesent mauris. Fusce nec tellus sed augue semper porta. Mauris</w:t>
-      </w:r>
-      <w:r>
-        <w:br/>
-      </w:r>
-      <w:r>
-        <w:rPr>
-          <w:rFonts w:ascii="Century Schoolbook" w:hAnsi="Century Schoolbook" w:eastAsia="Century Schoolbook" w:cs="Century Schoolbook"/>
-          <w:b w:val="0"/>
-          <w:i w:val="0"/>
-          <w:color w:val="000000"/>
-          <w:sz w:val="24"/>
-        </w:rPr>
-        <w:t>massa. Vestibulum lacinia arcu eget nulla. Class aptent taciti sociosqu ad litora torquent per</w:t>
-      </w:r>
-      <w:r>
-        <w:br/>
-      </w:r>
-      <w:r>
-        <w:rPr>
-          <w:rFonts w:ascii="Century Schoolbook" w:hAnsi="Century Schoolbook" w:eastAsia="Century Schoolbook" w:cs="Century Schoolbook"/>
-          <w:b w:val="0"/>
-          <w:i w:val="0"/>
-          <w:color w:val="000000"/>
-          <w:sz w:val="24"/>
-        </w:rPr>
-        <w:t>conubia nostra, per inceptos himenaeos. Curabitur sodales ligula in libero.</w:t>
+        <w:t>By default, the data file will produce a PDF file containing eight separate pages. The selective use of the bookmark file will produce the same PDF with a separate pane containing bookmarks. This screenshot of the sample output shows a PDF file with bookmarks.</w:t>
       </w:r>
     </w:p>
     <w:p>
       <w:pPr>
         <w:keepLines/>
         <w:widowControl w:val="0"/>
-        <w:spacing w:before="288" w:after="0" w:line="240" w:lineRule="auto"/>
+        <w:spacing w:before="840" w:after="0" w:line="240" w:lineRule="auto"/>
         <w:ind w:left="0" w:right="0" w:firstLine="0"/>
         <w:jc w:val="left"/>
       </w:pPr>
       <w:r>
         <w:rPr>
-          <w:rFonts w:ascii="Century Schoolbook" w:hAnsi="Century Schoolbook" w:eastAsia="Century Schoolbook" w:cs="Century Schoolbook"/>
+          <w:rFonts w:ascii="Arial" w:hAnsi="Arial" w:eastAsia="Arial" w:cs="Arial"/>
           <w:b w:val="0"/>
           <w:i w:val="0"/>
           <w:color w:val="000000"/>
-          <w:sz w:val="24"/>
+          <w:sz w:val="22"/>
         </w:rPr>
-        <w:t>Sed dignissim lacinia nunc. Curabitur tortor. Pellentesque nibh. Aenean quam. In scelerisque sem</w:t>
-      </w:r>
-      <w:r>
-        <w:br/>
+        <w:t>The left pane displays the available bookmarks for this PDF. You may need to enable the display of bookmarks in Adobe</w:t>
       </w:r>
       <w:r>
         <w:rPr>
-          <w:rFonts w:ascii="Century Schoolbook" w:hAnsi="Century Schoolbook" w:eastAsia="Century Schoolbook" w:cs="Century Schoolbook"/>
+          <w:rFonts w:ascii="Symbol" w:hAnsi="Symbol" w:eastAsia="Symbol" w:cs="Symbol"/>
           <w:b w:val="0"/>
           <w:i w:val="0"/>
           <w:color w:val="000000"/>
-          <w:sz w:val="24"/>
+          <w:sz w:val="18"/>
         </w:rPr>
-        <w:t>at dolor. Maecenas mattis. Sed convallis tristique sem. Proin ut ligula vel nunc egestas porttitor.</w:t>
-      </w:r>
-      <w:r>
-        <w:br/>
+        <w:t xml:space="preserve"> </w:t>
       </w:r>
       <w:r>
         <w:rPr>
-          <w:rFonts w:ascii="Century Schoolbook" w:hAnsi="Century Schoolbook" w:eastAsia="Century Schoolbook" w:cs="Century Schoolbook"/>
+          <w:rFonts w:ascii="Arial" w:hAnsi="Arial" w:eastAsia="Arial" w:cs="Arial"/>
           <w:b w:val="0"/>
           <w:i w:val="0"/>
           <w:color w:val="000000"/>
-          <w:sz w:val="24"/>
+          <w:sz w:val="22"/>
         </w:rPr>
-        <w:t>Morbi lectus risus, iaculis vel, suscipit quis, luctus non, massa. Fusce ac turpis quis ligula lacinia</w:t>
-      </w:r>
-      <w:r>
-        <w:br/>
+        <w:t>Acrobat</w:t>
       </w:r>
       <w:r>
         <w:rPr>
-          <w:rFonts w:ascii="Century Schoolbook" w:hAnsi="Century Schoolbook" w:eastAsia="Century Schoolbook" w:cs="Century Schoolbook"/>
+          <w:rFonts w:ascii="Symbol" w:hAnsi="Symbol" w:eastAsia="Symbol" w:cs="Symbol"/>
           <w:b w:val="0"/>
           <w:i w:val="0"/>
           <w:color w:val="000000"/>
-          <w:sz w:val="24"/>
+          <w:sz w:val="18"/>
         </w:rPr>
-        <w:t>aliquet. Mauris ipsum. Nulla metus metus, ullamcorper vel, tincidunt sed, euismod in, nibh.</w:t>
+        <w:t xml:space="preserve"> </w:t>
+      </w:r>
+      <w:r>
+        <w:rPr>
+          <w:rFonts w:ascii="Arial" w:hAnsi="Arial" w:eastAsia="Arial" w:cs="Arial"/>
+          <w:b w:val="0"/>
+          <w:i w:val="0"/>
+          <w:color w:val="000000"/>
+          <w:sz w:val="22"/>
+        </w:rPr>
+        <w:t xml:space="preserve">Reader by clicking </w:t>
+      </w:r>
+      <w:r>
+        <w:rPr>
+          <w:rFonts w:ascii="Arial" w:hAnsi="Arial" w:eastAsia="Arial" w:cs="Arial"/>
+          <w:b/>
+          <w:i w:val="0"/>
+          <w:color w:val="000000"/>
+          <w:sz w:val="22"/>
+        </w:rPr>
+        <w:t>Window &gt; Show Bookmarks</w:t>
+      </w:r>
+      <w:r>
+        <w:rPr>
+          <w:rFonts w:ascii="Arial" w:hAnsi="Arial" w:eastAsia="Arial" w:cs="Arial"/>
+          <w:b w:val="0"/>
+          <w:i w:val="0"/>
+          <w:color w:val="000000"/>
+          <w:sz w:val="22"/>
+        </w:rPr>
+        <w:t>. Selecting a date from the left pane displays the corresponding page within the document.</w:t>
       </w:r>
     </w:p>
     <w:p>
       <w:pPr>
         <w:keepLines/>
         <w:widowControl w:val="0"/>
-        <w:spacing w:before="292" w:after="0" w:line="240" w:lineRule="auto"/>
+        <w:spacing w:before="126" w:after="0" w:line="240" w:lineRule="auto"/>
         <w:ind w:left="0" w:right="0" w:firstLine="0"/>
-        <w:jc w:val="left"/>
+        <w:jc w:val="both"/>
       </w:pPr>
       <w:r>
         <w:rPr>
-          <w:rFonts w:ascii="Century Schoolbook" w:hAnsi="Century Schoolbook" w:eastAsia="Century Schoolbook" w:cs="Century Schoolbook"/>
+          <w:rFonts w:ascii="Arial" w:hAnsi="Arial" w:eastAsia="Arial" w:cs="Arial"/>
           <w:b w:val="0"/>
           <w:i w:val="0"/>
           <w:color w:val="000000"/>
-          <w:sz w:val="24"/>
+          <w:sz w:val="22"/>
         </w:rPr>
-        <w:t>Quisque volutpat condimentum velit. Class aptent taciti sociosqu ad litora torquent per conubia</w:t>
+        <w:t>Note that the index has been sorted according to the specification in the bookmark file, and that pages within the file are created according to the original order in the data file.</w:t>
       </w:r>
-      <w:r>
-        <w:br/>
-      </w:r>
-      <w:r>
-        <w:rPr>
-          <w:rFonts w:ascii="Century Schoolbook" w:hAnsi="Century Schoolbook" w:eastAsia="Century Schoolbook" w:cs="Century Schoolbook"/>
-          <w:b w:val="0"/>
-          <w:i w:val="0"/>
-          <w:color w:val="000000"/>
-          <w:sz w:val="24"/>
-        </w:rPr>
-        <w:t>nostra, per inceptos himenaeos. Nam nec ante. Sed lacinia, urna non tincidunt mattis, tortor neque</w:t>
-      </w:r>
-      <w:r>
-        <w:br/>
-      </w:r>
-      <w:r>
-        <w:rPr>
-          <w:rFonts w:ascii="Century Schoolbook" w:hAnsi="Century Schoolbook" w:eastAsia="Century Schoolbook" w:cs="Century Schoolbook"/>
-          <w:b w:val="0"/>
-          <w:i w:val="0"/>
-          <w:color w:val="000000"/>
-          <w:sz w:val="24"/>
-        </w:rPr>
-        <w:t>adipiscing diam, a cursus ipsum ante quis turpis. Nulla facilisi. Ut fringilla. Suspendisse potenti.</w:t>
-      </w:r>
-      <w:r>
-        <w:br/>
-      </w:r>
-      <w:r>
-        <w:rPr>
-          <w:rFonts w:ascii="Century Schoolbook" w:hAnsi="Century Schoolbook" w:eastAsia="Century Schoolbook" w:cs="Century Schoolbook"/>
-          <w:b w:val="0"/>
-          <w:i w:val="0"/>
-          <w:color w:val="000000"/>
-          <w:sz w:val="24"/>
-        </w:rPr>
-        <w:t>Nunc feugiat mi a tellus consequat imperdiet. Vestibulum sapien. Proin quam. Etiam ultrices.</w:t>
-      </w:r>
-    </w:p>
-    <w:p>
-      <w:pPr>
-        <w:keepLines/>
-        <w:widowControl w:val="0"/>
-        <w:spacing w:before="288" w:after="0" w:line="240" w:lineRule="auto"/>
-        <w:ind w:left="0" w:right="0" w:firstLine="0"/>
-        <w:jc w:val="left"/>
-      </w:pPr>
-      <w:r>
-        <w:rPr>
-          <w:rFonts w:ascii="Century Schoolbook" w:hAnsi="Century Schoolbook" w:eastAsia="Century Schoolbook" w:cs="Century Schoolbook"/>
-          <w:b w:val="0"/>
-          <w:i w:val="0"/>
-          <w:color w:val="000000"/>
-          <w:sz w:val="24"/>
-        </w:rPr>
-        <w:t>Suspendisse in justo eu magna luctus suscipit. Sed lectus. Integer euismod lacus luctus magna.</w:t>
-      </w:r>
-      <w:r>
-        <w:br/>
-      </w:r>
-      <w:r>
-        <w:rPr>
-          <w:rFonts w:ascii="Century Schoolbook" w:hAnsi="Century Schoolbook" w:eastAsia="Century Schoolbook" w:cs="Century Schoolbook"/>
-          <w:b w:val="0"/>
-          <w:i w:val="0"/>
-          <w:color w:val="000000"/>
-          <w:sz w:val="24"/>
-        </w:rPr>
-        <w:t>Quisque cursus, metus vitae pharetra auctor, sem massa mattis sem, at interdum magna augue</w:t>
-      </w:r>
-      <w:r>
-        <w:br/>
-      </w:r>
-      <w:r>
-        <w:rPr>
-          <w:rFonts w:ascii="Century Schoolbook" w:hAnsi="Century Schoolbook" w:eastAsia="Century Schoolbook" w:cs="Century Schoolbook"/>
-          <w:b w:val="0"/>
-          <w:i w:val="0"/>
-          <w:color w:val="000000"/>
-          <w:sz w:val="24"/>
-        </w:rPr>
-        <w:t>eget diam. Vestibulum ante ipsum primis in faucibus orci luctus et ultrices posuere cubilia Curae;</w:t>
-      </w:r>
-      <w:r>
-        <w:br/>
-      </w:r>
-      <w:r>
-        <w:rPr>
-          <w:rFonts w:ascii="Century Schoolbook" w:hAnsi="Century Schoolbook" w:eastAsia="Century Schoolbook" w:cs="Century Schoolbook"/>
-          <w:b w:val="0"/>
-          <w:i w:val="0"/>
-          <w:color w:val="000000"/>
-          <w:sz w:val="24"/>
-        </w:rPr>
-        <w:t>Morbi lacinia molestie dui. Praesent blandit dolor. Sed non quam. In vel mi sit amet augue congue</w:t>
-      </w:r>
-      <w:r>
-        <w:br/>
-      </w:r>
-      <w:r>
-        <w:rPr>
-          <w:rFonts w:ascii="Century Schoolbook" w:hAnsi="Century Schoolbook" w:eastAsia="Century Schoolbook" w:cs="Century Schoolbook"/>
-          <w:b w:val="0"/>
-          <w:i w:val="0"/>
-          <w:color w:val="000000"/>
-          <w:sz w:val="24"/>
-        </w:rPr>
-        <w:t>elementum. Morbi in ipsum sit amet pede facilisis laoreet. Donec lacus nunc, viverra nec, blandit</w:t>
-      </w:r>
-      <w:r>
-        <w:br/>
-      </w:r>
-      <w:r>
-        <w:rPr>
-          <w:rFonts w:ascii="Century Schoolbook" w:hAnsi="Century Schoolbook" w:eastAsia="Century Schoolbook" w:cs="Century Schoolbook"/>
-          <w:b w:val="0"/>
-          <w:i w:val="0"/>
-          <w:color w:val="000000"/>
-          <w:sz w:val="24"/>
-        </w:rPr>
-        <w:t>vel, egestas et, augue. Vestibulum tincidunt malesuada tellus. Ut ultrices ultrices enim. Curabitur</w:t>
-      </w:r>
-      <w:r>
-        <w:br/>
-      </w:r>
-      <w:r>
-        <w:rPr>
-          <w:rFonts w:ascii="Century Schoolbook" w:hAnsi="Century Schoolbook" w:eastAsia="Century Schoolbook" w:cs="Century Schoolbook"/>
-          <w:b w:val="0"/>
-          <w:i w:val="0"/>
-          <w:color w:val="000000"/>
-          <w:sz w:val="24"/>
-        </w:rPr>
-        <w:t>sit amet mauris.</w:t>
-      </w:r>
-    </w:p>
-    <w:p>
-      <w:pPr>
-        <w:keepLines/>
-        <w:widowControl w:val="0"/>
-        <w:spacing w:before="288" w:after="0" w:line="240" w:lineRule="auto"/>
-        <w:ind w:left="0" w:right="0" w:firstLine="0"/>
-        <w:jc w:val="left"/>
-      </w:pPr>
-      <w:r>
-        <w:rPr>
-          <w:rFonts w:ascii="Century Schoolbook" w:hAnsi="Century Schoolbook" w:eastAsia="Century Schoolbook" w:cs="Century Schoolbook"/>
-          <w:b w:val="0"/>
-          <w:i w:val="0"/>
-          <w:color w:val="000000"/>
-          <w:sz w:val="24"/>
-        </w:rPr>
-        <w:t>Morbi in dui quis est pulvinar ullamcorper. Nulla facilisi. Integer lacinia sollicitudin massa. Cras</w:t>
-      </w:r>
-      <w:r>
-        <w:br/>
-      </w:r>
-      <w:r>
-        <w:rPr>
-          <w:rFonts w:ascii="Century Schoolbook" w:hAnsi="Century Schoolbook" w:eastAsia="Century Schoolbook" w:cs="Century Schoolbook"/>
-          <w:b w:val="0"/>
-          <w:i w:val="0"/>
-          <w:color w:val="000000"/>
-          <w:sz w:val="24"/>
-        </w:rPr>
-        <w:t>metus. Sed aliquet risus a tortor. Integer id quam. Morbi mi. Quisque nisl felis, venenatis tristique,</w:t>
-      </w:r>
-      <w:r>
-        <w:br/>
-      </w:r>
-      <w:r>
-        <w:rPr>
-          <w:rFonts w:ascii="Century Schoolbook" w:hAnsi="Century Schoolbook" w:eastAsia="Century Schoolbook" w:cs="Century Schoolbook"/>
-          <w:b w:val="0"/>
-          <w:i w:val="0"/>
-          <w:color w:val="000000"/>
-          <w:sz w:val="24"/>
-        </w:rPr>
-        <w:t>dignissim in, ultrices sit amet, augue. Proin sodales libero eget ante. Nulla quam. Aenean laoreet.</w:t>
-      </w:r>
-      <w:r>
-        <w:br/>
-      </w:r>
-      <w:r>
-        <w:rPr>
-          <w:rFonts w:ascii="Century Schoolbook" w:hAnsi="Century Schoolbook" w:eastAsia="Century Schoolbook" w:cs="Century Schoolbook"/>
-          <w:b w:val="0"/>
-          <w:i w:val="0"/>
-          <w:color w:val="000000"/>
-          <w:sz w:val="24"/>
-        </w:rPr>
-        <w:t>Vestibulum nisi lectus, commodo ac, facilisis ac, ultricies eu, pede. Ut orci risus, accumsan</w:t>
-      </w:r>
-      <w:r>
-        <w:br/>
-      </w:r>
-      <w:r>
-        <w:rPr>
-          <w:rFonts w:ascii="Century Schoolbook" w:hAnsi="Century Schoolbook" w:eastAsia="Century Schoolbook" w:cs="Century Schoolbook"/>
-          <w:b w:val="0"/>
-          <w:i w:val="0"/>
-          <w:color w:val="000000"/>
-          <w:sz w:val="24"/>
-        </w:rPr>
-        <w:t>porttitor, cursus quis, aliquet eget, justo. Sed pretium blandit orci.</w:t>
-      </w:r>
-    </w:p>
-    <w:p>
-      <w:pPr>
-        <w:keepLines/>
-        <w:widowControl w:val="0"/>
-        <w:spacing w:before="288" w:after="0" w:line="240" w:lineRule="auto"/>
-        <w:ind w:left="0" w:right="0" w:firstLine="0"/>
-        <w:jc w:val="left"/>
-      </w:pPr>
-      <w:r>
-        <w:rPr>
-          <w:rFonts w:ascii="Century Schoolbook" w:hAnsi="Century Schoolbook" w:eastAsia="Century Schoolbook" w:cs="Century Schoolbook"/>
-          <w:b w:val="0"/>
-          <w:i w:val="0"/>
-          <w:color w:val="000000"/>
-          <w:sz w:val="24"/>
-        </w:rPr>
-        <w:t>Ut eu diam at pede suscipit sodales. Aenean lectus elit, fermentum non, convallis id, sagittis at,</w:t>
-      </w:r>
-      <w:r>
-        <w:br/>
-      </w:r>
-      <w:r>
-        <w:rPr>
-          <w:rFonts w:ascii="Century Schoolbook" w:hAnsi="Century Schoolbook" w:eastAsia="Century Schoolbook" w:cs="Century Schoolbook"/>
-          <w:b w:val="0"/>
-          <w:i w:val="0"/>
-          <w:color w:val="000000"/>
-          <w:sz w:val="24"/>
-        </w:rPr>
-        <w:t>neque. Nullam mauris orci, aliquet et, iaculis et, viverra vitae, ligula. Nulla ut felis in purus</w:t>
-      </w:r>
-      <w:r>
-        <w:br/>
-      </w:r>
-      <w:r>
-        <w:rPr>
-          <w:rFonts w:ascii="Century Schoolbook" w:hAnsi="Century Schoolbook" w:eastAsia="Century Schoolbook" w:cs="Century Schoolbook"/>
-          <w:b w:val="0"/>
-          <w:i w:val="0"/>
-          <w:color w:val="000000"/>
-          <w:sz w:val="24"/>
-        </w:rPr>
-        <w:t>aliquam imperdiet. Maecenas aliquet mollis lectus. Vivamus consectetuer risus et tortor. Lorem</w:t>
-      </w:r>
-    </w:p>
-    <w:p>
-      <w:pPr>
-        <w:keepLines/>
-        <w:widowControl w:val="0"/>
-        <w:spacing w:before="262" w:after="0" w:line="240" w:lineRule="auto"/>
-        <w:ind w:left="5338" w:right="0" w:firstLine="0"/>
-        <w:jc w:val="center"/>
-      </w:pPr>
-      <w:r>
-        <w:rPr>
-          <w:rFonts w:ascii="Calibri" w:hAnsi="Calibri" w:eastAsia="Calibri" w:cs="Calibri"/>
-          <w:b w:val="0"/>
-          <w:i w:val="0"/>
-          <w:color w:val="000000"/>
-          <w:sz w:val="24"/>
-        </w:rPr>
-        <w:t>1</w:t>
-      </w:r>
-    </w:p>
-    <w:p>
-      <w:pPr>
-        <w:sectPr>
-          <w:pgSz w:w="12240" w:h="15840"/>
-          <w:pgMar w:top="972" w:right="720" w:bottom="720" w:left="723" w:header="0" w:footer="0" w:gutter="0"/>
-          <w:cols w:space="720"/>
-          <w:docGrid w:linePitch="360"/>
-        </w:sectPr>
-      </w:pPr>
     </w:p>
     <w:p>
       <w:pPr>
@@ -560,195 +216,71 @@
       </w:pPr>
       <w:r>
         <w:rPr>
-          <w:rFonts w:ascii="Century Schoolbook" w:hAnsi="Century Schoolbook" w:eastAsia="Century Schoolbook" w:cs="Century Schoolbook"/>
-          <w:b w:val="0"/>
-          <w:i w:val="0"/>
+          <w:rFonts w:ascii="Arial" w:hAnsi="Arial" w:eastAsia="Arial" w:cs="Arial"/>
+          <w:b/>
+          <w:i/>
           <w:color w:val="000000"/>
           <w:sz w:val="24"/>
         </w:rPr>
-        <w:t>ipsum dolor sit amet, consectetur adipiscing elit. Integer nec odio. Praesent libero. Sed cursus ante dapibus diam. Sed nisi. Nulla quis sem at nibh elementum imperdiet. Duis sagittis ipsum. Praesent mauris.</w:t>
+        <w:t>Sample Data File</w:t>
       </w:r>
     </w:p>
     <w:p>
       <w:pPr>
         <w:keepLines/>
         <w:widowControl w:val="0"/>
-        <w:spacing w:before="288" w:after="0" w:line="240" w:lineRule="auto"/>
-        <w:ind w:left="0" w:right="0" w:firstLine="0"/>
+        <w:spacing w:before="0" w:after="0" w:line="240" w:lineRule="auto"/>
+        <w:ind w:left="5004" w:right="0" w:firstLine="0"/>
         <w:jc w:val="left"/>
       </w:pPr>
       <w:r>
         <w:rPr>
-          <w:rFonts w:ascii="Century Schoolbook" w:hAnsi="Century Schoolbook" w:eastAsia="Century Schoolbook" w:cs="Century Schoolbook"/>
-          <w:b w:val="0"/>
-          <w:i w:val="0"/>
+          <w:rFonts w:ascii="Arial" w:hAnsi="Arial" w:eastAsia="Arial" w:cs="Arial"/>
+          <w:b/>
+          <w:i/>
           <w:color w:val="000000"/>
           <w:sz w:val="24"/>
         </w:rPr>
-        <w:t>Fusce nec tellus sed augue semper porta. Mauris massa. Vestibulum lacinia arcu eget nulla. Class aptent taciti sociosqu ad litora torquent per conubia nostra, per inceptos himenaeos. Curabitur sodales ligula in libero. Sed dignissim lacinia nunc. Curabitur tortor. Pellentesque nibh. Aenean quam. In scelerisque sem at dolor. Maecenas mattis. Sed convallis tristique sem.</w:t>
+        <w:t>Sample Bookmark File</w:t>
       </w:r>
     </w:p>
     <w:p>
       <w:pPr>
         <w:keepLines/>
         <w:widowControl w:val="0"/>
-        <w:spacing w:before="288" w:after="0" w:line="240" w:lineRule="auto"/>
+        <w:spacing w:before="73" w:after="0" w:line="240" w:lineRule="auto"/>
         <w:ind w:left="0" w:right="0" w:firstLine="0"/>
         <w:jc w:val="left"/>
       </w:pPr>
       <w:r>
         <w:rPr>
-          <w:rFonts w:ascii="Century Schoolbook" w:hAnsi="Century Schoolbook" w:eastAsia="Century Schoolbook" w:cs="Century Schoolbook"/>
+          <w:rFonts w:ascii="Courier" w:hAnsi="Courier" w:eastAsia="Courier" w:cs="Courier"/>
           <w:b w:val="0"/>
           <w:i w:val="0"/>
           <w:color w:val="000000"/>
-          <w:sz w:val="24"/>
+          <w:sz w:val="20"/>
         </w:rPr>
-        <w:t>Proin ut ligula vel nunc egestas porttitor. Morbi lectus risus, iaculis vel, suscipit quis, luctus non, massa. Fusce ac turpis quis ligula lacinia aliquet. Mauris ipsum. Nulla metus metus, ullamcorper vel, tincidunt sed, euismod in, nibh. Quisque volutpat condimentum velit. Class aptent taciti sociosqu ad litora torquent per conubia nostra, per inceptos himenaeos. Nam nec ante. Sed lacinia, urna non tincidunt mattis, tortor neque adipiscing diam, a cursus ipsum ante quis turpis. Nulla facilisi. Ut fringilla. Suspendisse potenti.</w:t>
+        <w:t>^reformat trunc</w:t>
       </w:r>
     </w:p>
     <w:p>
       <w:pPr>
         <w:keepLines/>
         <w:widowControl w:val="0"/>
-        <w:spacing w:before="288" w:after="0" w:line="240" w:lineRule="auto"/>
-        <w:ind w:left="0" w:right="0" w:firstLine="0"/>
+        <w:spacing w:before="0" w:after="0" w:line="240" w:lineRule="auto"/>
+        <w:ind w:left="5004" w:right="0" w:firstLine="0"/>
         <w:jc w:val="left"/>
       </w:pPr>
       <w:r>
         <w:rPr>
-          <w:rFonts w:ascii="Century Schoolbook" w:hAnsi="Century Schoolbook" w:eastAsia="Century Schoolbook" w:cs="Century Schoolbook"/>
+          <w:rFonts w:ascii="Courier" w:hAnsi="Courier" w:eastAsia="Courier" w:cs="Courier"/>
           <w:b w:val="0"/>
           <w:i w:val="0"/>
           <w:color w:val="000000"/>
-          <w:sz w:val="24"/>
+          <w:sz w:val="20"/>
         </w:rPr>
-        <w:t>Nunc feugiat mi a tellus consequat imperdiet. Vestibulum sapien. Proin quam. Etiam ultrices. Suspendisse in justo eu magna luctus suscipit. Sed lectus. Integer euismod lacus luctus magna. Quisque cursus, metus vitae pharetra auctor, sem massa mattis sem, at interdum magna augue eget diam. Vestibulum ante ipsum primis in faucibus orci luctus et ultrices posuere cubilia Curae; Morbi lacinia molestie dui. Praesent blandit dolor. Sed non quam. In vel mi sit amet augue congue elementum. Morbi in ipsum sit amet pede facilisis laoreet.</w:t>
+        <w:t>[invoices]</w:t>
       </w:r>
-    </w:p>
-    <w:p>
-      <w:pPr>
-        <w:keepLines/>
-        <w:widowControl w:val="0"/>
-        <w:spacing w:before="288" w:after="0" w:line="240" w:lineRule="auto"/>
-        <w:ind w:left="0" w:right="0" w:firstLine="0"/>
-        <w:jc w:val="left"/>
-      </w:pPr>
-      <w:r>
-        <w:rPr>
-          <w:rFonts w:ascii="Century Schoolbook" w:hAnsi="Century Schoolbook" w:eastAsia="Century Schoolbook" w:cs="Century Schoolbook"/>
-          <w:b w:val="0"/>
-          <w:i w:val="0"/>
-          <w:color w:val="000000"/>
-          <w:sz w:val="24"/>
-        </w:rPr>
-        <w:t>Donec lacus nunc, viverra nec, blandit vel, egestas et, augue. Vestibulum tincidunt malesuada tellus. Ut ultrices ultrices enim. Curabitur sit amet mauris. Morbi in dui quis est pulvinar ullamcorper. Nulla facilisi. Integer lacinia sollicitudin massa. Cras metus. Sed aliquet risus a tortor. Integer id quam. Morbi mi.</w:t>
-      </w:r>
-    </w:p>
-    <w:p>
-      <w:pPr>
-        <w:keepLines/>
-        <w:widowControl w:val="0"/>
-        <w:spacing w:before="288" w:after="0" w:line="240" w:lineRule="auto"/>
-        <w:ind w:left="0" w:right="0" w:firstLine="0"/>
-        <w:jc w:val="left"/>
-      </w:pPr>
-      <w:r>
-        <w:rPr>
-          <w:rFonts w:ascii="Century Schoolbook" w:hAnsi="Century Schoolbook" w:eastAsia="Century Schoolbook" w:cs="Century Schoolbook"/>
-          <w:b w:val="0"/>
-          <w:i w:val="0"/>
-          <w:color w:val="000000"/>
-          <w:sz w:val="24"/>
-        </w:rPr>
-        <w:t>Lorem ipsum dolor sit amet, consectetur adipiscing elit. Integer nec odio. Praesent libero. Sed cursus ante dapibus diam. Sed nisi. Nulla quis sem at nibh elementum imperdiet. Duis sagittis ipsum. Praesent mauris. Fusce nec tellus sed augue semper porta. Mauris massa. Vestibulum lacinia arcu eget nulla. Class aptent taciti sociosqu ad litora torquent per conubia nostra, per inceptos himenaeos. Curabitur sodales ligula in libero.</w:t>
-      </w:r>
-    </w:p>
-    <w:p>
-      <w:pPr>
-        <w:keepLines/>
-        <w:widowControl w:val="0"/>
-        <w:spacing w:before="292" w:after="0" w:line="240" w:lineRule="auto"/>
-        <w:ind w:left="0" w:right="0" w:firstLine="0"/>
-        <w:jc w:val="left"/>
-      </w:pPr>
-      <w:r>
-        <w:rPr>
-          <w:rFonts w:ascii="Century Schoolbook" w:hAnsi="Century Schoolbook" w:eastAsia="Century Schoolbook" w:cs="Century Schoolbook"/>
-          <w:b w:val="0"/>
-          <w:i w:val="0"/>
-          <w:color w:val="000000"/>
-          <w:sz w:val="24"/>
-        </w:rPr>
-        <w:t>Sed dignissim lacinia nunc. Curabitur tortor. Pellentesque nibh. Aenean quam. In scelerisque sem at dolor. Maecenas mattis. Sed convallis tristique sem. Proin ut ligula vel nunc egestas porttitor. Morbi lectus risus, iaculis vel, suscipit quis, luctus non, massa. Fusce ac turpis quis ligula lacinia aliquet. Mauris ipsum. Nulla metus metus, ullamcorper vel, tincidunt sed, euismod in, nibh.</w:t>
-      </w:r>
-    </w:p>
-    <w:p>
-      <w:pPr>
-        <w:keepLines/>
-        <w:widowControl w:val="0"/>
-        <w:spacing w:before="288" w:after="0" w:line="240" w:lineRule="auto"/>
-        <w:ind w:left="0" w:right="0" w:firstLine="0"/>
-        <w:jc w:val="left"/>
-      </w:pPr>
-      <w:r>
-        <w:rPr>
-          <w:rFonts w:ascii="Century Schoolbook" w:hAnsi="Century Schoolbook" w:eastAsia="Century Schoolbook" w:cs="Century Schoolbook"/>
-          <w:b w:val="0"/>
-          <w:i w:val="0"/>
-          <w:color w:val="000000"/>
-          <w:sz w:val="24"/>
-        </w:rPr>
-        <w:t>Quisque volutpat condimentum velit. Class aptent taciti sociosqu ad litora torquent per conubia nostra, per inceptos himenaeos. Nam nec ante. Sed lacinia, urna non tincidunt mattis, tortor neque adipiscing diam, a cursus ipsum ante quis turpis. Nulla facilisi. Ut fringilla. Suspendisse potenti. Nunc feugiat mi a tellus consequat imperdiet. Vestibulum sapien. Proin quam. Etiam ultrices.</w:t>
-      </w:r>
-    </w:p>
-    <w:p>
-      <w:pPr>
-        <w:keepLines/>
-        <w:widowControl w:val="0"/>
-        <w:spacing w:before="288" w:after="0" w:line="240" w:lineRule="auto"/>
-        <w:ind w:left="0" w:right="0" w:firstLine="0"/>
-        <w:jc w:val="left"/>
-      </w:pPr>
-      <w:r>
-        <w:rPr>
-          <w:rFonts w:ascii="Century Schoolbook" w:hAnsi="Century Schoolbook" w:eastAsia="Century Schoolbook" w:cs="Century Schoolbook"/>
-          <w:b w:val="0"/>
-          <w:i w:val="0"/>
-          <w:color w:val="000000"/>
-          <w:sz w:val="24"/>
-        </w:rPr>
-        <w:t>Suspendisse in justo eu magna luctus suscipit. Sed lectus. Integer euismod lacus luctus magna. Quisque cursus, metus vitae pharetra auctor, sem massa mattis sem, at interdum magna augue eget diam. Vestibulum ante ipsum primis in faucibus orci luctus et ultrices posuere cubilia Curae; Morbi lacinia molestie dui. Praesent blandit dolor. Sed non quam. In vel mi sit amet augue congue</w:t>
-      </w:r>
-    </w:p>
-    <w:p>
-      <w:pPr>
-        <w:keepLines/>
-        <w:widowControl w:val="0"/>
-        <w:spacing w:before="262" w:after="0" w:line="240" w:lineRule="auto"/>
-        <w:ind w:left="5338" w:right="0" w:firstLine="0"/>
-        <w:jc w:val="center"/>
-      </w:pPr>
-      <w:r>
-        <w:rPr>
-          <w:rFonts w:ascii="Calibri" w:hAnsi="Calibri" w:eastAsia="Calibri" w:cs="Calibri"/>
-          <w:b w:val="0"/>
-          <w:i w:val="0"/>
-          <w:color w:val="000000"/>
-          <w:sz w:val="24"/>
-        </w:rPr>
-        <w:t>2</w:t>
-      </w:r>
-    </w:p>
-    <w:p>
-      <w:pPr>
-        <w:sectPr>
-          <w:pgSz w:w="12240" w:h="15840"/>
-          <w:pgMar w:top="730" w:right="720" w:bottom="720" w:left="723" w:header="0" w:footer="0" w:gutter="0"/>
-          <w:cols w:space="720"/>
-          <w:docGrid w:linePitch="360"/>
-        </w:sectPr>
-      </w:pPr>
     </w:p>
     <w:p>
       <w:pPr>
@@ -760,108 +292,479 @@
       </w:pPr>
       <w:r>
         <w:rPr>
-          <w:rFonts w:ascii="Century Schoolbook" w:hAnsi="Century Schoolbook" w:eastAsia="Century Schoolbook" w:cs="Century Schoolbook"/>
+          <w:rFonts w:ascii="Courier" w:hAnsi="Courier" w:eastAsia="Courier" w:cs="Courier"/>
           <w:b w:val="0"/>
           <w:i w:val="0"/>
           <w:color w:val="000000"/>
-          <w:sz w:val="24"/>
+          <w:sz w:val="20"/>
         </w:rPr>
-        <w:t>elementum. Morbi in ipsum sit amet pede facilisis laoreet. Donec lacus nunc, viverra nec, blandit vel, egestas et, augue. Vestibulum tincidunt malesuada tellus. Ut ultrices ultrices enim. Curabitur sit amet mauris.</w:t>
+        <w:t>^symbolset WINLATIN1</w:t>
       </w:r>
     </w:p>
     <w:p>
       <w:pPr>
         <w:keepLines/>
         <w:widowControl w:val="0"/>
-        <w:spacing w:before="288" w:after="0" w:line="240" w:lineRule="auto"/>
-        <w:ind w:left="0" w:right="0" w:firstLine="0"/>
+        <w:spacing w:before="0" w:after="0" w:line="240" w:lineRule="auto"/>
+        <w:ind w:left="5004" w:right="0" w:firstLine="0"/>
         <w:jc w:val="left"/>
       </w:pPr>
       <w:r>
         <w:rPr>
-          <w:rFonts w:ascii="Century Schoolbook" w:hAnsi="Century Schoolbook" w:eastAsia="Century Schoolbook" w:cs="Century Schoolbook"/>
+          <w:rFonts w:ascii="Courier" w:hAnsi="Courier" w:eastAsia="Courier" w:cs="Courier"/>
           <w:b w:val="0"/>
           <w:i w:val="0"/>
           <w:color w:val="000000"/>
-          <w:sz w:val="24"/>
+          <w:sz w:val="20"/>
         </w:rPr>
-        <w:t>Morbi in dui quis est pulvinar ullamcorper. Nulla facilisi. Integer lacinia sollicitudin massa. Cras metus. Sed aliquet risus a tortor. Integer id quam. Morbi mi. Quisque nisl felis, venenatis tristique, dignissim in, ultrices sit amet, augue. Proin sodales libero eget ante. Nulla quam. Aenean laoreet. Vestibulum nisi lectus, commodo ac, facilisis ac, ultricies eu, pede. Ut orci risus, accumsan porttitor, cursus quis, aliquet eget, justo. Sed pretium blandit orci.</w:t>
+        <w:t>Invoices by Date=0</w:t>
       </w:r>
     </w:p>
     <w:p>
       <w:pPr>
         <w:keepLines/>
         <w:widowControl w:val="0"/>
-        <w:spacing w:before="288" w:after="0" w:line="240" w:lineRule="auto"/>
+        <w:spacing w:before="0" w:after="0" w:line="240" w:lineRule="auto"/>
         <w:ind w:left="0" w:right="0" w:firstLine="0"/>
         <w:jc w:val="left"/>
       </w:pPr>
       <w:r>
         <w:rPr>
-          <w:rFonts w:ascii="Century Schoolbook" w:hAnsi="Century Schoolbook" w:eastAsia="Century Schoolbook" w:cs="Century Schoolbook"/>
+          <w:rFonts w:ascii="Courier" w:hAnsi="Courier" w:eastAsia="Courier" w:cs="Courier"/>
           <w:b w:val="0"/>
           <w:i w:val="0"/>
           <w:color w:val="000000"/>
-          <w:sz w:val="24"/>
+          <w:sz w:val="20"/>
         </w:rPr>
-        <w:t>Ut eu diam at pede suscipit sodales. Aenean lectus elit, fermentum non, convallis id, sagittis at, neque. Nullam mauris orci, aliquet et, iaculis et, viverra vitae, ligula. Nulla ut felis in purus aliquam imperdiet. Maecenas aliquet mollis lectus. Vivamus consectetuer risus et tortor. Lorem ipsum dolor sit amet, consectetur adipiscing elit. Integer nec odio. Praesent libero. Sed cursus ante dapibus diam. Sed nisi. Nulla quis sem at nibh elementum imperdiet. Duis sagittis ipsum. Praesent mauris.</w:t>
+        <w:t>^field trans_date</w:t>
       </w:r>
     </w:p>
     <w:p>
       <w:pPr>
         <w:keepLines/>
         <w:widowControl w:val="0"/>
-        <w:spacing w:before="288" w:after="0" w:line="240" w:lineRule="auto"/>
-        <w:ind w:left="0" w:right="0" w:firstLine="0"/>
+        <w:spacing w:before="0" w:after="0" w:line="240" w:lineRule="auto"/>
+        <w:ind w:left="5004" w:right="0" w:firstLine="0"/>
         <w:jc w:val="left"/>
       </w:pPr>
       <w:r>
         <w:rPr>
-          <w:rFonts w:ascii="Century Schoolbook" w:hAnsi="Century Schoolbook" w:eastAsia="Century Schoolbook" w:cs="Century Schoolbook"/>
+          <w:rFonts w:ascii="Courier" w:hAnsi="Courier" w:eastAsia="Courier" w:cs="Courier"/>
           <w:b w:val="0"/>
           <w:i w:val="0"/>
           <w:color w:val="000000"/>
-          <w:sz w:val="24"/>
+          <w:sz w:val="20"/>
         </w:rPr>
-        <w:t>Fusce nec tellus sed augue semper porta. Mauris massa. Vestibulum lacinia arcu eget nulla. Class aptent taciti sociosqu ad litora torquent per conubia nostra, per inceptos himenaeos. Curabitur sodales ligula in libero. Sed dignissim lacinia nunc. Curabitur tortor. Pellentesque nibh. Aenean quam. In scelerisque sem at dolor. Maecenas mattis. Sed convallis tristique sem.</w:t>
+        <w:t>trans_date=1,A</w:t>
       </w:r>
     </w:p>
     <w:p>
       <w:pPr>
         <w:keepLines/>
         <w:widowControl w:val="0"/>
-        <w:spacing w:before="288" w:after="0" w:line="240" w:lineRule="auto"/>
+        <w:spacing w:before="0" w:after="0" w:line="240" w:lineRule="auto"/>
         <w:ind w:left="0" w:right="0" w:firstLine="0"/>
         <w:jc w:val="left"/>
       </w:pPr>
       <w:r>
         <w:rPr>
-          <w:rFonts w:ascii="Century Schoolbook" w:hAnsi="Century Schoolbook" w:eastAsia="Century Schoolbook" w:cs="Century Schoolbook"/>
+          <w:rFonts w:ascii="Courier" w:hAnsi="Courier" w:eastAsia="Courier" w:cs="Courier"/>
           <w:b w:val="0"/>
           <w:i w:val="0"/>
           <w:color w:val="000000"/>
-          <w:sz w:val="24"/>
+          <w:sz w:val="20"/>
         </w:rPr>
-        <w:t>Proin ut ligula vel nunc egestas porttitor. Morbi lectus risus, iaculis vel, suscipit quis, luctus non, massa. Fusce ac turpis quis ligula lacinia aliquet. Mauris ipsum. Nulla metus metus, ullamcorper vel, tincidunt sed, euismod in, nibh. Quisque volutpat condimentum velit. Class aptent taciti sociosqu ad litora torquent per conubia nostra, per inceptos himenaeos. Nam nec ante. Sed lacinia, urna non tincidunt mattis, tortor neque adipiscing diam, a cursus ipsum ante quis turpis. Nulla facilisi. Ut fringilla. Suspendisse potenti.</w:t>
+        <w:t>2000-01-1</w:t>
       </w:r>
     </w:p>
     <w:p>
       <w:pPr>
         <w:keepLines/>
         <w:widowControl w:val="0"/>
-        <w:spacing w:before="288" w:after="0" w:line="240" w:lineRule="auto"/>
+        <w:spacing w:before="0" w:after="0" w:line="240" w:lineRule="auto"/>
+        <w:ind w:left="5004" w:right="0" w:firstLine="0"/>
+        <w:jc w:val="left"/>
+      </w:pPr>
+      <w:r>
+        <w:rPr>
+          <w:rFonts w:ascii="Courier" w:hAnsi="Courier" w:eastAsia="Courier" w:cs="Courier"/>
+          <w:b w:val="0"/>
+          <w:i w:val="0"/>
+          <w:color w:val="000000"/>
+          <w:sz w:val="20"/>
+        </w:rPr>
+        <w:t>[type]</w:t>
+      </w:r>
+    </w:p>
+    <w:p>
+      <w:pPr>
+        <w:keepLines/>
+        <w:widowControl w:val="0"/>
+        <w:spacing w:before="0" w:after="0" w:line="240" w:lineRule="auto"/>
         <w:ind w:left="0" w:right="0" w:firstLine="0"/>
         <w:jc w:val="left"/>
       </w:pPr>
       <w:r>
         <w:rPr>
-          <w:rFonts w:ascii="Century Schoolbook" w:hAnsi="Century Schoolbook" w:eastAsia="Century Schoolbook" w:cs="Century Schoolbook"/>
+          <w:rFonts w:ascii="Courier" w:hAnsi="Courier" w:eastAsia="Courier" w:cs="Courier"/>
           <w:b w:val="0"/>
           <w:i w:val="0"/>
           <w:color w:val="000000"/>
-          <w:sz w:val="24"/>
+          <w:sz w:val="20"/>
         </w:rPr>
-        <w:t>Nunc feugiat mi a tellus consequat imperdiet. Vestibulum sapien. Proin quam. Etiam ultrices. Suspendisse in justo eu magna luctus suscipit. Sed lectus. Integer euismod lacus luctus magna. Quisque cursus, metus vitae pharetra auctor, sem massa mattis sem, at interdum magna augue eget diam. Vestibulum ante ipsum primis in faucibus orci luctus et ultrices posuere cubilia Curae; Morbi lacinia molestie dui. Praesent blandit dolor. Sed non quam. In vel mi sit amet augue congue elementum. Morbi in ipsum sit amet pede facilisis laoreet.</w:t>
+        <w:t>^field description</w:t>
+      </w:r>
+    </w:p>
+    <w:p>
+      <w:pPr>
+        <w:keepLines/>
+        <w:widowControl w:val="0"/>
+        <w:spacing w:before="0" w:after="0" w:line="240" w:lineRule="auto"/>
+        <w:ind w:left="5004" w:right="0" w:firstLine="0"/>
+        <w:jc w:val="left"/>
+      </w:pPr>
+      <w:r>
+        <w:rPr>
+          <w:rFonts w:ascii="Courier" w:hAnsi="Courier" w:eastAsia="Courier" w:cs="Courier"/>
+          <w:b w:val="0"/>
+          <w:i w:val="0"/>
+          <w:color w:val="000000"/>
+          <w:sz w:val="20"/>
+        </w:rPr>
+        <w:t>Invoices by Item Type=0</w:t>
+      </w:r>
+    </w:p>
+    <w:p>
+      <w:pPr>
+        <w:keepLines/>
+        <w:widowControl w:val="0"/>
+        <w:spacing w:before="0" w:after="0" w:line="240" w:lineRule="auto"/>
+        <w:ind w:left="0" w:right="0" w:firstLine="0"/>
+        <w:jc w:val="left"/>
+      </w:pPr>
+      <w:r>
+        <w:rPr>
+          <w:rFonts w:ascii="Courier" w:hAnsi="Courier" w:eastAsia="Courier" w:cs="Courier"/>
+          <w:b w:val="0"/>
+          <w:i w:val="0"/>
+          <w:color w:val="000000"/>
+          <w:sz w:val="20"/>
+        </w:rPr>
+        <w:t>Description for item #1</w:t>
+      </w:r>
+    </w:p>
+    <w:p>
+      <w:pPr>
+        <w:keepLines/>
+        <w:widowControl w:val="0"/>
+        <w:spacing w:before="0" w:after="0" w:line="240" w:lineRule="auto"/>
+        <w:ind w:left="5004" w:right="0" w:firstLine="0"/>
+        <w:jc w:val="left"/>
+      </w:pPr>
+      <w:r>
+        <w:rPr>
+          <w:rFonts w:ascii="Courier" w:hAnsi="Courier" w:eastAsia="Courier" w:cs="Courier"/>
+          <w:b w:val="0"/>
+          <w:i w:val="0"/>
+          <w:color w:val="000000"/>
+          <w:sz w:val="20"/>
+        </w:rPr>
+        <w:t>trans_type=1,A</w:t>
+      </w:r>
+    </w:p>
+    <w:p>
+      <w:pPr>
+        <w:keepLines/>
+        <w:widowControl w:val="0"/>
+        <w:spacing w:before="0" w:after="0" w:line="240" w:lineRule="auto"/>
+        <w:ind w:left="0" w:right="0" w:firstLine="0"/>
+        <w:jc w:val="left"/>
+      </w:pPr>
+      <w:r>
+        <w:rPr>
+          <w:rFonts w:ascii="Courier" w:hAnsi="Courier" w:eastAsia="Courier" w:cs="Courier"/>
+          <w:b w:val="0"/>
+          <w:i w:val="0"/>
+          <w:color w:val="000000"/>
+          <w:sz w:val="20"/>
+        </w:rPr>
+        <w:t>^field trans_type</w:t>
+      </w:r>
+    </w:p>
+    <w:p>
+      <w:pPr>
+        <w:keepLines/>
+        <w:widowControl w:val="0"/>
+        <w:spacing w:before="0" w:after="0" w:line="240" w:lineRule="auto"/>
+        <w:ind w:left="5004" w:right="0" w:firstLine="0"/>
+        <w:jc w:val="left"/>
+      </w:pPr>
+      <w:r>
+        <w:rPr>
+          <w:rFonts w:ascii="Courier" w:hAnsi="Courier" w:eastAsia="Courier" w:cs="Courier"/>
+          <w:b w:val="0"/>
+          <w:i w:val="0"/>
+          <w:color w:val="000000"/>
+          <w:sz w:val="20"/>
+        </w:rPr>
+        <w:t>[amount]</w:t>
+      </w:r>
+    </w:p>
+    <w:p>
+      <w:pPr>
+        <w:keepLines/>
+        <w:widowControl w:val="0"/>
+        <w:spacing w:before="0" w:after="0" w:line="240" w:lineRule="auto"/>
+        <w:ind w:left="0" w:right="0" w:firstLine="0"/>
+        <w:jc w:val="left"/>
+      </w:pPr>
+      <w:r>
+        <w:rPr>
+          <w:rFonts w:ascii="Courier" w:hAnsi="Courier" w:eastAsia="Courier" w:cs="Courier"/>
+          <w:b w:val="0"/>
+          <w:i w:val="0"/>
+          <w:color w:val="000000"/>
+          <w:sz w:val="20"/>
+        </w:rPr>
+        <w:t>TYPE1</w:t>
+      </w:r>
+    </w:p>
+    <w:p>
+      <w:pPr>
+        <w:keepLines/>
+        <w:widowControl w:val="0"/>
+        <w:spacing w:before="0" w:after="0" w:line="240" w:lineRule="auto"/>
+        <w:ind w:left="0" w:right="0" w:firstLine="0"/>
+        <w:jc w:val="right"/>
+      </w:pPr>
+      <w:r>
+        <w:rPr>
+          <w:rFonts w:ascii="Courier" w:hAnsi="Courier" w:eastAsia="Courier" w:cs="Courier"/>
+          <w:b w:val="0"/>
+          <w:i w:val="0"/>
+          <w:color w:val="000000"/>
+          <w:sz w:val="20"/>
+        </w:rPr>
+        <w:t>Invoices by Transaction Amount=0</w:t>
+      </w:r>
+    </w:p>
+    <w:p>
+      <w:pPr>
+        <w:keepLines/>
+        <w:widowControl w:val="0"/>
+        <w:spacing w:before="0" w:after="0" w:line="240" w:lineRule="auto"/>
+        <w:ind w:left="0" w:right="0" w:firstLine="0"/>
+        <w:jc w:val="left"/>
+      </w:pPr>
+      <w:r>
+        <w:rPr>
+          <w:rFonts w:ascii="Courier" w:hAnsi="Courier" w:eastAsia="Courier" w:cs="Courier"/>
+          <w:b w:val="0"/>
+          <w:i w:val="0"/>
+          <w:color w:val="000000"/>
+          <w:sz w:val="20"/>
+        </w:rPr>
+        <w:t>^field trans_amount</w:t>
+      </w:r>
+    </w:p>
+    <w:p>
+      <w:pPr>
+        <w:keepLines/>
+        <w:widowControl w:val="0"/>
+        <w:spacing w:before="0" w:after="0" w:line="240" w:lineRule="auto"/>
+        <w:ind w:left="5004" w:right="0" w:firstLine="0"/>
+        <w:jc w:val="left"/>
+      </w:pPr>
+      <w:r>
+        <w:rPr>
+          <w:rFonts w:ascii="Courier" w:hAnsi="Courier" w:eastAsia="Courier" w:cs="Courier"/>
+          <w:b w:val="0"/>
+          <w:i w:val="0"/>
+          <w:color w:val="000000"/>
+          <w:sz w:val="20"/>
+        </w:rPr>
+        <w:t>trans_amount=1,D</w:t>
+      </w:r>
+    </w:p>
+    <w:p>
+      <w:pPr>
+        <w:keepLines/>
+        <w:widowControl w:val="0"/>
+        <w:spacing w:before="0" w:after="0" w:line="240" w:lineRule="auto"/>
+        <w:ind w:left="0" w:right="0" w:firstLine="0"/>
+        <w:jc w:val="left"/>
+      </w:pPr>
+      <w:r>
+        <w:rPr>
+          <w:rFonts w:ascii="Courier" w:hAnsi="Courier" w:eastAsia="Courier" w:cs="Courier"/>
+          <w:b w:val="0"/>
+          <w:i w:val="0"/>
+          <w:color w:val="000000"/>
+          <w:sz w:val="20"/>
+        </w:rPr>
+        <w:t>11.00 ^page 1 ^field trans_date 2000-01-2 ^field description Description for item #2 ^field trans_type TYPE2 ^field trans_amount 11.00 ^page 1 ^field trans_date 2000-01-3 ^field description Description for item #3 ^field trans_type TYPE3</w:t>
+      </w:r>
+    </w:p>
+    <w:p>
+      <w:pPr>
+        <w:keepLines/>
+        <w:widowControl w:val="0"/>
+        <w:spacing w:before="155" w:after="0" w:line="240" w:lineRule="auto"/>
+        <w:ind w:left="0" w:right="0" w:firstLine="0"/>
+        <w:jc w:val="left"/>
+      </w:pPr>
+      <w:r>
+        <w:rPr>
+          <w:rFonts w:ascii="Arial" w:hAnsi="Arial" w:eastAsia="Arial" w:cs="Arial"/>
+          <w:b w:val="0"/>
+          <w:i w:val="0"/>
+          <w:color w:val="000000"/>
+          <w:sz w:val="22"/>
+        </w:rPr>
+        <w:t>The example bookmark file includes three distinct sections:</w:t>
+      </w:r>
+    </w:p>
+    <w:p>
+      <w:pPr>
+        <w:numPr>
+          <w:ilvl w:val="0"/>
+          <w:numId w:val="10"/>
+        </w:numPr>
+        <w:keepLines/>
+        <w:widowControl w:val="0"/>
+        <w:tabs>
+          <w:tab w:pos="240" w:val="left"/>
+        </w:tabs>
+        <w:spacing w:before="165" w:after="0" w:line="240" w:lineRule="auto"/>
+        <w:ind w:left="240" w:right="0" w:hanging="240"/>
+        <w:jc w:val="left"/>
+      </w:pPr>
+    </w:p>
+    <w:p>
+      <w:pPr>
+        <w:keepLines/>
+        <w:widowControl w:val="0"/>
+        <w:spacing w:before="0" w:after="0" w:line="240" w:lineRule="auto"/>
+        <w:ind w:left="360" w:right="0" w:firstLine="0"/>
+        <w:jc w:val="left"/>
+      </w:pPr>
+      <w:r>
+        <w:rPr>
+          <w:rFonts w:ascii="Arial" w:hAnsi="Arial" w:eastAsia="Arial" w:cs="Arial"/>
+          <w:b w:val="0"/>
+          <w:i w:val="0"/>
+          <w:color w:val="000000"/>
+          <w:sz w:val="22"/>
+        </w:rPr>
+        <w:t>Invoices sorted, ascending, by date.</w:t>
+      </w:r>
+    </w:p>
+    <w:p>
+      <w:pPr>
+        <w:numPr>
+          <w:ilvl w:val="0"/>
+          <w:numId w:val="11"/>
+        </w:numPr>
+        <w:keepLines/>
+        <w:widowControl w:val="0"/>
+        <w:tabs>
+          <w:tab w:pos="240" w:val="left"/>
+        </w:tabs>
+        <w:spacing w:before="165" w:after="0" w:line="240" w:lineRule="auto"/>
+        <w:ind w:left="240" w:right="0" w:hanging="240"/>
+        <w:jc w:val="left"/>
+      </w:pPr>
+    </w:p>
+    <w:p>
+      <w:pPr>
+        <w:keepLines/>
+        <w:widowControl w:val="0"/>
+        <w:spacing w:before="0" w:after="0" w:line="240" w:lineRule="auto"/>
+        <w:ind w:left="360" w:right="0" w:firstLine="0"/>
+        <w:jc w:val="left"/>
+      </w:pPr>
+      <w:r>
+        <w:rPr>
+          <w:rFonts w:ascii="Arial" w:hAnsi="Arial" w:eastAsia="Arial" w:cs="Arial"/>
+          <w:b w:val="0"/>
+          <w:i w:val="0"/>
+          <w:color w:val="000000"/>
+          <w:sz w:val="22"/>
+        </w:rPr>
+        <w:t>Invoices sorted, ascending, by item type.</w:t>
+      </w:r>
+    </w:p>
+    <w:p>
+      <w:pPr>
+        <w:numPr>
+          <w:ilvl w:val="0"/>
+          <w:numId w:val="12"/>
+        </w:numPr>
+        <w:keepLines/>
+        <w:widowControl w:val="0"/>
+        <w:tabs>
+          <w:tab w:pos="240" w:val="left"/>
+        </w:tabs>
+        <w:spacing w:before="165" w:after="0" w:line="240" w:lineRule="auto"/>
+        <w:ind w:left="240" w:right="0" w:hanging="240"/>
+        <w:jc w:val="left"/>
+      </w:pPr>
+    </w:p>
+    <w:p>
+      <w:pPr>
+        <w:keepLines/>
+        <w:widowControl w:val="0"/>
+        <w:spacing w:before="0" w:after="0" w:line="240" w:lineRule="auto"/>
+        <w:ind w:left="360" w:right="0" w:firstLine="0"/>
+        <w:jc w:val="left"/>
+      </w:pPr>
+      <w:r>
+        <w:rPr>
+          <w:rFonts w:ascii="Arial" w:hAnsi="Arial" w:eastAsia="Arial" w:cs="Arial"/>
+          <w:b w:val="0"/>
+          <w:i w:val="0"/>
+          <w:color w:val="000000"/>
+          <w:sz w:val="22"/>
+        </w:rPr>
+        <w:t>Invoices sorted, descending, by transaction amount.</w:t>
+      </w:r>
+    </w:p>
+    <w:p>
+      <w:pPr>
+        <w:keepLines/>
+        <w:widowControl w:val="0"/>
+        <w:spacing w:before="0" w:after="0" w:line="240" w:lineRule="auto"/>
+        <w:ind w:left="0" w:right="0" w:firstLine="0"/>
+        <w:jc w:val="left"/>
+      </w:pPr>
+      <w:r>
+        <w:rPr>
+          <w:rFonts w:ascii="Arial" w:hAnsi="Arial" w:eastAsia="Arial" w:cs="Arial"/>
+          <w:b/>
+          <w:i w:val="0"/>
+          <w:color w:val="808080"/>
+          <w:sz w:val="28"/>
+        </w:rPr>
+        <w:t>Sample Files</w:t>
+      </w:r>
+    </w:p>
+    <w:p>
+      <w:pPr>
+        <w:keepLines/>
+        <w:widowControl w:val="0"/>
+        <w:spacing w:before="127" w:after="0" w:line="240" w:lineRule="auto"/>
+        <w:ind w:left="0" w:right="0" w:firstLine="0"/>
+        <w:jc w:val="left"/>
+      </w:pPr>
+      <w:r>
+        <w:rPr>
+          <w:rFonts w:ascii="Arial" w:hAnsi="Arial" w:eastAsia="Arial" w:cs="Arial"/>
+          <w:b w:val="0"/>
+          <w:i w:val="0"/>
+          <w:color w:val="000000"/>
+          <w:sz w:val="22"/>
+        </w:rPr>
+        <w:t>This sample package contains:</w:t>
       </w:r>
     </w:p>
     <w:p>
@@ -869,28 +772,661 @@
         <w:keepLines/>
         <w:widowControl w:val="0"/>
         <w:spacing w:before="840" w:after="0" w:line="240" w:lineRule="auto"/>
-        <w:ind w:left="5338" w:right="0" w:firstLine="0"/>
-        <w:jc w:val="center"/>
+        <w:ind w:left="0" w:right="0" w:firstLine="0"/>
+        <w:jc w:val="left"/>
       </w:pPr>
       <w:r>
         <w:rPr>
-          <w:rFonts w:ascii="Calibri" w:hAnsi="Calibri" w:eastAsia="Calibri" w:cs="Calibri"/>
+          <w:rFonts w:ascii="Arial" w:hAnsi="Arial" w:eastAsia="Arial" w:cs="Arial"/>
+          <w:b/>
+          <w:i w:val="0"/>
+          <w:color w:val="808080"/>
+          <w:sz w:val="28"/>
+        </w:rPr>
+        <w:t>Deploying the Sample</w:t>
+      </w:r>
+    </w:p>
+    <w:p>
+      <w:pPr>
+        <w:keepLines/>
+        <w:widowControl w:val="0"/>
+        <w:spacing w:before="127" w:after="0" w:line="240" w:lineRule="auto"/>
+        <w:ind w:left="0" w:right="0" w:firstLine="0"/>
+        <w:jc w:val="left"/>
+      </w:pPr>
+      <w:r>
+        <w:rPr>
+          <w:rFonts w:ascii="Arial" w:hAnsi="Arial" w:eastAsia="Arial" w:cs="Arial"/>
           <w:b w:val="0"/>
           <w:i w:val="0"/>
           <w:color w:val="000000"/>
-          <w:sz w:val="24"/>
+          <w:sz w:val="22"/>
         </w:rPr>
-        <w:t>3</w:t>
+        <w:t>To deploy this sample in your environment:</w:t>
+      </w:r>
+    </w:p>
+    <w:p>
+      <w:pPr>
+        <w:numPr>
+          <w:ilvl w:val="0"/>
+          <w:numId w:val="13"/>
+        </w:numPr>
+        <w:keepLines/>
+        <w:widowControl w:val="0"/>
+        <w:tabs>
+          <w:tab w:pos="2942" w:val="left"/>
+        </w:tabs>
+        <w:spacing w:before="166" w:after="0" w:line="240" w:lineRule="auto"/>
+        <w:ind w:left="2942" w:right="0" w:hanging="2942"/>
+        <w:jc w:val="left"/>
+      </w:pPr>
+      <w:r>
+        <w:rPr>
+          <w:rFonts w:ascii="Arial" w:hAnsi="Arial" w:eastAsia="Arial" w:cs="Arial"/>
+          <w:b w:val="0"/>
+          <w:i w:val="0"/>
+          <w:color w:val="000000"/>
+          <w:sz w:val="22"/>
+        </w:rPr>
+        <w:t xml:space="preserve">Open the template design </w:t>
+      </w:r>
+      <w:r>
+        <w:rPr>
+          <w:rFonts w:ascii="Arial" w:hAnsi="Arial" w:eastAsia="Arial" w:cs="Arial"/>
+          <w:b/>
+          <w:i w:val="0"/>
+          <w:color w:val="000000"/>
+          <w:sz w:val="22"/>
+        </w:rPr>
+        <w:t xml:space="preserve">ap_bookmark.IFD </w:t>
+      </w:r>
+      <w:r>
+        <w:rPr>
+          <w:rFonts w:ascii="Arial" w:hAnsi="Arial" w:eastAsia="Arial" w:cs="Arial"/>
+          <w:b w:val="0"/>
+          <w:i w:val="0"/>
+          <w:color w:val="000000"/>
+          <w:sz w:val="22"/>
+        </w:rPr>
+        <w:t>in Output Designer and recompile the</w:t>
+      </w:r>
+    </w:p>
+    <w:p>
+      <w:pPr>
+        <w:keepLines/>
+        <w:widowControl w:val="0"/>
+        <w:spacing w:before="8" w:after="0" w:line="240" w:lineRule="auto"/>
+        <w:ind w:left="360" w:right="0" w:firstLine="0"/>
+        <w:jc w:val="left"/>
+      </w:pPr>
+      <w:r>
+        <w:rPr>
+          <w:rFonts w:ascii="Arial" w:hAnsi="Arial" w:eastAsia="Arial" w:cs="Arial"/>
+          <w:b w:val="0"/>
+          <w:i w:val="0"/>
+          <w:color w:val="000000"/>
+          <w:sz w:val="22"/>
+        </w:rPr>
+        <w:t>template for the appropriate presentment target.</w:t>
+      </w:r>
+    </w:p>
+    <w:p>
+      <w:pPr>
+        <w:numPr>
+          <w:ilvl w:val="0"/>
+          <w:numId w:val="14"/>
+        </w:numPr>
+        <w:keepLines/>
+        <w:widowControl w:val="0"/>
+        <w:tabs>
+          <w:tab w:pos="1438" w:val="left"/>
+        </w:tabs>
+        <w:spacing w:before="164" w:after="0" w:line="240" w:lineRule="auto"/>
+        <w:ind w:left="1438" w:right="0" w:hanging="1437"/>
+        <w:jc w:val="left"/>
+      </w:pPr>
+      <w:r>
+        <w:rPr>
+          <w:rFonts w:ascii="Arial" w:hAnsi="Arial" w:eastAsia="Arial" w:cs="Arial"/>
+          <w:b w:val="0"/>
+          <w:i w:val="0"/>
+          <w:color w:val="000000"/>
+          <w:sz w:val="22"/>
+        </w:rPr>
+        <w:t xml:space="preserve">Modify the </w:t>
+      </w:r>
+      <w:r>
+        <w:rPr>
+          <w:rFonts w:ascii="Arial" w:hAnsi="Arial" w:eastAsia="Arial" w:cs="Arial"/>
+          <w:b/>
+          <w:i w:val="0"/>
+          <w:color w:val="000000"/>
+          <w:sz w:val="22"/>
+        </w:rPr>
+        <w:t xml:space="preserve">-z </w:t>
+      </w:r>
+      <w:r>
+        <w:rPr>
+          <w:rFonts w:ascii="Arial" w:hAnsi="Arial" w:eastAsia="Arial" w:cs="Arial"/>
+          <w:b w:val="0"/>
+          <w:i w:val="0"/>
+          <w:color w:val="000000"/>
+          <w:sz w:val="22"/>
+        </w:rPr>
+        <w:t xml:space="preserve">option in the </w:t>
+      </w:r>
+      <w:r>
+        <w:rPr>
+          <w:rFonts w:ascii="Arial" w:hAnsi="Arial" w:eastAsia="Arial" w:cs="Arial"/>
+          <w:b/>
+          <w:i w:val="0"/>
+          <w:color w:val="000000"/>
+          <w:sz w:val="22"/>
+        </w:rPr>
+        <w:t xml:space="preserve">^job </w:t>
+      </w:r>
+      <w:r>
+        <w:rPr>
+          <w:rFonts w:ascii="Arial" w:hAnsi="Arial" w:eastAsia="Arial" w:cs="Arial"/>
+          <w:b w:val="0"/>
+          <w:i w:val="0"/>
+          <w:color w:val="000000"/>
+          <w:sz w:val="22"/>
+        </w:rPr>
+        <w:t xml:space="preserve">command in the data file </w:t>
+      </w:r>
+      <w:r>
+        <w:rPr>
+          <w:rFonts w:ascii="Arial" w:hAnsi="Arial" w:eastAsia="Arial" w:cs="Arial"/>
+          <w:b/>
+          <w:i w:val="0"/>
+          <w:color w:val="000000"/>
+          <w:sz w:val="22"/>
+        </w:rPr>
+        <w:t xml:space="preserve">ap_bookmark.dat </w:t>
+      </w:r>
+      <w:r>
+        <w:rPr>
+          <w:rFonts w:ascii="Arial" w:hAnsi="Arial" w:eastAsia="Arial" w:cs="Arial"/>
+          <w:b w:val="0"/>
+          <w:i w:val="0"/>
+          <w:color w:val="000000"/>
+          <w:sz w:val="22"/>
+        </w:rPr>
+        <w:t>to:</w:t>
+      </w:r>
+    </w:p>
+    <w:p>
+      <w:pPr>
+        <w:numPr>
+          <w:ilvl w:val="0"/>
+          <w:numId w:val="15"/>
+        </w:numPr>
+        <w:keepLines/>
+        <w:widowControl w:val="0"/>
+        <w:tabs>
+          <w:tab w:pos="720" w:val="left"/>
+        </w:tabs>
+        <w:spacing w:before="160" w:after="0" w:line="240" w:lineRule="auto"/>
+        <w:ind w:left="720" w:right="0" w:hanging="360"/>
+        <w:jc w:val="left"/>
+      </w:pPr>
+      <w:r>
+        <w:rPr>
+          <w:rFonts w:ascii="Arial" w:hAnsi="Arial" w:eastAsia="Arial" w:cs="Arial"/>
+          <w:b w:val="0"/>
+          <w:i w:val="0"/>
+          <w:color w:val="000000"/>
+          <w:sz w:val="22"/>
+        </w:rPr>
+        <w:t>Identify the target output device.</w:t>
+      </w:r>
+    </w:p>
+    <w:p>
+      <w:pPr>
+        <w:numPr>
+          <w:ilvl w:val="0"/>
+          <w:numId w:val="15"/>
+        </w:numPr>
+        <w:keepLines/>
+        <w:widowControl w:val="0"/>
+        <w:tabs>
+          <w:tab w:pos="720" w:val="left"/>
+        </w:tabs>
+        <w:spacing w:before="137" w:after="0" w:line="240" w:lineRule="auto"/>
+        <w:ind w:left="720" w:right="0" w:hanging="360"/>
+        <w:jc w:val="left"/>
+      </w:pPr>
+      <w:r>
+        <w:rPr>
+          <w:rFonts w:ascii="Arial" w:hAnsi="Arial" w:eastAsia="Arial" w:cs="Arial"/>
+          <w:b w:val="0"/>
+          <w:i w:val="0"/>
+          <w:color w:val="000000"/>
+          <w:sz w:val="22"/>
+        </w:rPr>
+        <w:t xml:space="preserve">Identify the bookmark file using the </w:t>
+      </w:r>
+      <w:r>
+        <w:rPr>
+          <w:rFonts w:ascii="Arial" w:hAnsi="Arial" w:eastAsia="Arial" w:cs="Arial"/>
+          <w:b/>
+          <w:i w:val="0"/>
+          <w:color w:val="000000"/>
+          <w:sz w:val="22"/>
+        </w:rPr>
+        <w:t xml:space="preserve">-abmk </w:t>
+      </w:r>
+      <w:r>
+        <w:rPr>
+          <w:rFonts w:ascii="Arial" w:hAnsi="Arial" w:eastAsia="Arial" w:cs="Arial"/>
+          <w:b w:val="0"/>
+          <w:i w:val="0"/>
+          <w:color w:val="000000"/>
+          <w:sz w:val="22"/>
+        </w:rPr>
+        <w:t>command.</w:t>
+      </w:r>
+    </w:p>
+    <w:p>
+      <w:pPr>
+        <w:numPr>
+          <w:ilvl w:val="0"/>
+          <w:numId w:val="15"/>
+        </w:numPr>
+        <w:keepLines/>
+        <w:widowControl w:val="0"/>
+        <w:tabs>
+          <w:tab w:pos="720" w:val="left"/>
+        </w:tabs>
+        <w:spacing w:before="142" w:after="0" w:line="240" w:lineRule="auto"/>
+        <w:ind w:left="720" w:right="0" w:hanging="360"/>
+        <w:jc w:val="left"/>
+      </w:pPr>
+      <w:r>
+        <w:rPr>
+          <w:rFonts w:ascii="Arial" w:hAnsi="Arial" w:eastAsia="Arial" w:cs="Arial"/>
+          <w:b w:val="0"/>
+          <w:i w:val="0"/>
+          <w:color w:val="000000"/>
+          <w:sz w:val="22"/>
+        </w:rPr>
+        <w:t xml:space="preserve">Identify the section for which to generate bookmarks, if desired, using the </w:t>
+      </w:r>
+      <w:r>
+        <w:rPr>
+          <w:rFonts w:ascii="Arial" w:hAnsi="Arial" w:eastAsia="Arial" w:cs="Arial"/>
+          <w:b/>
+          <w:i w:val="0"/>
+          <w:color w:val="000000"/>
+          <w:sz w:val="22"/>
+        </w:rPr>
+        <w:t>-abms</w:t>
+      </w:r>
+    </w:p>
+    <w:p>
+      <w:pPr>
+        <w:keepLines/>
+        <w:widowControl w:val="0"/>
+        <w:spacing w:before="0" w:after="0" w:line="240" w:lineRule="auto"/>
+        <w:ind w:left="720" w:right="0" w:firstLine="0"/>
+        <w:jc w:val="left"/>
+      </w:pPr>
+      <w:r>
+        <w:rPr>
+          <w:rFonts w:ascii="Arial" w:hAnsi="Arial" w:eastAsia="Arial" w:cs="Arial"/>
+          <w:b w:val="0"/>
+          <w:i w:val="0"/>
+          <w:color w:val="000000"/>
+          <w:sz w:val="22"/>
+        </w:rPr>
+        <w:t>command.</w:t>
+      </w:r>
+    </w:p>
+    <w:p>
+      <w:pPr>
+        <w:keepLines/>
+        <w:widowControl w:val="0"/>
+        <w:spacing w:before="126" w:after="0" w:line="240" w:lineRule="auto"/>
+        <w:ind w:left="360" w:right="0" w:firstLine="0"/>
+        <w:jc w:val="left"/>
+      </w:pPr>
+      <w:r>
+        <w:rPr>
+          <w:rFonts w:ascii="Arial" w:hAnsi="Arial" w:eastAsia="Arial" w:cs="Arial"/>
+          <w:b w:val="0"/>
+          <w:i w:val="0"/>
+          <w:color w:val="000000"/>
+          <w:sz w:val="22"/>
+        </w:rPr>
+        <w:t>For example,</w:t>
+      </w:r>
+    </w:p>
+    <w:p>
+      <w:pPr>
+        <w:numPr>
+          <w:ilvl w:val="0"/>
+          <w:numId w:val="16"/>
+        </w:numPr>
+        <w:keepLines/>
+        <w:widowControl w:val="0"/>
+        <w:tabs>
+          <w:tab w:pos="277" w:val="left"/>
+        </w:tabs>
+        <w:spacing w:before="0" w:after="0" w:line="240" w:lineRule="auto"/>
+        <w:ind w:left="277" w:right="0" w:hanging="277"/>
+        <w:jc w:val="left"/>
+      </w:pPr>
+      <w:r>
+        <w:rPr>
+          <w:rFonts w:ascii="Arial" w:hAnsi="Arial" w:eastAsia="Arial" w:cs="Arial"/>
+          <w:b w:val="0"/>
+          <w:i w:val="0"/>
+          <w:color w:val="000000"/>
+          <w:sz w:val="22"/>
+        </w:rPr>
+        <w:t>Place the accompanying files in directories consistent with your implementation:</w:t>
+      </w:r>
+    </w:p>
+    <w:p>
+      <w:pPr>
+        <w:numPr>
+          <w:ilvl w:val="0"/>
+          <w:numId w:val="17"/>
+        </w:numPr>
+        <w:keepLines/>
+        <w:widowControl w:val="0"/>
+        <w:tabs>
+          <w:tab w:pos="720" w:val="left"/>
+        </w:tabs>
+        <w:spacing w:before="155" w:after="0" w:line="240" w:lineRule="auto"/>
+        <w:ind w:left="720" w:right="0" w:hanging="360"/>
+        <w:jc w:val="left"/>
+      </w:pPr>
+      <w:r>
+        <w:rPr>
+          <w:rFonts w:ascii="Arial" w:hAnsi="Arial" w:eastAsia="Arial" w:cs="Arial"/>
+          <w:b w:val="0"/>
+          <w:i w:val="0"/>
+          <w:color w:val="000000"/>
+          <w:sz w:val="22"/>
+        </w:rPr>
+        <w:t xml:space="preserve">Place </w:t>
+      </w:r>
+      <w:r>
+        <w:rPr>
+          <w:rFonts w:ascii="Arial" w:hAnsi="Arial" w:eastAsia="Arial" w:cs="Arial"/>
+          <w:b/>
+          <w:i w:val="0"/>
+          <w:color w:val="000000"/>
+          <w:sz w:val="22"/>
+        </w:rPr>
+        <w:t xml:space="preserve">ap_bookmark.IFD </w:t>
+      </w:r>
+      <w:r>
+        <w:rPr>
+          <w:rFonts w:ascii="Arial" w:hAnsi="Arial" w:eastAsia="Arial" w:cs="Arial"/>
+          <w:b w:val="0"/>
+          <w:i w:val="0"/>
+          <w:color w:val="000000"/>
+          <w:sz w:val="22"/>
+        </w:rPr>
+        <w:t xml:space="preserve">in the </w:t>
+      </w:r>
+      <w:r>
+        <w:rPr>
+          <w:rFonts w:ascii="Arial" w:hAnsi="Arial" w:eastAsia="Arial" w:cs="Arial"/>
+          <w:b/>
+          <w:i w:val="0"/>
+          <w:color w:val="000000"/>
+          <w:sz w:val="22"/>
+        </w:rPr>
+        <w:t xml:space="preserve">Designs </w:t>
+      </w:r>
+      <w:r>
+        <w:rPr>
+          <w:rFonts w:ascii="Arial" w:hAnsi="Arial" w:eastAsia="Arial" w:cs="Arial"/>
+          <w:b w:val="0"/>
+          <w:i w:val="0"/>
+          <w:color w:val="000000"/>
+          <w:sz w:val="22"/>
+        </w:rPr>
+        <w:t>subdirectory for Output Designer.</w:t>
+      </w:r>
+    </w:p>
+    <w:p>
+      <w:pPr>
+        <w:numPr>
+          <w:ilvl w:val="0"/>
+          <w:numId w:val="17"/>
+        </w:numPr>
+        <w:keepLines/>
+        <w:widowControl w:val="0"/>
+        <w:tabs>
+          <w:tab w:pos="720" w:val="left"/>
+        </w:tabs>
+        <w:spacing w:before="142" w:after="0" w:line="240" w:lineRule="auto"/>
+        <w:ind w:left="720" w:right="0" w:hanging="360"/>
+        <w:jc w:val="left"/>
+      </w:pPr>
+      <w:r>
+        <w:rPr>
+          <w:rFonts w:ascii="Arial" w:hAnsi="Arial" w:eastAsia="Arial" w:cs="Arial"/>
+          <w:b w:val="0"/>
+          <w:i w:val="0"/>
+          <w:color w:val="000000"/>
+          <w:sz w:val="22"/>
+        </w:rPr>
+        <w:t xml:space="preserve">Place </w:t>
+      </w:r>
+      <w:r>
+        <w:rPr>
+          <w:rFonts w:ascii="Arial" w:hAnsi="Arial" w:eastAsia="Arial" w:cs="Arial"/>
+          <w:b/>
+          <w:i w:val="0"/>
+          <w:color w:val="000000"/>
+          <w:sz w:val="22"/>
+        </w:rPr>
+        <w:t xml:space="preserve">ap_bookmark.mdf </w:t>
+      </w:r>
+      <w:r>
+        <w:rPr>
+          <w:rFonts w:ascii="Arial" w:hAnsi="Arial" w:eastAsia="Arial" w:cs="Arial"/>
+          <w:b w:val="0"/>
+          <w:i w:val="0"/>
+          <w:color w:val="000000"/>
+          <w:sz w:val="22"/>
+        </w:rPr>
+        <w:t>in the forms subdirectory accessible to Central.</w:t>
+      </w:r>
+    </w:p>
+    <w:p>
+      <w:pPr>
+        <w:numPr>
+          <w:ilvl w:val="0"/>
+          <w:numId w:val="17"/>
+        </w:numPr>
+        <w:keepLines/>
+        <w:widowControl w:val="0"/>
+        <w:tabs>
+          <w:tab w:pos="720" w:val="left"/>
+        </w:tabs>
+        <w:spacing w:before="139" w:after="0" w:line="240" w:lineRule="auto"/>
+        <w:ind w:left="720" w:right="0" w:hanging="360"/>
+        <w:jc w:val="left"/>
+      </w:pPr>
+      <w:r>
+        <w:rPr>
+          <w:rFonts w:ascii="Arial" w:hAnsi="Arial" w:eastAsia="Arial" w:cs="Arial"/>
+          <w:b w:val="0"/>
+          <w:i w:val="0"/>
+          <w:color w:val="000000"/>
+          <w:sz w:val="22"/>
+        </w:rPr>
+        <w:t xml:space="preserve">Place </w:t>
+      </w:r>
+      <w:r>
+        <w:rPr>
+          <w:rFonts w:ascii="Arial" w:hAnsi="Arial" w:eastAsia="Arial" w:cs="Arial"/>
+          <w:b/>
+          <w:i w:val="0"/>
+          <w:color w:val="000000"/>
+          <w:sz w:val="22"/>
+        </w:rPr>
+        <w:t xml:space="preserve">ap_bookmark.bmk </w:t>
+      </w:r>
+      <w:r>
+        <w:rPr>
+          <w:rFonts w:ascii="Arial" w:hAnsi="Arial" w:eastAsia="Arial" w:cs="Arial"/>
+          <w:b w:val="0"/>
+          <w:i w:val="0"/>
+          <w:color w:val="000000"/>
+          <w:sz w:val="22"/>
+        </w:rPr>
+        <w:t>in an addressable directory.</w:t>
+      </w:r>
+    </w:p>
+    <w:p>
+      <w:pPr>
+        <w:keepLines/>
+        <w:widowControl w:val="0"/>
+        <w:spacing w:before="351" w:after="0" w:line="240" w:lineRule="auto"/>
+        <w:ind w:left="0" w:right="0" w:firstLine="0"/>
+        <w:jc w:val="left"/>
+      </w:pPr>
+      <w:r>
+        <w:rPr>
+          <w:rFonts w:ascii="Arial" w:hAnsi="Arial" w:eastAsia="Arial" w:cs="Arial"/>
+          <w:b/>
+          <w:i w:val="0"/>
+          <w:color w:val="808080"/>
+          <w:sz w:val="28"/>
+        </w:rPr>
+        <w:t>Running the Sample</w:t>
+      </w:r>
+    </w:p>
+    <w:p>
+      <w:pPr>
+        <w:numPr>
+          <w:ilvl w:val="0"/>
+          <w:numId w:val="18"/>
+        </w:numPr>
+        <w:keepLines/>
+        <w:widowControl w:val="0"/>
+        <w:tabs>
+          <w:tab w:pos="240" w:val="left"/>
+        </w:tabs>
+        <w:spacing w:before="164" w:after="0" w:line="240" w:lineRule="auto"/>
+        <w:ind w:left="240" w:right="0" w:hanging="240"/>
+        <w:jc w:val="left"/>
+      </w:pPr>
+    </w:p>
+    <w:p>
+      <w:pPr>
+        <w:keepLines/>
+        <w:widowControl w:val="0"/>
+        <w:spacing w:before="0" w:after="0" w:line="240" w:lineRule="auto"/>
+        <w:ind w:left="360" w:right="0" w:firstLine="0"/>
+      </w:pPr>
+      <w:r>
+        <w:rPr>
+          <w:rFonts w:ascii="Arial" w:hAnsi="Arial" w:eastAsia="Arial" w:cs="Arial"/>
+          <w:b w:val="0"/>
+          <w:i w:val="0"/>
+          <w:color w:val="000000"/>
+          <w:sz w:val="22"/>
+        </w:rPr>
+        <w:t xml:space="preserve">To run this sample, place </w:t>
+      </w:r>
+      <w:r>
+        <w:rPr>
+          <w:rFonts w:ascii="Arial" w:hAnsi="Arial" w:eastAsia="Arial" w:cs="Arial"/>
+          <w:b/>
+          <w:i w:val="0"/>
+          <w:color w:val="000000"/>
+          <w:sz w:val="22"/>
+        </w:rPr>
+        <w:t xml:space="preserve">ap_bookmark.dat </w:t>
+      </w:r>
+      <w:r>
+        <w:rPr>
+          <w:rFonts w:ascii="Arial" w:hAnsi="Arial" w:eastAsia="Arial" w:cs="Arial"/>
+          <w:b w:val="0"/>
+          <w:i w:val="0"/>
+          <w:color w:val="000000"/>
+          <w:sz w:val="22"/>
+        </w:rPr>
+        <w:t>in the collector directory scanned by Central.</w:t>
       </w:r>
     </w:p>
     <w:sectPr>
+      <w:headerReference w:type="default" r:id="rId9"/>
+      <w:footerReference w:type="default" r:id="rId10"/>
       <w:pgSz w:w="12240" w:h="15840"/>
-      <w:pgMar w:top="730" w:right="720" w:bottom="720" w:left="723" w:header="0" w:footer="0" w:gutter="0"/>
+      <w:pgMar w:top="2111" w:right="720" w:bottom="720" w:left="1030" w:header="0" w:footer="0" w:gutter="0"/>
       <w:cols w:space="720"/>
       <w:docGrid w:linePitch="360"/>
     </w:sectPr>
   </w:body>
 </w:document>
+</file>
+
+<file path=word/footer1.xml><?xml version="1.0" encoding="utf-8"?>
+<w:ftr xmlns:m="http://schemas.openxmlformats.org/officeDocument/2006/math" xmlns:mc="http://schemas.openxmlformats.org/markup-compatibility/2006" xmlns:mo="http://schemas.microsoft.com/office/mac/office/2008/main" xmlns:mv="urn:schemas-microsoft-com:mac:vml" xmlns:o="urn:schemas-microsoft-com:office:office" xmlns:r="http://schemas.openxmlformats.org/officeDocument/2006/relationships" xmlns:v="urn:schemas-microsoft-com:vml" xmlns:w10="urn:schemas-microsoft-com:office:word" xmlns:w14="http://schemas.microsoft.com/office/word/2010/wordml" xmlns:w="http://schemas.openxmlformats.org/wordprocessingml/2006/main" xmlns:wne="http://schemas.microsoft.com/office/word/2006/wordml" xmlns:wp14="http://schemas.microsoft.com/office/word/2010/wordprocessingDrawing" xmlns:wp="http://schemas.openxmlformats.org/drawingml/2006/wordprocessingDrawing" xmlns:wpc="http://schemas.microsoft.com/office/word/2010/wordprocessingCanvas" xmlns:wpg="http://schemas.microsoft.com/office/word/2010/wordprocessingGroup" xmlns:wpi="http://schemas.microsoft.com/office/word/2010/wordprocessingInk" xmlns:wps="http://schemas.microsoft.com/office/word/2010/wordprocessingShape" mc:Ignorable="w14 wp14">
+  <w:p>
+    <w:pPr>
+      <w:pStyle w:val="Footer"/>
+      <w:jc w:val="left"/>
+    </w:pPr>
+    <w:r/>
+    <w:r>
+      <w:rPr>
+        <w:rFonts w:ascii="Arial" w:hAnsi="Arial" w:eastAsia="Arial" w:cs="Arial"/>
+        <w:b w:val="0"/>
+        <w:i w:val="0"/>
+        <w:color w:val="000000"/>
+        <w:sz w:val="18"/>
+      </w:rPr>
+      <w:t>PDF Bookmark Sample</w:t>
+    </w:r>
+  </w:p>
+  <w:p>
+    <w:pPr>
+      <w:jc w:val="left"/>
+    </w:pPr>
+    <w:r>
+      <w:t xml:space="preserve">Page </w:t>
+    </w:r>
+    <w:r>
+      <w:fldChar w:fldCharType="begin"/>
+      <w:instrText xml:space="preserve"> PAGE </w:instrText>
+      <w:fldChar w:fldCharType="separate"/>
+      <w:t>1</w:t>
+      <w:fldChar w:fldCharType="end"/>
+    </w:r>
+    <w:r>
+      <w:t xml:space="preserve"> of </w:t>
+    </w:r>
+    <w:r>
+      <w:fldChar w:fldCharType="begin"/>
+      <w:instrText xml:space="preserve"> NUMPAGES </w:instrText>
+      <w:fldChar w:fldCharType="separate"/>
+      <w:t>1</w:t>
+      <w:fldChar w:fldCharType="end"/>
+    </w:r>
+  </w:p>
+</w:ftr>
+</file>
+
+<file path=word/header1.xml><?xml version="1.0" encoding="utf-8"?>
+<w:hdr xmlns:m="http://schemas.openxmlformats.org/officeDocument/2006/math" xmlns:mc="http://schemas.openxmlformats.org/markup-compatibility/2006" xmlns:mo="http://schemas.microsoft.com/office/mac/office/2008/main" xmlns:mv="urn:schemas-microsoft-com:mac:vml" xmlns:o="urn:schemas-microsoft-com:office:office" xmlns:r="http://schemas.openxmlformats.org/officeDocument/2006/relationships" xmlns:v="urn:schemas-microsoft-com:vml" xmlns:w10="urn:schemas-microsoft-com:office:word" xmlns:w14="http://schemas.microsoft.com/office/word/2010/wordml" xmlns:w="http://schemas.openxmlformats.org/wordprocessingml/2006/main" xmlns:wne="http://schemas.microsoft.com/office/word/2006/wordml" xmlns:wp14="http://schemas.microsoft.com/office/word/2010/wordprocessingDrawing" xmlns:wp="http://schemas.openxmlformats.org/drawingml/2006/wordprocessingDrawing" xmlns:wpc="http://schemas.microsoft.com/office/word/2010/wordprocessingCanvas" xmlns:wpg="http://schemas.microsoft.com/office/word/2010/wordprocessingGroup" xmlns:wpi="http://schemas.microsoft.com/office/word/2010/wordprocessingInk" xmlns:wps="http://schemas.microsoft.com/office/word/2010/wordprocessingShape" mc:Ignorable="w14 wp14">
+  <w:p>
+    <w:pPr>
+      <w:pStyle w:val="Header"/>
+    </w:pPr>
+    <w:r/>
+  </w:p>
+</w:hdr>
 </file>
 
 <file path=word/numbering.xml><?xml version="1.0" encoding="utf-8"?>
@@ -1066,6 +1602,60 @@
       </w:rPr>
     </w:lvl>
   </w:abstractNum>
+  <w:abstractNum w:abstractNumId="9">
+    <w:multiLevelType w:val="singleLevel"/>
+    <w:lvl w:ilvl="0">
+      <w:start w:val="1"/>
+      <w:numFmt w:val="bullet"/>
+      <w:lvlText w:val="•"/>
+      <w:lvlJc w:val="left"/>
+      <w:suff w:val="tab"/>
+      <w:pPr>
+        <w:ind w:left="720" w:hanging="360"/>
+      </w:pPr>
+      <w:rPr>
+        <w:rFonts w:ascii="Symbol" w:hAnsi="Symbol" w:eastAsia="Symbol" w:cs="Symbol"/>
+        <w:sz w:val="20"/>
+        <w:szCs w:val="20"/>
+      </w:rPr>
+    </w:lvl>
+  </w:abstractNum>
+  <w:abstractNum w:abstractNumId="10">
+    <w:multiLevelType w:val="singleLevel"/>
+    <w:lvl w:ilvl="0">
+      <w:start w:val="1"/>
+      <w:numFmt w:val="decimal"/>
+      <w:lvlText w:val="%1."/>
+      <w:lvlJc w:val="right"/>
+      <w:suff w:val="tab"/>
+      <w:pPr>
+        <w:ind w:left="720" w:hanging="360"/>
+      </w:pPr>
+      <w:rPr>
+        <w:rFonts w:ascii="Arial" w:hAnsi="Arial" w:eastAsia="Arial" w:cs="Arial"/>
+        <w:sz w:val="22"/>
+        <w:szCs w:val="22"/>
+      </w:rPr>
+    </w:lvl>
+  </w:abstractNum>
+  <w:abstractNum w:abstractNumId="11">
+    <w:multiLevelType w:val="singleLevel"/>
+    <w:lvl w:ilvl="0">
+      <w:start w:val="1"/>
+      <w:numFmt w:val="bullet"/>
+      <w:lvlText w:val="•"/>
+      <w:lvlJc w:val="left"/>
+      <w:suff w:val="tab"/>
+      <w:pPr>
+        <w:ind w:left="720" w:hanging="360"/>
+      </w:pPr>
+      <w:rPr>
+        <w:rFonts w:ascii="Symbol" w:hAnsi="Symbol" w:eastAsia="Symbol" w:cs="Symbol"/>
+        <w:sz w:val="22"/>
+        <w:szCs w:val="22"/>
+      </w:rPr>
+    </w:lvl>
+  </w:abstractNum>
   <w:num w:numId="1">
     <w:abstractNumId w:val="8"/>
   </w:num>
@@ -1092,6 +1682,42 @@
   </w:num>
   <w:num w:numId="9">
     <w:abstractNumId w:val="0"/>
+  </w:num>
+  <w:num w:numId="10">
+    <w:abstractNumId w:val="9"/>
+  </w:num>
+  <w:num w:numId="11">
+    <w:abstractNumId w:val="9"/>
+  </w:num>
+  <w:num w:numId="12">
+    <w:abstractNumId w:val="9"/>
+  </w:num>
+  <w:num w:numId="13">
+    <w:abstractNumId w:val="10"/>
+    <w:lvlOverride w:ilvl="0">
+      <w:startOverride w:val="1"/>
+    </w:lvlOverride>
+  </w:num>
+  <w:num w:numId="14">
+    <w:abstractNumId w:val="10"/>
+    <w:lvlOverride w:ilvl="0">
+      <w:startOverride w:val="2"/>
+    </w:lvlOverride>
+  </w:num>
+  <w:num w:numId="15">
+    <w:abstractNumId w:val="11"/>
+  </w:num>
+  <w:num w:numId="16">
+    <w:abstractNumId w:val="10"/>
+    <w:lvlOverride w:ilvl="0">
+      <w:startOverride w:val="3"/>
+    </w:lvlOverride>
+  </w:num>
+  <w:num w:numId="17">
+    <w:abstractNumId w:val="11"/>
+  </w:num>
+  <w:num w:numId="18">
+    <w:abstractNumId w:val="9"/>
   </w:num>
 </w:numbering>
 </file>

</xml_diff>

<commit_message>
Step 62.9G.3 - Group list sequences and detect nesting
</commit_message>
<xml_diff>
--- a/output/editable.docx
+++ b/output/editable.docx
@@ -632,11 +632,8 @@
         </w:numPr>
         <w:keepLines/>
         <w:widowControl w:val="0"/>
-        <w:tabs>
-          <w:tab w:pos="240" w:val="left"/>
-        </w:tabs>
         <w:spacing w:before="165" w:after="0" w:line="240" w:lineRule="auto"/>
-        <w:ind w:left="240" w:right="0" w:hanging="240"/>
+        <w:ind w:right="0"/>
         <w:jc w:val="left"/>
       </w:pPr>
     </w:p>
@@ -667,11 +664,8 @@
         </w:numPr>
         <w:keepLines/>
         <w:widowControl w:val="0"/>
-        <w:tabs>
-          <w:tab w:pos="240" w:val="left"/>
-        </w:tabs>
         <w:spacing w:before="165" w:after="0" w:line="240" w:lineRule="auto"/>
-        <w:ind w:left="240" w:right="0" w:hanging="240"/>
+        <w:ind w:right="0"/>
         <w:jc w:val="left"/>
       </w:pPr>
     </w:p>
@@ -702,11 +696,8 @@
         </w:numPr>
         <w:keepLines/>
         <w:widowControl w:val="0"/>
-        <w:tabs>
-          <w:tab w:pos="240" w:val="left"/>
-        </w:tabs>
         <w:spacing w:before="165" w:after="0" w:line="240" w:lineRule="auto"/>
-        <w:ind w:left="240" w:right="0" w:hanging="240"/>
+        <w:ind w:right="0"/>
         <w:jc w:val="left"/>
       </w:pPr>
     </w:p>
@@ -813,11 +804,8 @@
         </w:numPr>
         <w:keepLines/>
         <w:widowControl w:val="0"/>
-        <w:tabs>
-          <w:tab w:pos="2942" w:val="left"/>
-        </w:tabs>
         <w:spacing w:before="166" w:after="0" w:line="240" w:lineRule="auto"/>
-        <w:ind w:left="2942" w:right="0" w:hanging="2942"/>
+        <w:ind w:right="0"/>
         <w:jc w:val="left"/>
       </w:pPr>
       <w:r>
@@ -878,11 +866,8 @@
         </w:numPr>
         <w:keepLines/>
         <w:widowControl w:val="0"/>
-        <w:tabs>
-          <w:tab w:pos="1438" w:val="left"/>
-        </w:tabs>
         <w:spacing w:before="164" w:after="0" w:line="240" w:lineRule="auto"/>
-        <w:ind w:left="1438" w:right="0" w:hanging="1437"/>
+        <w:ind w:right="0"/>
         <w:jc w:val="left"/>
       </w:pPr>
       <w:r>
@@ -964,11 +949,8 @@
         </w:numPr>
         <w:keepLines/>
         <w:widowControl w:val="0"/>
-        <w:tabs>
-          <w:tab w:pos="720" w:val="left"/>
-        </w:tabs>
         <w:spacing w:before="160" w:after="0" w:line="240" w:lineRule="auto"/>
-        <w:ind w:left="720" w:right="0" w:hanging="360"/>
+        <w:ind w:right="0"/>
         <w:jc w:val="left"/>
       </w:pPr>
       <w:r>
@@ -990,11 +972,8 @@
         </w:numPr>
         <w:keepLines/>
         <w:widowControl w:val="0"/>
-        <w:tabs>
-          <w:tab w:pos="720" w:val="left"/>
-        </w:tabs>
         <w:spacing w:before="137" w:after="0" w:line="240" w:lineRule="auto"/>
-        <w:ind w:left="720" w:right="0" w:hanging="360"/>
+        <w:ind w:right="0"/>
         <w:jc w:val="left"/>
       </w:pPr>
       <w:r>
@@ -1036,11 +1015,8 @@
         </w:numPr>
         <w:keepLines/>
         <w:widowControl w:val="0"/>
-        <w:tabs>
-          <w:tab w:pos="720" w:val="left"/>
-        </w:tabs>
         <w:spacing w:before="142" w:after="0" w:line="240" w:lineRule="auto"/>
-        <w:ind w:left="720" w:right="0" w:hanging="360"/>
+        <w:ind w:right="0"/>
         <w:jc w:val="left"/>
       </w:pPr>
       <w:r>
@@ -1110,11 +1086,8 @@
         </w:numPr>
         <w:keepLines/>
         <w:widowControl w:val="0"/>
-        <w:tabs>
-          <w:tab w:pos="277" w:val="left"/>
-        </w:tabs>
         <w:spacing w:before="0" w:after="0" w:line="240" w:lineRule="auto"/>
-        <w:ind w:left="277" w:right="0" w:hanging="277"/>
+        <w:ind w:right="0"/>
         <w:jc w:val="left"/>
       </w:pPr>
       <w:r>
@@ -1136,11 +1109,8 @@
         </w:numPr>
         <w:keepLines/>
         <w:widowControl w:val="0"/>
-        <w:tabs>
-          <w:tab w:pos="720" w:val="left"/>
-        </w:tabs>
         <w:spacing w:before="155" w:after="0" w:line="240" w:lineRule="auto"/>
-        <w:ind w:left="720" w:right="0" w:hanging="360"/>
+        <w:ind w:right="0"/>
         <w:jc w:val="left"/>
       </w:pPr>
       <w:r>
@@ -1202,11 +1172,8 @@
         </w:numPr>
         <w:keepLines/>
         <w:widowControl w:val="0"/>
-        <w:tabs>
-          <w:tab w:pos="720" w:val="left"/>
-        </w:tabs>
         <w:spacing w:before="142" w:after="0" w:line="240" w:lineRule="auto"/>
-        <w:ind w:left="720" w:right="0" w:hanging="360"/>
+        <w:ind w:right="0"/>
         <w:jc w:val="left"/>
       </w:pPr>
       <w:r>
@@ -1248,11 +1215,8 @@
         </w:numPr>
         <w:keepLines/>
         <w:widowControl w:val="0"/>
-        <w:tabs>
-          <w:tab w:pos="720" w:val="left"/>
-        </w:tabs>
         <w:spacing w:before="139" w:after="0" w:line="240" w:lineRule="auto"/>
-        <w:ind w:left="720" w:right="0" w:hanging="360"/>
+        <w:ind w:right="0"/>
         <w:jc w:val="left"/>
       </w:pPr>
       <w:r>
@@ -1313,11 +1277,8 @@
         </w:numPr>
         <w:keepLines/>
         <w:widowControl w:val="0"/>
-        <w:tabs>
-          <w:tab w:pos="240" w:val="left"/>
-        </w:tabs>
         <w:spacing w:before="164" w:after="0" w:line="240" w:lineRule="auto"/>
-        <w:ind w:left="240" w:right="0" w:hanging="240"/>
+        <w:ind w:right="0"/>
         <w:jc w:val="left"/>
       </w:pPr>
     </w:p>
@@ -1629,7 +1590,7 @@
       <w:lvlJc w:val="right"/>
       <w:suff w:val="tab"/>
       <w:pPr>
-        <w:ind w:left="720" w:hanging="360"/>
+        <w:ind w:left="3065" w:hanging="360"/>
       </w:pPr>
       <w:rPr>
         <w:rFonts w:ascii="Arial" w:hAnsi="Arial" w:eastAsia="Arial" w:cs="Arial"/>
@@ -1639,6 +1600,24 @@
     </w:lvl>
   </w:abstractNum>
   <w:abstractNum w:abstractNumId="11">
+    <w:multiLevelType w:val="singleLevel"/>
+    <w:lvl w:ilvl="0">
+      <w:start w:val="1"/>
+      <w:numFmt w:val="decimal"/>
+      <w:lvlText w:val="%1."/>
+      <w:lvlJc w:val="right"/>
+      <w:suff w:val="tab"/>
+      <w:pPr>
+        <w:ind w:left="1560" w:hanging="360"/>
+      </w:pPr>
+      <w:rPr>
+        <w:rFonts w:ascii="Arial" w:hAnsi="Arial" w:eastAsia="Arial" w:cs="Arial"/>
+        <w:sz w:val="22"/>
+        <w:szCs w:val="22"/>
+      </w:rPr>
+    </w:lvl>
+  </w:abstractNum>
+  <w:abstractNum w:abstractNumId="12">
     <w:multiLevelType w:val="singleLevel"/>
     <w:lvl w:ilvl="0">
       <w:start w:val="1"/>
@@ -1647,10 +1626,28 @@
       <w:lvlJc w:val="left"/>
       <w:suff w:val="tab"/>
       <w:pPr>
+        <w:ind w:left="842" w:hanging="360"/>
+      </w:pPr>
+      <w:rPr>
+        <w:rFonts w:ascii="Symbol" w:hAnsi="Symbol" w:eastAsia="Symbol" w:cs="Symbol"/>
+        <w:sz w:val="22"/>
+        <w:szCs w:val="22"/>
+      </w:rPr>
+    </w:lvl>
+  </w:abstractNum>
+  <w:abstractNum w:abstractNumId="13">
+    <w:multiLevelType w:val="singleLevel"/>
+    <w:lvl w:ilvl="0">
+      <w:start w:val="1"/>
+      <w:numFmt w:val="decimal"/>
+      <w:lvlText w:val="%1."/>
+      <w:lvlJc w:val="right"/>
+      <w:suff w:val="tab"/>
+      <w:pPr>
         <w:ind w:left="720" w:hanging="360"/>
       </w:pPr>
       <w:rPr>
-        <w:rFonts w:ascii="Symbol" w:hAnsi="Symbol" w:eastAsia="Symbol" w:cs="Symbol"/>
+        <w:rFonts w:ascii="Arial" w:hAnsi="Arial" w:eastAsia="Arial" w:cs="Arial"/>
         <w:sz w:val="22"/>
         <w:szCs w:val="22"/>
       </w:rPr>
@@ -1699,22 +1696,22 @@
     </w:lvlOverride>
   </w:num>
   <w:num w:numId="14">
-    <w:abstractNumId w:val="10"/>
+    <w:abstractNumId w:val="11"/>
     <w:lvlOverride w:ilvl="0">
       <w:startOverride w:val="2"/>
     </w:lvlOverride>
   </w:num>
   <w:num w:numId="15">
-    <w:abstractNumId w:val="11"/>
+    <w:abstractNumId w:val="12"/>
   </w:num>
   <w:num w:numId="16">
-    <w:abstractNumId w:val="10"/>
+    <w:abstractNumId w:val="13"/>
     <w:lvlOverride w:ilvl="0">
       <w:startOverride w:val="3"/>
     </w:lvlOverride>
   </w:num>
   <w:num w:numId="17">
-    <w:abstractNumId w:val="11"/>
+    <w:abstractNumId w:val="12"/>
   </w:num>
   <w:num w:numId="18">
     <w:abstractNumId w:val="9"/>

</xml_diff>

<commit_message>
Step 63G.0.1 - Add unified page render plan models
</commit_message>
<xml_diff>
--- a/output/editable.docx
+++ b/output/editable.docx
@@ -632,17 +632,8 @@
         </w:numPr>
         <w:keepLines/>
         <w:widowControl w:val="0"/>
-        <w:spacing w:before="165" w:after="0" w:line="240" w:lineRule="auto"/>
+        <w:spacing w:before="166" w:after="0" w:line="240" w:lineRule="auto"/>
         <w:ind w:right="0"/>
-        <w:jc w:val="left"/>
-      </w:pPr>
-    </w:p>
-    <w:p>
-      <w:pPr>
-        <w:keepLines/>
-        <w:widowControl w:val="0"/>
-        <w:spacing w:before="0" w:after="0" w:line="240" w:lineRule="auto"/>
-        <w:ind w:left="360" w:right="0" w:firstLine="0"/>
         <w:jc w:val="left"/>
       </w:pPr>
       <w:r>
@@ -660,21 +651,12 @@
       <w:pPr>
         <w:numPr>
           <w:ilvl w:val="0"/>
-          <w:numId w:val="11"/>
+          <w:numId w:val="10"/>
         </w:numPr>
         <w:keepLines/>
         <w:widowControl w:val="0"/>
-        <w:spacing w:before="165" w:after="0" w:line="240" w:lineRule="auto"/>
+        <w:spacing w:before="166" w:after="0" w:line="240" w:lineRule="auto"/>
         <w:ind w:right="0"/>
-        <w:jc w:val="left"/>
-      </w:pPr>
-    </w:p>
-    <w:p>
-      <w:pPr>
-        <w:keepLines/>
-        <w:widowControl w:val="0"/>
-        <w:spacing w:before="0" w:after="0" w:line="240" w:lineRule="auto"/>
-        <w:ind w:left="360" w:right="0" w:firstLine="0"/>
         <w:jc w:val="left"/>
       </w:pPr>
       <w:r>
@@ -692,21 +674,12 @@
       <w:pPr>
         <w:numPr>
           <w:ilvl w:val="0"/>
-          <w:numId w:val="12"/>
+          <w:numId w:val="10"/>
         </w:numPr>
         <w:keepLines/>
         <w:widowControl w:val="0"/>
-        <w:spacing w:before="165" w:after="0" w:line="240" w:lineRule="auto"/>
+        <w:spacing w:before="166" w:after="0" w:line="240" w:lineRule="auto"/>
         <w:ind w:right="0"/>
-        <w:jc w:val="left"/>
-      </w:pPr>
-    </w:p>
-    <w:p>
-      <w:pPr>
-        <w:keepLines/>
-        <w:widowControl w:val="0"/>
-        <w:spacing w:before="0" w:after="0" w:line="240" w:lineRule="auto"/>
-        <w:ind w:left="360" w:right="0" w:firstLine="0"/>
         <w:jc w:val="left"/>
       </w:pPr>
       <w:r>
@@ -799,14 +772,14 @@
     <w:p>
       <w:pPr>
         <w:numPr>
-          <w:ilvl w:val="0"/>
-          <w:numId w:val="13"/>
+          <w:ilvl w:val="1"/>
+          <w:numId w:val="11"/>
         </w:numPr>
         <w:keepLines/>
         <w:widowControl w:val="0"/>
         <w:spacing w:before="166" w:after="0" w:line="240" w:lineRule="auto"/>
         <w:ind w:right="0"/>
-        <w:jc w:val="left"/>
+        <w:jc w:val="both"/>
       </w:pPr>
       <w:r>
         <w:rPr>
@@ -836,33 +809,14 @@
           <w:color w:val="000000"/>
           <w:sz w:val="22"/>
         </w:rPr>
-        <w:t>in Output Designer and recompile the</w:t>
-      </w:r>
-    </w:p>
-    <w:p>
-      <w:pPr>
-        <w:keepLines/>
-        <w:widowControl w:val="0"/>
-        <w:spacing w:before="8" w:after="0" w:line="240" w:lineRule="auto"/>
-        <w:ind w:left="360" w:right="0" w:firstLine="0"/>
-        <w:jc w:val="left"/>
-      </w:pPr>
-      <w:r>
-        <w:rPr>
-          <w:rFonts w:ascii="Arial" w:hAnsi="Arial" w:eastAsia="Arial" w:cs="Arial"/>
-          <w:b w:val="0"/>
-          <w:i w:val="0"/>
-          <w:color w:val="000000"/>
-          <w:sz w:val="22"/>
-        </w:rPr>
-        <w:t>template for the appropriate presentment target.</w:t>
+        <w:t>in Output Designer and recompile the template for the appropriate presentment target.</w:t>
       </w:r>
     </w:p>
     <w:p>
       <w:pPr>
         <w:numPr>
           <w:ilvl w:val="0"/>
-          <w:numId w:val="14"/>
+          <w:numId w:val="11"/>
         </w:numPr>
         <w:keepLines/>
         <w:widowControl w:val="0"/>
@@ -945,7 +899,7 @@
       <w:pPr>
         <w:numPr>
           <w:ilvl w:val="0"/>
-          <w:numId w:val="15"/>
+          <w:numId w:val="12"/>
         </w:numPr>
         <w:keepLines/>
         <w:widowControl w:val="0"/>
@@ -968,7 +922,7 @@
       <w:pPr>
         <w:numPr>
           <w:ilvl w:val="0"/>
-          <w:numId w:val="15"/>
+          <w:numId w:val="12"/>
         </w:numPr>
         <w:keepLines/>
         <w:widowControl w:val="0"/>
@@ -1011,13 +965,13 @@
       <w:pPr>
         <w:numPr>
           <w:ilvl w:val="0"/>
-          <w:numId w:val="15"/>
+          <w:numId w:val="12"/>
         </w:numPr>
         <w:keepLines/>
         <w:widowControl w:val="0"/>
         <w:spacing w:before="142" w:after="0" w:line="240" w:lineRule="auto"/>
         <w:ind w:right="0"/>
-        <w:jc w:val="left"/>
+        <w:jc w:val="both"/>
       </w:pPr>
       <w:r>
         <w:rPr>
@@ -1037,17 +991,8 @@
           <w:color w:val="000000"/>
           <w:sz w:val="22"/>
         </w:rPr>
-        <w:t>-abms</w:t>
+        <w:t xml:space="preserve">-abms </w:t>
       </w:r>
-    </w:p>
-    <w:p>
-      <w:pPr>
-        <w:keepLines/>
-        <w:widowControl w:val="0"/>
-        <w:spacing w:before="0" w:after="0" w:line="240" w:lineRule="auto"/>
-        <w:ind w:left="720" w:right="0" w:firstLine="0"/>
-        <w:jc w:val="left"/>
-      </w:pPr>
       <w:r>
         <w:rPr>
           <w:rFonts w:ascii="Arial" w:hAnsi="Arial" w:eastAsia="Arial" w:cs="Arial"/>
@@ -1082,7 +1027,7 @@
       <w:pPr>
         <w:numPr>
           <w:ilvl w:val="0"/>
-          <w:numId w:val="16"/>
+          <w:numId w:val="13"/>
         </w:numPr>
         <w:keepLines/>
         <w:widowControl w:val="0"/>
@@ -1105,7 +1050,7 @@
       <w:pPr>
         <w:numPr>
           <w:ilvl w:val="0"/>
-          <w:numId w:val="17"/>
+          <w:numId w:val="14"/>
         </w:numPr>
         <w:keepLines/>
         <w:widowControl w:val="0"/>
@@ -1168,7 +1113,7 @@
       <w:pPr>
         <w:numPr>
           <w:ilvl w:val="0"/>
-          <w:numId w:val="17"/>
+          <w:numId w:val="14"/>
         </w:numPr>
         <w:keepLines/>
         <w:widowControl w:val="0"/>
@@ -1211,7 +1156,7 @@
       <w:pPr>
         <w:numPr>
           <w:ilvl w:val="0"/>
-          <w:numId w:val="17"/>
+          <w:numId w:val="14"/>
         </w:numPr>
         <w:keepLines/>
         <w:widowControl w:val="0"/>
@@ -1273,21 +1218,13 @@
       <w:pPr>
         <w:numPr>
           <w:ilvl w:val="0"/>
-          <w:numId w:val="18"/>
+          <w:numId w:val="15"/>
         </w:numPr>
         <w:keepLines/>
         <w:widowControl w:val="0"/>
-        <w:spacing w:before="164" w:after="0" w:line="240" w:lineRule="auto"/>
+        <w:spacing w:before="166" w:after="0" w:line="240" w:lineRule="auto"/>
         <w:ind w:right="0"/>
         <w:jc w:val="left"/>
-      </w:pPr>
-    </w:p>
-    <w:p>
-      <w:pPr>
-        <w:keepLines/>
-        <w:widowControl w:val="0"/>
-        <w:spacing w:before="0" w:after="0" w:line="240" w:lineRule="auto"/>
-        <w:ind w:left="360" w:right="0" w:firstLine="0"/>
       </w:pPr>
       <w:r>
         <w:rPr>
@@ -1575,32 +1512,14 @@
         <w:ind w:left="720" w:hanging="360"/>
       </w:pPr>
       <w:rPr>
-        <w:rFonts w:ascii="Symbol" w:hAnsi="Symbol" w:eastAsia="Symbol" w:cs="Symbol"/>
-        <w:sz w:val="20"/>
-        <w:szCs w:val="20"/>
+        <w:rFonts w:ascii="Arial" w:hAnsi="Arial" w:eastAsia="Arial" w:cs="Arial"/>
+        <w:sz w:val="22"/>
+        <w:szCs w:val="22"/>
       </w:rPr>
     </w:lvl>
   </w:abstractNum>
   <w:abstractNum w:abstractNumId="10">
-    <w:multiLevelType w:val="singleLevel"/>
-    <w:lvl w:ilvl="0">
-      <w:start w:val="1"/>
-      <w:numFmt w:val="decimal"/>
-      <w:lvlText w:val="%1."/>
-      <w:lvlJc w:val="right"/>
-      <w:suff w:val="tab"/>
-      <w:pPr>
-        <w:ind w:left="3065" w:hanging="360"/>
-      </w:pPr>
-      <w:rPr>
-        <w:rFonts w:ascii="Arial" w:hAnsi="Arial" w:eastAsia="Arial" w:cs="Arial"/>
-        <w:sz w:val="22"/>
-        <w:szCs w:val="22"/>
-      </w:rPr>
-    </w:lvl>
-  </w:abstractNum>
-  <w:abstractNum w:abstractNumId="11">
-    <w:multiLevelType w:val="singleLevel"/>
+    <w:multiLevelType w:val="multilevel"/>
     <w:lvl w:ilvl="0">
       <w:start w:val="1"/>
       <w:numFmt w:val="decimal"/>
@@ -1616,8 +1535,23 @@
         <w:szCs w:val="22"/>
       </w:rPr>
     </w:lvl>
+    <w:lvl w:ilvl="1">
+      <w:start w:val="1"/>
+      <w:numFmt w:val="decimal"/>
+      <w:lvlText w:val="%2."/>
+      <w:lvlJc w:val="right"/>
+      <w:suff w:val="tab"/>
+      <w:pPr>
+        <w:ind w:left="3065" w:hanging="360"/>
+      </w:pPr>
+      <w:rPr>
+        <w:rFonts w:ascii="Arial" w:hAnsi="Arial" w:eastAsia="Arial" w:cs="Arial"/>
+        <w:sz w:val="22"/>
+        <w:szCs w:val="22"/>
+      </w:rPr>
+    </w:lvl>
   </w:abstractNum>
-  <w:abstractNum w:abstractNumId="12">
+  <w:abstractNum w:abstractNumId="11">
     <w:multiLevelType w:val="singleLevel"/>
     <w:lvl w:ilvl="0">
       <w:start w:val="1"/>
@@ -1629,13 +1563,13 @@
         <w:ind w:left="842" w:hanging="360"/>
       </w:pPr>
       <w:rPr>
-        <w:rFonts w:ascii="Symbol" w:hAnsi="Symbol" w:eastAsia="Symbol" w:cs="Symbol"/>
+        <w:rFonts w:ascii="Arial" w:hAnsi="Arial" w:eastAsia="Arial" w:cs="Arial"/>
         <w:sz w:val="22"/>
         <w:szCs w:val="22"/>
       </w:rPr>
     </w:lvl>
   </w:abstractNum>
-  <w:abstractNum w:abstractNumId="13">
+  <w:abstractNum w:abstractNumId="12">
     <w:multiLevelType w:val="singleLevel"/>
     <w:lvl w:ilvl="0">
       <w:start w:val="1"/>
@@ -1684,36 +1618,24 @@
     <w:abstractNumId w:val="9"/>
   </w:num>
   <w:num w:numId="11">
-    <w:abstractNumId w:val="9"/>
-  </w:num>
-  <w:num w:numId="12">
-    <w:abstractNumId w:val="9"/>
-  </w:num>
-  <w:num w:numId="13">
     <w:abstractNumId w:val="10"/>
     <w:lvlOverride w:ilvl="0">
       <w:startOverride w:val="1"/>
     </w:lvlOverride>
   </w:num>
-  <w:num w:numId="14">
+  <w:num w:numId="12">
     <w:abstractNumId w:val="11"/>
-    <w:lvlOverride w:ilvl="0">
-      <w:startOverride w:val="2"/>
-    </w:lvlOverride>
   </w:num>
-  <w:num w:numId="15">
+  <w:num w:numId="13">
     <w:abstractNumId w:val="12"/>
-  </w:num>
-  <w:num w:numId="16">
-    <w:abstractNumId w:val="13"/>
     <w:lvlOverride w:ilvl="0">
       <w:startOverride w:val="3"/>
     </w:lvlOverride>
   </w:num>
-  <w:num w:numId="17">
-    <w:abstractNumId w:val="12"/>
+  <w:num w:numId="14">
+    <w:abstractNumId w:val="11"/>
   </w:num>
-  <w:num w:numId="18">
+  <w:num w:numId="15">
     <w:abstractNumId w:val="9"/>
   </w:num>
 </w:numbering>

</xml_diff>

<commit_message>
Step 62.9G.3.4 - Fix list geometry across formatting spans
</commit_message>
<xml_diff>
--- a/output/editable.docx
+++ b/output/editable.docx
@@ -772,7 +772,7 @@
     <w:p>
       <w:pPr>
         <w:numPr>
-          <w:ilvl w:val="1"/>
+          <w:ilvl w:val="0"/>
           <w:numId w:val="11"/>
         </w:numPr>
         <w:keepLines/>
@@ -1519,7 +1519,7 @@
     </w:lvl>
   </w:abstractNum>
   <w:abstractNum w:abstractNumId="10">
-    <w:multiLevelType w:val="multilevel"/>
+    <w:multiLevelType w:val="singleLevel"/>
     <w:lvl w:ilvl="0">
       <w:start w:val="1"/>
       <w:numFmt w:val="decimal"/>
@@ -1527,22 +1527,7 @@
       <w:lvlJc w:val="right"/>
       <w:suff w:val="tab"/>
       <w:pPr>
-        <w:ind w:left="1560" w:hanging="360"/>
-      </w:pPr>
-      <w:rPr>
-        <w:rFonts w:ascii="Arial" w:hAnsi="Arial" w:eastAsia="Arial" w:cs="Arial"/>
-        <w:sz w:val="22"/>
-        <w:szCs w:val="22"/>
-      </w:rPr>
-    </w:lvl>
-    <w:lvl w:ilvl="1">
-      <w:start w:val="1"/>
-      <w:numFmt w:val="decimal"/>
-      <w:lvlText w:val="%2."/>
-      <w:lvlJc w:val="right"/>
-      <w:suff w:val="tab"/>
-      <w:pPr>
-        <w:ind w:left="3065" w:hanging="360"/>
+        <w:ind w:left="720" w:hanging="360"/>
       </w:pPr>
       <w:rPr>
         <w:rFonts w:ascii="Arial" w:hAnsi="Arial" w:eastAsia="Arial" w:cs="Arial"/>
@@ -1561,24 +1546,6 @@
       <w:suff w:val="tab"/>
       <w:pPr>
         <w:ind w:left="842" w:hanging="360"/>
-      </w:pPr>
-      <w:rPr>
-        <w:rFonts w:ascii="Arial" w:hAnsi="Arial" w:eastAsia="Arial" w:cs="Arial"/>
-        <w:sz w:val="22"/>
-        <w:szCs w:val="22"/>
-      </w:rPr>
-    </w:lvl>
-  </w:abstractNum>
-  <w:abstractNum w:abstractNumId="12">
-    <w:multiLevelType w:val="singleLevel"/>
-    <w:lvl w:ilvl="0">
-      <w:start w:val="1"/>
-      <w:numFmt w:val="decimal"/>
-      <w:lvlText w:val="%1."/>
-      <w:lvlJc w:val="right"/>
-      <w:suff w:val="tab"/>
-      <w:pPr>
-        <w:ind w:left="720" w:hanging="360"/>
       </w:pPr>
       <w:rPr>
         <w:rFonts w:ascii="Arial" w:hAnsi="Arial" w:eastAsia="Arial" w:cs="Arial"/>
@@ -1627,7 +1594,7 @@
     <w:abstractNumId w:val="11"/>
   </w:num>
   <w:num w:numId="13">
-    <w:abstractNumId w:val="12"/>
+    <w:abstractNumId w:val="10"/>
     <w:lvlOverride w:ilvl="0">
       <w:startOverride w:val="3"/>
     </w:lvlOverride>

</xml_diff>

<commit_message>
Step 63G.1.8 - Integrate editable tables into render plan
</commit_message>
<xml_diff>
--- a/output/editable.docx
+++ b/output/editable.docx
@@ -51,11 +51,401 @@
         <w:t>AMPLE</w:t>
       </w:r>
     </w:p>
+    <w:tbl>
+      <w:tblPr>
+        <w:tblW w:type="dxa" w:w="9136"/>
+        <w:jc w:val="left"/>
+        <w:tblLayout w:type="fixed"/>
+        <w:tblLook w:firstColumn="1" w:firstRow="1" w:lastColumn="0" w:lastRow="0" w:noHBand="0" w:noVBand="1" w:val="04A0"/>
+      </w:tblPr>
+      <w:tblGrid>
+        <w:gridCol w:w="3420"/>
+        <w:gridCol w:w="5716"/>
+      </w:tblGrid>
+      <w:tr>
+        <w:trPr>
+          <w:trHeight w:val="458" w:hRule="atLeast"/>
+          <w:cantSplit/>
+        </w:trPr>
+        <w:tc>
+          <w:tcPr>
+            <w:tcW w:type="dxa" w:w="3420"/>
+            <w:vAlign w:val="center"/>
+            <w:tcMar>
+              <w:top w:w="85" w:type="dxa"/>
+              <w:right w:w="115" w:type="dxa"/>
+              <w:bottom w:w="85" w:type="dxa"/>
+              <w:left w:w="115" w:type="dxa"/>
+            </w:tcMar>
+            <w:tcBorders>
+              <w:top w:val="single" w:color="000000" w:sz="4" w:space="0"/>
+              <w:right w:val="single" w:color="000000" w:sz="4" w:space="0"/>
+              <w:bottom w:val="single" w:color="000000" w:sz="4" w:space="0"/>
+              <w:left w:val="single" w:color="000000" w:sz="4" w:space="0"/>
+            </w:tcBorders>
+          </w:tcPr>
+          <w:p>
+            <w:pPr>
+              <w:spacing w:before="0" w:after="0"/>
+              <w:ind w:left="0" w:right="0" w:firstLine="0"/>
+              <w:jc w:val="left"/>
+            </w:pPr>
+            <w:r>
+              <w:rPr>
+                <w:rFonts w:ascii="Arial" w:hAnsi="Arial" w:eastAsia="Arial" w:cs="Arial"/>
+                <w:b/>
+                <w:i w:val="0"/>
+                <w:color w:val="000000"/>
+                <w:sz w:val="22"/>
+              </w:rPr>
+              <w:t>Sample Date:</w:t>
+            </w:r>
+          </w:p>
+        </w:tc>
+        <w:tc>
+          <w:tcPr>
+            <w:tcW w:type="dxa" w:w="5716"/>
+            <w:vAlign w:val="center"/>
+            <w:tcMar>
+              <w:top w:w="83" w:type="dxa"/>
+              <w:right w:w="115" w:type="dxa"/>
+              <w:bottom w:w="83" w:type="dxa"/>
+              <w:left w:w="115" w:type="dxa"/>
+            </w:tcMar>
+            <w:tcBorders>
+              <w:top w:val="single" w:color="000000" w:sz="4" w:space="0"/>
+              <w:right w:val="single" w:color="000000" w:sz="4" w:space="0"/>
+              <w:bottom w:val="single" w:color="000000" w:sz="4" w:space="0"/>
+              <w:left w:val="single" w:color="000000" w:sz="4" w:space="0"/>
+            </w:tcBorders>
+          </w:tcPr>
+          <w:p>
+            <w:pPr>
+              <w:spacing w:before="0" w:after="0"/>
+              <w:ind w:left="0" w:right="0" w:firstLine="0"/>
+              <w:jc w:val="left"/>
+            </w:pPr>
+            <w:r>
+              <w:rPr>
+                <w:rFonts w:ascii="Arial" w:hAnsi="Arial" w:eastAsia="Arial" w:cs="Arial"/>
+                <w:b w:val="0"/>
+                <w:i w:val="0"/>
+                <w:color w:val="000000"/>
+                <w:sz w:val="22"/>
+              </w:rPr>
+              <w:t>May 2001</w:t>
+            </w:r>
+          </w:p>
+        </w:tc>
+      </w:tr>
+      <w:tr>
+        <w:trPr>
+          <w:trHeight w:val="458" w:hRule="atLeast"/>
+          <w:cantSplit/>
+        </w:trPr>
+        <w:tc>
+          <w:tcPr>
+            <w:tcW w:type="dxa" w:w="3420"/>
+            <w:vAlign w:val="center"/>
+            <w:tcMar>
+              <w:top w:w="83" w:type="dxa"/>
+              <w:right w:w="115" w:type="dxa"/>
+              <w:bottom w:w="83" w:type="dxa"/>
+              <w:left w:w="115" w:type="dxa"/>
+            </w:tcMar>
+            <w:tcBorders>
+              <w:top w:val="single" w:color="000000" w:sz="4" w:space="0"/>
+              <w:right w:val="single" w:color="000000" w:sz="4" w:space="0"/>
+              <w:bottom w:val="single" w:color="000000" w:sz="4" w:space="0"/>
+              <w:left w:val="single" w:color="000000" w:sz="4" w:space="0"/>
+            </w:tcBorders>
+          </w:tcPr>
+          <w:p>
+            <w:pPr>
+              <w:spacing w:before="0" w:after="0"/>
+              <w:ind w:left="0" w:right="0" w:firstLine="0"/>
+              <w:jc w:val="left"/>
+            </w:pPr>
+            <w:r>
+              <w:rPr>
+                <w:rFonts w:ascii="Arial" w:hAnsi="Arial" w:eastAsia="Arial" w:cs="Arial"/>
+                <w:b/>
+                <w:i w:val="0"/>
+                <w:color w:val="000000"/>
+                <w:sz w:val="22"/>
+              </w:rPr>
+              <w:t>Prepared by:</w:t>
+            </w:r>
+          </w:p>
+        </w:tc>
+        <w:tc>
+          <w:tcPr>
+            <w:tcW w:type="dxa" w:w="5716"/>
+            <w:vAlign w:val="center"/>
+            <w:tcMar>
+              <w:top w:w="81" w:type="dxa"/>
+              <w:right w:w="115" w:type="dxa"/>
+              <w:bottom w:w="81" w:type="dxa"/>
+              <w:left w:w="115" w:type="dxa"/>
+            </w:tcMar>
+            <w:tcBorders>
+              <w:top w:val="single" w:color="000000" w:sz="4" w:space="0"/>
+              <w:right w:val="single" w:color="000000" w:sz="4" w:space="0"/>
+              <w:bottom w:val="single" w:color="000000" w:sz="4" w:space="0"/>
+              <w:left w:val="single" w:color="000000" w:sz="4" w:space="0"/>
+            </w:tcBorders>
+          </w:tcPr>
+          <w:p>
+            <w:pPr>
+              <w:spacing w:before="0" w:after="0"/>
+              <w:ind w:left="0" w:right="0" w:firstLine="0"/>
+              <w:jc w:val="left"/>
+            </w:pPr>
+            <w:r>
+              <w:rPr>
+                <w:rFonts w:ascii="Arial" w:hAnsi="Arial" w:eastAsia="Arial" w:cs="Arial"/>
+                <w:b w:val="0"/>
+                <w:i w:val="0"/>
+                <w:color w:val="000000"/>
+                <w:sz w:val="22"/>
+              </w:rPr>
+              <w:t>Accelio Present Applied Technology</w:t>
+            </w:r>
+          </w:p>
+        </w:tc>
+      </w:tr>
+      <w:tr>
+        <w:trPr>
+          <w:trHeight w:val="914" w:hRule="atLeast"/>
+          <w:cantSplit/>
+        </w:trPr>
+        <w:tc>
+          <w:tcPr>
+            <w:tcW w:type="dxa" w:w="3420"/>
+            <w:vAlign w:val="top"/>
+            <w:tcMar>
+              <w:top w:w="129" w:type="dxa"/>
+              <w:right w:w="115" w:type="dxa"/>
+              <w:bottom w:w="83" w:type="dxa"/>
+              <w:left w:w="115" w:type="dxa"/>
+            </w:tcMar>
+            <w:tcBorders>
+              <w:top w:val="single" w:color="000000" w:sz="4" w:space="0"/>
+              <w:right w:val="single" w:color="000000" w:sz="4" w:space="0"/>
+              <w:bottom w:val="single" w:color="000000" w:sz="4" w:space="0"/>
+              <w:left w:val="single" w:color="000000" w:sz="4" w:space="0"/>
+            </w:tcBorders>
+          </w:tcPr>
+          <w:p>
+            <w:pPr>
+              <w:spacing w:before="0" w:after="0"/>
+              <w:ind w:left="0" w:right="0" w:firstLine="0"/>
+              <w:jc w:val="left"/>
+            </w:pPr>
+            <w:r>
+              <w:rPr>
+                <w:rFonts w:ascii="Arial" w:hAnsi="Arial" w:eastAsia="Arial" w:cs="Arial"/>
+                <w:b/>
+                <w:i w:val="0"/>
+                <w:color w:val="000000"/>
+                <w:sz w:val="22"/>
+              </w:rPr>
+              <w:t>Created and Tested Using:</w:t>
+            </w:r>
+          </w:p>
+        </w:tc>
+        <w:tc>
+          <w:tcPr>
+            <w:tcW w:type="dxa" w:w="5716"/>
+            <w:vAlign w:val="bottom"/>
+            <w:tcMar>
+              <w:top w:w="83" w:type="dxa"/>
+              <w:right w:w="115" w:type="dxa"/>
+              <w:bottom w:w="71" w:type="dxa"/>
+              <w:left w:w="115" w:type="dxa"/>
+            </w:tcMar>
+            <w:tcBorders>
+              <w:top w:val="single" w:color="000000" w:sz="4" w:space="0"/>
+              <w:right w:val="single" w:color="000000" w:sz="4" w:space="0"/>
+              <w:bottom w:val="single" w:color="000000" w:sz="4" w:space="0"/>
+              <w:left w:val="single" w:color="000000" w:sz="4" w:space="0"/>
+            </w:tcBorders>
+          </w:tcPr>
+          <w:p>
+            <w:pPr>
+              <w:spacing w:before="0" w:after="0"/>
+              <w:ind w:left="0" w:right="0" w:firstLine="0"/>
+              <w:jc w:val="left"/>
+            </w:pPr>
+            <w:r>
+              <w:rPr>
+                <w:rFonts w:ascii="Symbol" w:hAnsi="Symbol" w:eastAsia="Symbol" w:cs="Symbol"/>
+                <w:b w:val="0"/>
+                <w:i w:val="0"/>
+                <w:color w:val="000000"/>
+                <w:sz w:val="20"/>
+              </w:rPr>
+              <w:t xml:space="preserve">• </w:t>
+            </w:r>
+            <w:r>
+              <w:rPr>
+                <w:rFonts w:ascii="Arial" w:hAnsi="Arial" w:eastAsia="Arial" w:cs="Arial"/>
+                <w:b w:val="0"/>
+                <w:i w:val="0"/>
+                <w:color w:val="000000"/>
+                <w:sz w:val="22"/>
+              </w:rPr>
+              <w:t>Accelio Present Central 5.4</w:t>
+            </w:r>
+          </w:p>
+          <w:p>
+            <w:pPr>
+              <w:spacing w:before="0" w:after="0"/>
+              <w:ind w:left="0" w:right="0" w:firstLine="0"/>
+              <w:jc w:val="left"/>
+            </w:pPr>
+            <w:r>
+              <w:rPr>
+                <w:rFonts w:ascii="Symbol" w:hAnsi="Symbol" w:eastAsia="Symbol" w:cs="Symbol"/>
+                <w:b w:val="0"/>
+                <w:i w:val="0"/>
+                <w:color w:val="000000"/>
+                <w:sz w:val="20"/>
+              </w:rPr>
+              <w:t xml:space="preserve">• </w:t>
+            </w:r>
+            <w:r>
+              <w:rPr>
+                <w:rFonts w:ascii="Arial" w:hAnsi="Arial" w:eastAsia="Arial" w:cs="Arial"/>
+                <w:b w:val="0"/>
+                <w:i w:val="0"/>
+                <w:color w:val="000000"/>
+                <w:sz w:val="22"/>
+              </w:rPr>
+              <w:t>Accelio Present Output Designer 5.4</w:t>
+            </w:r>
+          </w:p>
+        </w:tc>
+      </w:tr>
+      <w:tr>
+        <w:trPr>
+          <w:trHeight w:val="910" w:hRule="atLeast"/>
+          <w:cantSplit/>
+        </w:trPr>
+        <w:tc>
+          <w:tcPr>
+            <w:tcW w:type="dxa" w:w="3420"/>
+            <w:vAlign w:val="top"/>
+            <w:tcMar>
+              <w:top w:w="129" w:type="dxa"/>
+              <w:right w:w="115" w:type="dxa"/>
+              <w:bottom w:w="83" w:type="dxa"/>
+              <w:left w:w="115" w:type="dxa"/>
+            </w:tcMar>
+            <w:tcBorders>
+              <w:top w:val="single" w:color="000000" w:sz="4" w:space="0"/>
+              <w:right w:val="single" w:color="000000" w:sz="4" w:space="0"/>
+              <w:bottom w:val="single" w:color="000000" w:sz="4" w:space="0"/>
+              <w:left w:val="single" w:color="000000" w:sz="4" w:space="0"/>
+            </w:tcBorders>
+          </w:tcPr>
+          <w:p>
+            <w:pPr>
+              <w:spacing w:before="0" w:after="0"/>
+              <w:ind w:left="0" w:right="0" w:firstLine="0"/>
+              <w:jc w:val="left"/>
+            </w:pPr>
+            <w:r>
+              <w:rPr>
+                <w:rFonts w:ascii="Arial" w:hAnsi="Arial" w:eastAsia="Arial" w:cs="Arial"/>
+                <w:b/>
+                <w:i w:val="0"/>
+                <w:color w:val="000000"/>
+                <w:sz w:val="22"/>
+              </w:rPr>
+              <w:t>Features Demonstrated:</w:t>
+            </w:r>
+          </w:p>
+        </w:tc>
+        <w:tc>
+          <w:tcPr>
+            <w:tcW w:type="dxa" w:w="5716"/>
+            <w:vAlign w:val="bottom"/>
+            <w:tcMar>
+              <w:top w:w="83" w:type="dxa"/>
+              <w:right w:w="115" w:type="dxa"/>
+              <w:bottom w:w="66" w:type="dxa"/>
+              <w:left w:w="115" w:type="dxa"/>
+            </w:tcMar>
+            <w:tcBorders>
+              <w:top w:val="single" w:color="000000" w:sz="4" w:space="0"/>
+              <w:right w:val="single" w:color="000000" w:sz="4" w:space="0"/>
+              <w:bottom w:val="single" w:color="000000" w:sz="4" w:space="0"/>
+              <w:left w:val="single" w:color="000000" w:sz="4" w:space="0"/>
+            </w:tcBorders>
+          </w:tcPr>
+          <w:p>
+            <w:pPr>
+              <w:spacing w:before="0" w:after="0"/>
+              <w:ind w:left="0" w:right="0" w:firstLine="0"/>
+              <w:jc w:val="left"/>
+            </w:pPr>
+            <w:r>
+              <w:rPr>
+                <w:rFonts w:ascii="Symbol" w:hAnsi="Symbol" w:eastAsia="Symbol" w:cs="Symbol"/>
+                <w:b w:val="0"/>
+                <w:i w:val="0"/>
+                <w:color w:val="000000"/>
+                <w:sz w:val="20"/>
+              </w:rPr>
+              <w:t xml:space="preserve">• </w:t>
+            </w:r>
+            <w:r>
+              <w:rPr>
+                <w:rFonts w:ascii="Arial" w:hAnsi="Arial" w:eastAsia="Arial" w:cs="Arial"/>
+                <w:b w:val="0"/>
+                <w:i w:val="0"/>
+                <w:color w:val="000000"/>
+                <w:sz w:val="22"/>
+              </w:rPr>
+              <w:t>Primary bookmarks in a PDF file.</w:t>
+            </w:r>
+          </w:p>
+          <w:p>
+            <w:pPr>
+              <w:spacing w:before="0" w:after="0"/>
+              <w:ind w:left="0" w:right="0" w:firstLine="0"/>
+              <w:jc w:val="left"/>
+            </w:pPr>
+            <w:r>
+              <w:rPr>
+                <w:rFonts w:ascii="Symbol" w:hAnsi="Symbol" w:eastAsia="Symbol" w:cs="Symbol"/>
+                <w:b w:val="0"/>
+                <w:i w:val="0"/>
+                <w:color w:val="000000"/>
+                <w:sz w:val="20"/>
+              </w:rPr>
+              <w:t xml:space="preserve">• </w:t>
+            </w:r>
+            <w:r>
+              <w:rPr>
+                <w:rFonts w:ascii="Arial" w:hAnsi="Arial" w:eastAsia="Arial" w:cs="Arial"/>
+                <w:b w:val="0"/>
+                <w:i w:val="0"/>
+                <w:color w:val="000000"/>
+                <w:sz w:val="22"/>
+              </w:rPr>
+              <w:t>Secondary bookmarks in a PDF file.</w:t>
+            </w:r>
+          </w:p>
+        </w:tc>
+      </w:tr>
+    </w:tbl>
     <w:p>
       <w:pPr>
         <w:keepLines/>
         <w:widowControl w:val="0"/>
-        <w:spacing w:before="840" w:after="0" w:line="240" w:lineRule="auto"/>
+        <w:spacing w:before="370" w:after="0" w:line="240" w:lineRule="auto"/>
         <w:ind w:left="0" w:right="0" w:firstLine="0"/>
         <w:jc w:val="left"/>
       </w:pPr>
@@ -731,11 +1121,556 @@
         <w:t>This sample package contains:</w:t>
       </w:r>
     </w:p>
+    <w:tbl>
+      <w:tblPr>
+        <w:tblW w:type="dxa" w:w="9182"/>
+        <w:jc w:val="left"/>
+        <w:tblLayout w:type="fixed"/>
+        <w:tblLook w:firstColumn="1" w:firstRow="1" w:lastColumn="0" w:lastRow="0" w:noHBand="0" w:noVBand="1" w:val="04A0"/>
+      </w:tblPr>
+      <w:tblGrid>
+        <w:gridCol w:w="3240"/>
+        <w:gridCol w:w="5942"/>
+      </w:tblGrid>
+      <w:tr>
+        <w:trPr>
+          <w:trHeight w:val="454" w:hRule="atLeast"/>
+          <w:cantSplit/>
+          <w:tblHeader w:val="true"/>
+        </w:trPr>
+        <w:tc>
+          <w:tcPr>
+            <w:tcW w:type="dxa" w:w="3240"/>
+            <w:vAlign w:val="center"/>
+            <w:tcMar>
+              <w:top w:w="82" w:type="dxa"/>
+              <w:right w:w="115" w:type="dxa"/>
+              <w:bottom w:w="82" w:type="dxa"/>
+              <w:left w:w="115" w:type="dxa"/>
+            </w:tcMar>
+            <w:tcBorders>
+              <w:top w:val="single" w:color="000000" w:sz="6" w:space="0"/>
+              <w:right w:val="single" w:color="000000" w:sz="6" w:space="0"/>
+              <w:bottom w:val="single" w:color="000000" w:sz="6" w:space="0"/>
+              <w:left w:val="single" w:color="000000" w:sz="6" w:space="0"/>
+            </w:tcBorders>
+          </w:tcPr>
+          <w:p>
+            <w:pPr>
+              <w:spacing w:before="0" w:after="0"/>
+              <w:ind w:left="0" w:right="0" w:firstLine="0"/>
+              <w:jc w:val="left"/>
+            </w:pPr>
+            <w:r>
+              <w:rPr>
+                <w:rFonts w:ascii="Arial" w:hAnsi="Arial" w:eastAsia="Arial" w:cs="Arial"/>
+                <w:b/>
+                <w:i w:val="0"/>
+                <w:color w:val="000000"/>
+                <w:sz w:val="22"/>
+              </w:rPr>
+              <w:t>Filename</w:t>
+            </w:r>
+          </w:p>
+        </w:tc>
+        <w:tc>
+          <w:tcPr>
+            <w:tcW w:type="dxa" w:w="5942"/>
+            <w:vAlign w:val="center"/>
+            <w:tcMar>
+              <w:top w:w="82" w:type="dxa"/>
+              <w:right w:w="115" w:type="dxa"/>
+              <w:bottom w:w="82" w:type="dxa"/>
+              <w:left w:w="115" w:type="dxa"/>
+            </w:tcMar>
+            <w:tcBorders>
+              <w:top w:val="single" w:color="000000" w:sz="6" w:space="0"/>
+              <w:right w:val="single" w:color="000000" w:sz="6" w:space="0"/>
+              <w:bottom w:val="single" w:color="000000" w:sz="6" w:space="0"/>
+              <w:left w:val="single" w:color="000000" w:sz="6" w:space="0"/>
+            </w:tcBorders>
+          </w:tcPr>
+          <w:p>
+            <w:pPr>
+              <w:spacing w:before="0" w:after="0"/>
+              <w:ind w:left="0" w:right="0" w:firstLine="0"/>
+              <w:jc w:val="left"/>
+            </w:pPr>
+            <w:r>
+              <w:rPr>
+                <w:rFonts w:ascii="Arial" w:hAnsi="Arial" w:eastAsia="Arial" w:cs="Arial"/>
+                <w:b/>
+                <w:i w:val="0"/>
+                <w:color w:val="000000"/>
+                <w:sz w:val="22"/>
+              </w:rPr>
+              <w:t>Description</w:t>
+            </w:r>
+          </w:p>
+        </w:tc>
+      </w:tr>
+      <w:tr>
+        <w:trPr>
+          <w:trHeight w:val="464" w:hRule="atLeast"/>
+          <w:cantSplit/>
+        </w:trPr>
+        <w:tc>
+          <w:tcPr>
+            <w:tcW w:type="dxa" w:w="3240"/>
+            <w:vAlign w:val="center"/>
+            <w:tcMar>
+              <w:top w:w="83" w:type="dxa"/>
+              <w:right w:w="115" w:type="dxa"/>
+              <w:bottom w:w="83" w:type="dxa"/>
+              <w:left w:w="115" w:type="dxa"/>
+            </w:tcMar>
+            <w:tcBorders>
+              <w:top w:val="single" w:color="000000" w:sz="6" w:space="0"/>
+              <w:right w:val="single" w:color="000000" w:sz="6" w:space="0"/>
+              <w:bottom w:val="single" w:color="000000" w:sz="6" w:space="0"/>
+              <w:left w:val="single" w:color="000000" w:sz="6" w:space="0"/>
+            </w:tcBorders>
+          </w:tcPr>
+          <w:p>
+            <w:pPr>
+              <w:spacing w:before="0" w:after="0"/>
+              <w:ind w:left="0" w:right="0" w:firstLine="0"/>
+              <w:jc w:val="left"/>
+            </w:pPr>
+            <w:r>
+              <w:rPr>
+                <w:rFonts w:ascii="Arial" w:hAnsi="Arial" w:eastAsia="Arial" w:cs="Arial"/>
+                <w:b w:val="0"/>
+                <w:i w:val="0"/>
+                <w:color w:val="000000"/>
+                <w:sz w:val="22"/>
+              </w:rPr>
+              <w:t>ap_bookmark.IFD</w:t>
+            </w:r>
+          </w:p>
+        </w:tc>
+        <w:tc>
+          <w:tcPr>
+            <w:tcW w:type="dxa" w:w="5942"/>
+            <w:vAlign w:val="center"/>
+            <w:tcMar>
+              <w:top w:w="83" w:type="dxa"/>
+              <w:right w:w="115" w:type="dxa"/>
+              <w:bottom w:w="83" w:type="dxa"/>
+              <w:left w:w="114" w:type="dxa"/>
+            </w:tcMar>
+            <w:tcBorders>
+              <w:top w:val="single" w:color="000000" w:sz="6" w:space="0"/>
+              <w:right w:val="single" w:color="000000" w:sz="6" w:space="0"/>
+              <w:bottom w:val="single" w:color="000000" w:sz="6" w:space="0"/>
+              <w:left w:val="single" w:color="000000" w:sz="6" w:space="0"/>
+            </w:tcBorders>
+          </w:tcPr>
+          <w:p>
+            <w:pPr>
+              <w:spacing w:before="0" w:after="0"/>
+              <w:ind w:left="0" w:right="0" w:firstLine="0"/>
+              <w:jc w:val="left"/>
+            </w:pPr>
+            <w:r>
+              <w:rPr>
+                <w:rFonts w:ascii="Arial" w:hAnsi="Arial" w:eastAsia="Arial" w:cs="Arial"/>
+                <w:b w:val="0"/>
+                <w:i w:val="0"/>
+                <w:color w:val="000000"/>
+                <w:sz w:val="22"/>
+              </w:rPr>
+              <w:t>The template design.</w:t>
+            </w:r>
+          </w:p>
+        </w:tc>
+      </w:tr>
+      <w:tr>
+        <w:trPr>
+          <w:trHeight w:val="458" w:hRule="atLeast"/>
+          <w:cantSplit/>
+        </w:trPr>
+        <w:tc>
+          <w:tcPr>
+            <w:tcW w:type="dxa" w:w="3240"/>
+            <w:vAlign w:val="center"/>
+            <w:tcMar>
+              <w:top w:w="81" w:type="dxa"/>
+              <w:right w:w="115" w:type="dxa"/>
+              <w:bottom w:w="81" w:type="dxa"/>
+              <w:left w:w="115" w:type="dxa"/>
+            </w:tcMar>
+            <w:tcBorders>
+              <w:top w:val="single" w:color="000000" w:sz="6" w:space="0"/>
+              <w:right w:val="single" w:color="000000" w:sz="6" w:space="0"/>
+              <w:bottom w:val="single" w:color="000000" w:sz="6" w:space="0"/>
+              <w:left w:val="single" w:color="000000" w:sz="6" w:space="0"/>
+            </w:tcBorders>
+          </w:tcPr>
+          <w:p>
+            <w:pPr>
+              <w:spacing w:before="0" w:after="0"/>
+              <w:ind w:left="0" w:right="0" w:firstLine="0"/>
+              <w:jc w:val="left"/>
+            </w:pPr>
+            <w:r>
+              <w:rPr>
+                <w:rFonts w:ascii="Arial" w:hAnsi="Arial" w:eastAsia="Arial" w:cs="Arial"/>
+                <w:b w:val="0"/>
+                <w:i w:val="0"/>
+                <w:color w:val="000000"/>
+                <w:sz w:val="22"/>
+              </w:rPr>
+              <w:t>ap_bookmark.mdf</w:t>
+            </w:r>
+          </w:p>
+        </w:tc>
+        <w:tc>
+          <w:tcPr>
+            <w:tcW w:type="dxa" w:w="5942"/>
+            <w:vAlign w:val="center"/>
+            <w:tcMar>
+              <w:top w:w="81" w:type="dxa"/>
+              <w:right w:w="115" w:type="dxa"/>
+              <w:bottom w:w="81" w:type="dxa"/>
+              <w:left w:w="114" w:type="dxa"/>
+            </w:tcMar>
+            <w:tcBorders>
+              <w:top w:val="single" w:color="000000" w:sz="6" w:space="0"/>
+              <w:right w:val="single" w:color="000000" w:sz="6" w:space="0"/>
+              <w:bottom w:val="single" w:color="000000" w:sz="6" w:space="0"/>
+              <w:left w:val="single" w:color="000000" w:sz="6" w:space="0"/>
+            </w:tcBorders>
+          </w:tcPr>
+          <w:p>
+            <w:pPr>
+              <w:spacing w:before="0" w:after="0"/>
+              <w:ind w:left="0" w:right="0" w:firstLine="0"/>
+              <w:jc w:val="left"/>
+            </w:pPr>
+            <w:r>
+              <w:rPr>
+                <w:rFonts w:ascii="Arial" w:hAnsi="Arial" w:eastAsia="Arial" w:cs="Arial"/>
+                <w:b w:val="0"/>
+                <w:i w:val="0"/>
+                <w:color w:val="000000"/>
+                <w:sz w:val="22"/>
+              </w:rPr>
+              <w:t>The template targeted for PDF output.</w:t>
+            </w:r>
+          </w:p>
+        </w:tc>
+      </w:tr>
+      <w:tr>
+        <w:trPr>
+          <w:trHeight w:val="461" w:hRule="atLeast"/>
+          <w:cantSplit/>
+        </w:trPr>
+        <w:tc>
+          <w:tcPr>
+            <w:tcW w:type="dxa" w:w="3240"/>
+            <w:vAlign w:val="center"/>
+            <w:tcMar>
+              <w:top w:w="83" w:type="dxa"/>
+              <w:right w:w="115" w:type="dxa"/>
+              <w:bottom w:w="83" w:type="dxa"/>
+              <w:left w:w="115" w:type="dxa"/>
+            </w:tcMar>
+            <w:tcBorders>
+              <w:top w:val="single" w:color="000000" w:sz="6" w:space="0"/>
+              <w:right w:val="single" w:color="000000" w:sz="6" w:space="0"/>
+              <w:bottom w:val="single" w:color="000000" w:sz="6" w:space="0"/>
+              <w:left w:val="single" w:color="000000" w:sz="6" w:space="0"/>
+            </w:tcBorders>
+          </w:tcPr>
+          <w:p>
+            <w:pPr>
+              <w:spacing w:before="0" w:after="0"/>
+              <w:ind w:left="0" w:right="0" w:firstLine="0"/>
+              <w:jc w:val="left"/>
+            </w:pPr>
+            <w:r>
+              <w:rPr>
+                <w:rFonts w:ascii="Arial" w:hAnsi="Arial" w:eastAsia="Arial" w:cs="Arial"/>
+                <w:b w:val="0"/>
+                <w:i w:val="0"/>
+                <w:color w:val="000000"/>
+                <w:sz w:val="22"/>
+              </w:rPr>
+              <w:t>ap_bookmark.dat</w:t>
+            </w:r>
+          </w:p>
+        </w:tc>
+        <w:tc>
+          <w:tcPr>
+            <w:tcW w:type="dxa" w:w="5942"/>
+            <w:vAlign w:val="center"/>
+            <w:tcMar>
+              <w:top w:w="83" w:type="dxa"/>
+              <w:right w:w="115" w:type="dxa"/>
+              <w:bottom w:w="83" w:type="dxa"/>
+              <w:left w:w="113" w:type="dxa"/>
+            </w:tcMar>
+            <w:tcBorders>
+              <w:top w:val="single" w:color="000000" w:sz="6" w:space="0"/>
+              <w:right w:val="single" w:color="000000" w:sz="6" w:space="0"/>
+              <w:bottom w:val="single" w:color="000000" w:sz="6" w:space="0"/>
+              <w:left w:val="single" w:color="000000" w:sz="6" w:space="0"/>
+            </w:tcBorders>
+          </w:tcPr>
+          <w:p>
+            <w:pPr>
+              <w:spacing w:before="0" w:after="0"/>
+              <w:ind w:left="0" w:right="0" w:firstLine="0"/>
+              <w:jc w:val="left"/>
+            </w:pPr>
+            <w:r>
+              <w:rPr>
+                <w:rFonts w:ascii="Arial" w:hAnsi="Arial" w:eastAsia="Arial" w:cs="Arial"/>
+                <w:b w:val="0"/>
+                <w:i w:val="0"/>
+                <w:color w:val="000000"/>
+                <w:sz w:val="22"/>
+              </w:rPr>
+              <w:t>A sample data file in DAT format.</w:t>
+            </w:r>
+          </w:p>
+        </w:tc>
+      </w:tr>
+      <w:tr>
+        <w:trPr>
+          <w:trHeight w:val="461" w:hRule="atLeast"/>
+          <w:cantSplit/>
+        </w:trPr>
+        <w:tc>
+          <w:tcPr>
+            <w:tcW w:type="dxa" w:w="3240"/>
+            <w:vAlign w:val="center"/>
+            <w:tcMar>
+              <w:top w:w="83" w:type="dxa"/>
+              <w:right w:w="115" w:type="dxa"/>
+              <w:bottom w:w="83" w:type="dxa"/>
+              <w:left w:w="115" w:type="dxa"/>
+            </w:tcMar>
+            <w:tcBorders>
+              <w:top w:val="single" w:color="000000" w:sz="6" w:space="0"/>
+              <w:right w:val="single" w:color="000000" w:sz="6" w:space="0"/>
+              <w:bottom w:val="single" w:color="000000" w:sz="6" w:space="0"/>
+              <w:left w:val="single" w:color="000000" w:sz="6" w:space="0"/>
+            </w:tcBorders>
+          </w:tcPr>
+          <w:p>
+            <w:pPr>
+              <w:spacing w:before="0" w:after="0"/>
+              <w:ind w:left="0" w:right="0" w:firstLine="0"/>
+              <w:jc w:val="left"/>
+            </w:pPr>
+            <w:r>
+              <w:rPr>
+                <w:rFonts w:ascii="Arial" w:hAnsi="Arial" w:eastAsia="Arial" w:cs="Arial"/>
+                <w:b w:val="0"/>
+                <w:i w:val="0"/>
+                <w:color w:val="000000"/>
+                <w:sz w:val="22"/>
+              </w:rPr>
+              <w:t>ap_bookmark.bmk</w:t>
+            </w:r>
+          </w:p>
+        </w:tc>
+        <w:tc>
+          <w:tcPr>
+            <w:tcW w:type="dxa" w:w="5942"/>
+            <w:vAlign w:val="center"/>
+            <w:tcMar>
+              <w:top w:w="83" w:type="dxa"/>
+              <w:right w:w="115" w:type="dxa"/>
+              <w:bottom w:w="83" w:type="dxa"/>
+              <w:left w:w="114" w:type="dxa"/>
+            </w:tcMar>
+            <w:tcBorders>
+              <w:top w:val="single" w:color="000000" w:sz="6" w:space="0"/>
+              <w:right w:val="single" w:color="000000" w:sz="6" w:space="0"/>
+              <w:bottom w:val="single" w:color="000000" w:sz="6" w:space="0"/>
+              <w:left w:val="single" w:color="000000" w:sz="6" w:space="0"/>
+            </w:tcBorders>
+          </w:tcPr>
+          <w:p>
+            <w:pPr>
+              <w:spacing w:before="0" w:after="0"/>
+              <w:ind w:left="0" w:right="0" w:firstLine="0"/>
+              <w:jc w:val="left"/>
+            </w:pPr>
+            <w:r>
+              <w:rPr>
+                <w:rFonts w:ascii="Arial" w:hAnsi="Arial" w:eastAsia="Arial" w:cs="Arial"/>
+                <w:b w:val="0"/>
+                <w:i w:val="0"/>
+                <w:color w:val="000000"/>
+                <w:sz w:val="22"/>
+              </w:rPr>
+              <w:t>A sample bookmark file.</w:t>
+            </w:r>
+          </w:p>
+        </w:tc>
+      </w:tr>
+      <w:tr>
+        <w:trPr>
+          <w:trHeight w:val="458" w:hRule="atLeast"/>
+          <w:cantSplit/>
+        </w:trPr>
+        <w:tc>
+          <w:tcPr>
+            <w:tcW w:type="dxa" w:w="3240"/>
+            <w:vAlign w:val="center"/>
+            <w:tcMar>
+              <w:top w:w="81" w:type="dxa"/>
+              <w:right w:w="115" w:type="dxa"/>
+              <w:bottom w:w="81" w:type="dxa"/>
+              <w:left w:w="115" w:type="dxa"/>
+            </w:tcMar>
+            <w:tcBorders>
+              <w:top w:val="single" w:color="000000" w:sz="6" w:space="0"/>
+              <w:right w:val="single" w:color="000000" w:sz="6" w:space="0"/>
+              <w:bottom w:val="single" w:color="000000" w:sz="6" w:space="0"/>
+              <w:left w:val="single" w:color="000000" w:sz="6" w:space="0"/>
+            </w:tcBorders>
+          </w:tcPr>
+          <w:p>
+            <w:pPr>
+              <w:spacing w:before="0" w:after="0"/>
+              <w:ind w:left="0" w:right="0" w:firstLine="0"/>
+              <w:jc w:val="left"/>
+            </w:pPr>
+            <w:r>
+              <w:rPr>
+                <w:rFonts w:ascii="Arial" w:hAnsi="Arial" w:eastAsia="Arial" w:cs="Arial"/>
+                <w:b w:val="0"/>
+                <w:i w:val="0"/>
+                <w:color w:val="000000"/>
+                <w:sz w:val="22"/>
+              </w:rPr>
+              <w:t>ap_bookmark.pdf</w:t>
+            </w:r>
+          </w:p>
+        </w:tc>
+        <w:tc>
+          <w:tcPr>
+            <w:tcW w:type="dxa" w:w="5942"/>
+            <w:vAlign w:val="center"/>
+            <w:tcMar>
+              <w:top w:w="81" w:type="dxa"/>
+              <w:right w:w="115" w:type="dxa"/>
+              <w:bottom w:w="81" w:type="dxa"/>
+              <w:left w:w="113" w:type="dxa"/>
+            </w:tcMar>
+            <w:tcBorders>
+              <w:top w:val="single" w:color="000000" w:sz="6" w:space="0"/>
+              <w:right w:val="single" w:color="000000" w:sz="6" w:space="0"/>
+              <w:bottom w:val="single" w:color="000000" w:sz="6" w:space="0"/>
+              <w:left w:val="single" w:color="000000" w:sz="6" w:space="0"/>
+            </w:tcBorders>
+          </w:tcPr>
+          <w:p>
+            <w:pPr>
+              <w:spacing w:before="0" w:after="0"/>
+              <w:ind w:left="0" w:right="0" w:firstLine="0"/>
+              <w:jc w:val="left"/>
+            </w:pPr>
+            <w:r>
+              <w:rPr>
+                <w:rFonts w:ascii="Arial" w:hAnsi="Arial" w:eastAsia="Arial" w:cs="Arial"/>
+                <w:b w:val="0"/>
+                <w:i w:val="0"/>
+                <w:color w:val="000000"/>
+                <w:sz w:val="22"/>
+              </w:rPr>
+              <w:t>Sample PDF output.</w:t>
+            </w:r>
+          </w:p>
+        </w:tc>
+      </w:tr>
+      <w:tr>
+        <w:trPr>
+          <w:trHeight w:val="463" w:hRule="atLeast"/>
+          <w:cantSplit/>
+        </w:trPr>
+        <w:tc>
+          <w:tcPr>
+            <w:tcW w:type="dxa" w:w="3240"/>
+            <w:vAlign w:val="center"/>
+            <w:tcMar>
+              <w:top w:w="85" w:type="dxa"/>
+              <w:right w:w="115" w:type="dxa"/>
+              <w:bottom w:w="85" w:type="dxa"/>
+              <w:left w:w="115" w:type="dxa"/>
+            </w:tcMar>
+            <w:tcBorders>
+              <w:top w:val="single" w:color="000000" w:sz="6" w:space="0"/>
+              <w:right w:val="single" w:color="000000" w:sz="6" w:space="0"/>
+              <w:bottom w:val="single" w:color="000000" w:sz="6" w:space="0"/>
+              <w:left w:val="single" w:color="000000" w:sz="6" w:space="0"/>
+            </w:tcBorders>
+          </w:tcPr>
+          <w:p>
+            <w:pPr>
+              <w:spacing w:before="0" w:after="0"/>
+              <w:ind w:left="0" w:right="0" w:firstLine="0"/>
+              <w:jc w:val="left"/>
+            </w:pPr>
+            <w:r>
+              <w:rPr>
+                <w:rFonts w:ascii="Arial" w:hAnsi="Arial" w:eastAsia="Arial" w:cs="Arial"/>
+                <w:b w:val="0"/>
+                <w:i w:val="0"/>
+                <w:color w:val="000000"/>
+                <w:sz w:val="22"/>
+              </w:rPr>
+              <w:t>ap_bookmark_doc.pdf</w:t>
+            </w:r>
+          </w:p>
+        </w:tc>
+        <w:tc>
+          <w:tcPr>
+            <w:tcW w:type="dxa" w:w="5942"/>
+            <w:vAlign w:val="center"/>
+            <w:tcMar>
+              <w:top w:w="85" w:type="dxa"/>
+              <w:right w:w="115" w:type="dxa"/>
+              <w:bottom w:w="85" w:type="dxa"/>
+              <w:left w:w="114" w:type="dxa"/>
+            </w:tcMar>
+            <w:tcBorders>
+              <w:top w:val="single" w:color="000000" w:sz="6" w:space="0"/>
+              <w:right w:val="single" w:color="000000" w:sz="6" w:space="0"/>
+              <w:bottom w:val="single" w:color="000000" w:sz="6" w:space="0"/>
+              <w:left w:val="single" w:color="000000" w:sz="6" w:space="0"/>
+            </w:tcBorders>
+          </w:tcPr>
+          <w:p>
+            <w:pPr>
+              <w:spacing w:before="0" w:after="0"/>
+              <w:ind w:left="0" w:right="0" w:firstLine="0"/>
+              <w:jc w:val="left"/>
+            </w:pPr>
+            <w:r>
+              <w:rPr>
+                <w:rFonts w:ascii="Arial" w:hAnsi="Arial" w:eastAsia="Arial" w:cs="Arial"/>
+                <w:b w:val="0"/>
+                <w:i w:val="0"/>
+                <w:color w:val="000000"/>
+                <w:sz w:val="22"/>
+              </w:rPr>
+              <w:t>A document describing the sample.</w:t>
+            </w:r>
+          </w:p>
+        </w:tc>
+      </w:tr>
+    </w:tbl>
     <w:p>
       <w:pPr>
         <w:keepLines/>
         <w:widowControl w:val="0"/>
-        <w:spacing w:before="840" w:after="0" w:line="240" w:lineRule="auto"/>
+        <w:spacing w:before="370" w:after="0" w:line="240" w:lineRule="auto"/>
         <w:ind w:left="0" w:right="0" w:firstLine="0"/>
         <w:jc w:val="left"/>
       </w:pPr>
@@ -1023,6 +1958,413 @@
         <w:t>For example,</w:t>
       </w:r>
     </w:p>
+    <w:tbl>
+      <w:tblPr>
+        <w:tblW w:type="dxa" w:w="8816"/>
+        <w:jc w:val="left"/>
+        <w:tblLayout w:type="fixed"/>
+        <w:tblLook w:firstColumn="1" w:firstRow="1" w:lastColumn="0" w:lastRow="0" w:noHBand="0" w:noVBand="1" w:val="04A0"/>
+      </w:tblPr>
+      <w:tblGrid>
+        <w:gridCol w:w="2785"/>
+        <w:gridCol w:w="6031"/>
+      </w:tblGrid>
+      <w:tr>
+        <w:trPr>
+          <w:trHeight w:val="458" w:hRule="atLeast"/>
+          <w:cantSplit/>
+          <w:tblHeader w:val="true"/>
+        </w:trPr>
+        <w:tc>
+          <w:tcPr>
+            <w:tcW w:type="dxa" w:w="2785"/>
+            <w:vAlign w:val="center"/>
+            <w:tcMar>
+              <w:top w:w="83" w:type="dxa"/>
+              <w:right w:w="118" w:type="dxa"/>
+              <w:bottom w:w="83" w:type="dxa"/>
+              <w:left w:w="116" w:type="dxa"/>
+            </w:tcMar>
+            <w:tcBorders>
+              <w:top w:val="single" w:color="000000" w:sz="4" w:space="0"/>
+              <w:right w:val="single" w:color="000000" w:sz="4" w:space="0"/>
+              <w:bottom w:val="single" w:color="000000" w:sz="4" w:space="0"/>
+              <w:left w:val="single" w:color="000000" w:sz="4" w:space="0"/>
+            </w:tcBorders>
+          </w:tcPr>
+          <w:p>
+            <w:pPr>
+              <w:spacing w:before="0" w:after="0"/>
+              <w:ind w:left="0" w:right="0" w:firstLine="0"/>
+              <w:jc w:val="left"/>
+            </w:pPr>
+            <w:r>
+              <w:rPr>
+                <w:rFonts w:ascii="Arial" w:hAnsi="Arial" w:eastAsia="Arial" w:cs="Arial"/>
+                <w:b/>
+                <w:i w:val="0"/>
+                <w:color w:val="000000"/>
+                <w:sz w:val="22"/>
+              </w:rPr>
+              <w:t>To bookmark by …</w:t>
+            </w:r>
+          </w:p>
+        </w:tc>
+        <w:tc>
+          <w:tcPr>
+            <w:tcW w:type="dxa" w:w="6031"/>
+            <w:vAlign w:val="center"/>
+            <w:tcMar>
+              <w:top w:w="83" w:type="dxa"/>
+              <w:right w:w="118" w:type="dxa"/>
+              <w:bottom w:w="83" w:type="dxa"/>
+              <w:left w:w="119" w:type="dxa"/>
+            </w:tcMar>
+            <w:tcBorders>
+              <w:top w:val="single" w:color="000000" w:sz="4" w:space="0"/>
+              <w:right w:val="single" w:color="000000" w:sz="4" w:space="0"/>
+              <w:bottom w:val="single" w:color="000000" w:sz="4" w:space="0"/>
+              <w:left w:val="single" w:color="000000" w:sz="4" w:space="0"/>
+            </w:tcBorders>
+          </w:tcPr>
+          <w:p>
+            <w:pPr>
+              <w:spacing w:before="0" w:after="0"/>
+              <w:ind w:left="0" w:right="0" w:firstLine="0"/>
+              <w:jc w:val="left"/>
+            </w:pPr>
+            <w:r>
+              <w:rPr>
+                <w:rFonts w:ascii="Arial" w:hAnsi="Arial" w:eastAsia="Arial" w:cs="Arial"/>
+                <w:b/>
+                <w:i w:val="0"/>
+                <w:color w:val="000000"/>
+                <w:sz w:val="22"/>
+              </w:rPr>
+              <w:t>Use the command line parameter …</w:t>
+            </w:r>
+          </w:p>
+        </w:tc>
+      </w:tr>
+      <w:tr>
+        <w:trPr>
+          <w:trHeight w:val="454" w:hRule="atLeast"/>
+          <w:cantSplit/>
+        </w:trPr>
+        <w:tc>
+          <w:tcPr>
+            <w:tcW w:type="dxa" w:w="2785"/>
+            <w:vAlign w:val="center"/>
+            <w:tcMar>
+              <w:top w:w="78" w:type="dxa"/>
+              <w:right w:w="118" w:type="dxa"/>
+              <w:bottom w:w="78" w:type="dxa"/>
+              <w:left w:w="116" w:type="dxa"/>
+            </w:tcMar>
+            <w:tcBorders>
+              <w:top w:val="single" w:color="000000" w:sz="4" w:space="0"/>
+              <w:right w:val="single" w:color="000000" w:sz="4" w:space="0"/>
+              <w:bottom w:val="single" w:color="000000" w:sz="4" w:space="0"/>
+              <w:left w:val="single" w:color="000000" w:sz="4" w:space="0"/>
+            </w:tcBorders>
+          </w:tcPr>
+          <w:p>
+            <w:pPr>
+              <w:spacing w:before="0" w:after="0"/>
+              <w:ind w:left="0" w:right="0" w:firstLine="0"/>
+              <w:jc w:val="left"/>
+            </w:pPr>
+            <w:r>
+              <w:rPr>
+                <w:rFonts w:ascii="Arial" w:hAnsi="Arial" w:eastAsia="Arial" w:cs="Arial"/>
+                <w:b w:val="0"/>
+                <w:i w:val="0"/>
+                <w:color w:val="000000"/>
+                <w:sz w:val="22"/>
+              </w:rPr>
+              <w:t>Invoices</w:t>
+            </w:r>
+          </w:p>
+        </w:tc>
+        <w:tc>
+          <w:tcPr>
+            <w:tcW w:type="dxa" w:w="6031"/>
+            <w:vAlign w:val="center"/>
+            <w:tcMar>
+              <w:top w:w="85" w:type="dxa"/>
+              <w:right w:w="118" w:type="dxa"/>
+              <w:bottom w:w="85" w:type="dxa"/>
+              <w:left w:w="120" w:type="dxa"/>
+            </w:tcMar>
+            <w:tcBorders>
+              <w:top w:val="single" w:color="000000" w:sz="4" w:space="0"/>
+              <w:right w:val="single" w:color="000000" w:sz="4" w:space="0"/>
+              <w:bottom w:val="single" w:color="000000" w:sz="4" w:space="0"/>
+              <w:left w:val="single" w:color="000000" w:sz="4" w:space="0"/>
+            </w:tcBorders>
+          </w:tcPr>
+          <w:p>
+            <w:pPr>
+              <w:spacing w:before="0" w:after="0"/>
+              <w:ind w:left="0" w:right="0" w:firstLine="0"/>
+              <w:jc w:val="left"/>
+            </w:pPr>
+            <w:r>
+              <w:rPr>
+                <w:rFonts w:ascii="Courier" w:hAnsi="Courier" w:eastAsia="Courier" w:cs="Courier"/>
+                <w:b/>
+                <w:i w:val="0"/>
+                <w:color w:val="000000"/>
+                <w:sz w:val="20"/>
+              </w:rPr>
+              <w:t>-abmk</w:t>
+            </w:r>
+            <w:r>
+              <w:rPr>
+                <w:rFonts w:ascii="Courier" w:hAnsi="Courier" w:eastAsia="Courier" w:cs="Courier"/>
+                <w:b w:val="0"/>
+                <w:i w:val="0"/>
+                <w:color w:val="000000"/>
+                <w:sz w:val="20"/>
+              </w:rPr>
+              <w:t xml:space="preserve">ap_bookmark.bmk </w:t>
+            </w:r>
+            <w:r>
+              <w:rPr>
+                <w:rFonts w:ascii="Courier" w:hAnsi="Courier" w:eastAsia="Courier" w:cs="Courier"/>
+                <w:b/>
+                <w:i w:val="0"/>
+                <w:color w:val="000000"/>
+                <w:sz w:val="20"/>
+              </w:rPr>
+              <w:t>-abms</w:t>
+            </w:r>
+            <w:r>
+              <w:rPr>
+                <w:rFonts w:ascii="Courier" w:hAnsi="Courier" w:eastAsia="Courier" w:cs="Courier"/>
+                <w:b w:val="0"/>
+                <w:i w:val="0"/>
+                <w:color w:val="000000"/>
+                <w:sz w:val="20"/>
+              </w:rPr>
+              <w:t>invoices</w:t>
+            </w:r>
+          </w:p>
+        </w:tc>
+      </w:tr>
+      <w:tr>
+        <w:trPr>
+          <w:trHeight w:val="456" w:hRule="atLeast"/>
+          <w:cantSplit/>
+        </w:trPr>
+        <w:tc>
+          <w:tcPr>
+            <w:tcW w:type="dxa" w:w="2785"/>
+            <w:vAlign w:val="center"/>
+            <w:tcMar>
+              <w:top w:w="81" w:type="dxa"/>
+              <w:right w:w="118" w:type="dxa"/>
+              <w:bottom w:w="81" w:type="dxa"/>
+              <w:left w:w="116" w:type="dxa"/>
+            </w:tcMar>
+            <w:tcBorders>
+              <w:top w:val="single" w:color="000000" w:sz="4" w:space="0"/>
+              <w:right w:val="single" w:color="000000" w:sz="4" w:space="0"/>
+              <w:bottom w:val="single" w:color="000000" w:sz="4" w:space="0"/>
+              <w:left w:val="single" w:color="000000" w:sz="4" w:space="0"/>
+            </w:tcBorders>
+          </w:tcPr>
+          <w:p>
+            <w:pPr>
+              <w:spacing w:before="0" w:after="0"/>
+              <w:ind w:left="0" w:right="0" w:firstLine="0"/>
+              <w:jc w:val="left"/>
+            </w:pPr>
+            <w:r>
+              <w:rPr>
+                <w:rFonts w:ascii="Arial" w:hAnsi="Arial" w:eastAsia="Arial" w:cs="Arial"/>
+                <w:b w:val="0"/>
+                <w:i w:val="0"/>
+                <w:color w:val="000000"/>
+                <w:sz w:val="22"/>
+              </w:rPr>
+              <w:t>Type</w:t>
+            </w:r>
+          </w:p>
+        </w:tc>
+        <w:tc>
+          <w:tcPr>
+            <w:tcW w:type="dxa" w:w="6031"/>
+            <w:vAlign w:val="center"/>
+            <w:tcMar>
+              <w:top w:w="87" w:type="dxa"/>
+              <w:right w:w="118" w:type="dxa"/>
+              <w:bottom w:w="87" w:type="dxa"/>
+              <w:left w:w="120" w:type="dxa"/>
+            </w:tcMar>
+            <w:tcBorders>
+              <w:top w:val="single" w:color="000000" w:sz="4" w:space="0"/>
+              <w:right w:val="single" w:color="000000" w:sz="4" w:space="0"/>
+              <w:bottom w:val="single" w:color="000000" w:sz="4" w:space="0"/>
+              <w:left w:val="single" w:color="000000" w:sz="4" w:space="0"/>
+            </w:tcBorders>
+          </w:tcPr>
+          <w:p>
+            <w:pPr>
+              <w:spacing w:before="0" w:after="0"/>
+              <w:ind w:left="0" w:right="0" w:firstLine="0"/>
+              <w:jc w:val="left"/>
+            </w:pPr>
+            <w:r>
+              <w:rPr>
+                <w:rFonts w:ascii="Courier" w:hAnsi="Courier" w:eastAsia="Courier" w:cs="Courier"/>
+                <w:b/>
+                <w:i w:val="0"/>
+                <w:color w:val="000000"/>
+                <w:sz w:val="20"/>
+              </w:rPr>
+              <w:t>-abmk</w:t>
+            </w:r>
+            <w:r>
+              <w:rPr>
+                <w:rFonts w:ascii="Courier" w:hAnsi="Courier" w:eastAsia="Courier" w:cs="Courier"/>
+                <w:b w:val="0"/>
+                <w:i w:val="0"/>
+                <w:color w:val="000000"/>
+                <w:sz w:val="20"/>
+              </w:rPr>
+              <w:t xml:space="preserve">ap_bookmark.bmk </w:t>
+            </w:r>
+            <w:r>
+              <w:rPr>
+                <w:rFonts w:ascii="Courier" w:hAnsi="Courier" w:eastAsia="Courier" w:cs="Courier"/>
+                <w:b/>
+                <w:i w:val="0"/>
+                <w:color w:val="000000"/>
+                <w:sz w:val="20"/>
+              </w:rPr>
+              <w:t>-abms</w:t>
+            </w:r>
+            <w:r>
+              <w:rPr>
+                <w:rFonts w:ascii="Courier" w:hAnsi="Courier" w:eastAsia="Courier" w:cs="Courier"/>
+                <w:b w:val="0"/>
+                <w:i w:val="0"/>
+                <w:color w:val="000000"/>
+                <w:sz w:val="20"/>
+              </w:rPr>
+              <w:t>type</w:t>
+            </w:r>
+          </w:p>
+        </w:tc>
+      </w:tr>
+      <w:tr>
+        <w:trPr>
+          <w:trHeight w:val="458" w:hRule="atLeast"/>
+          <w:cantSplit/>
+        </w:trPr>
+        <w:tc>
+          <w:tcPr>
+            <w:tcW w:type="dxa" w:w="2785"/>
+            <w:vAlign w:val="center"/>
+            <w:tcMar>
+              <w:top w:w="82" w:type="dxa"/>
+              <w:right w:w="118" w:type="dxa"/>
+              <w:bottom w:w="82" w:type="dxa"/>
+              <w:left w:w="116" w:type="dxa"/>
+            </w:tcMar>
+            <w:tcBorders>
+              <w:top w:val="single" w:color="000000" w:sz="4" w:space="0"/>
+              <w:right w:val="single" w:color="000000" w:sz="4" w:space="0"/>
+              <w:bottom w:val="single" w:color="000000" w:sz="4" w:space="0"/>
+              <w:left w:val="single" w:color="000000" w:sz="4" w:space="0"/>
+            </w:tcBorders>
+          </w:tcPr>
+          <w:p>
+            <w:pPr>
+              <w:spacing w:before="0" w:after="0"/>
+              <w:ind w:left="0" w:right="0" w:firstLine="0"/>
+              <w:jc w:val="left"/>
+            </w:pPr>
+            <w:r>
+              <w:rPr>
+                <w:rFonts w:ascii="Arial" w:hAnsi="Arial" w:eastAsia="Arial" w:cs="Arial"/>
+                <w:b w:val="0"/>
+                <w:i w:val="0"/>
+                <w:color w:val="000000"/>
+                <w:sz w:val="22"/>
+              </w:rPr>
+              <w:t>Amount</w:t>
+            </w:r>
+          </w:p>
+        </w:tc>
+        <w:tc>
+          <w:tcPr>
+            <w:tcW w:type="dxa" w:w="6031"/>
+            <w:vAlign w:val="center"/>
+            <w:tcMar>
+              <w:top w:w="89" w:type="dxa"/>
+              <w:right w:w="118" w:type="dxa"/>
+              <w:bottom w:w="89" w:type="dxa"/>
+              <w:left w:w="120" w:type="dxa"/>
+            </w:tcMar>
+            <w:tcBorders>
+              <w:top w:val="single" w:color="000000" w:sz="4" w:space="0"/>
+              <w:right w:val="single" w:color="000000" w:sz="4" w:space="0"/>
+              <w:bottom w:val="single" w:color="000000" w:sz="4" w:space="0"/>
+              <w:left w:val="single" w:color="000000" w:sz="4" w:space="0"/>
+            </w:tcBorders>
+          </w:tcPr>
+          <w:p>
+            <w:pPr>
+              <w:spacing w:before="0" w:after="0"/>
+              <w:ind w:left="0" w:right="0" w:firstLine="0"/>
+              <w:jc w:val="left"/>
+            </w:pPr>
+            <w:r>
+              <w:rPr>
+                <w:rFonts w:ascii="Courier" w:hAnsi="Courier" w:eastAsia="Courier" w:cs="Courier"/>
+                <w:b/>
+                <w:i w:val="0"/>
+                <w:color w:val="000000"/>
+                <w:sz w:val="20"/>
+              </w:rPr>
+              <w:t>-abmk</w:t>
+            </w:r>
+            <w:r>
+              <w:rPr>
+                <w:rFonts w:ascii="Courier" w:hAnsi="Courier" w:eastAsia="Courier" w:cs="Courier"/>
+                <w:b w:val="0"/>
+                <w:i w:val="0"/>
+                <w:color w:val="000000"/>
+                <w:sz w:val="20"/>
+              </w:rPr>
+              <w:t xml:space="preserve">ap_bookmark.bmk </w:t>
+            </w:r>
+            <w:r>
+              <w:rPr>
+                <w:rFonts w:ascii="Courier" w:hAnsi="Courier" w:eastAsia="Courier" w:cs="Courier"/>
+                <w:b/>
+                <w:i w:val="0"/>
+                <w:color w:val="000000"/>
+                <w:sz w:val="20"/>
+              </w:rPr>
+              <w:t>-abms</w:t>
+            </w:r>
+            <w:r>
+              <w:rPr>
+                <w:rFonts w:ascii="Courier" w:hAnsi="Courier" w:eastAsia="Courier" w:cs="Courier"/>
+                <w:b w:val="0"/>
+                <w:i w:val="0"/>
+                <w:color w:val="000000"/>
+                <w:sz w:val="20"/>
+              </w:rPr>
+              <w:t>amount</w:t>
+            </w:r>
+          </w:p>
+        </w:tc>
+      </w:tr>
+    </w:tbl>
     <w:p>
       <w:pPr>
         <w:numPr>

</xml_diff>

<commit_message>
Step 64G.1.5 - Integrate inline images into render plan
</commit_message>
<xml_diff>
--- a/output/editable.docx
+++ b/output/editable.docx
@@ -500,9 +500,52 @@
     </w:p>
     <w:p>
       <w:pPr>
+        <w:keepNext w:val="0"/>
+        <w:keepLines/>
+        <w:spacing w:before="0" w:after="0"/>
+        <w:ind w:left="0" w:right="0" w:firstLine="0"/>
+        <w:jc w:val="center"/>
+      </w:pPr>
+      <w:r>
+        <w:drawing>
+          <wp:inline xmlns:a="http://schemas.openxmlformats.org/drawingml/2006/main" xmlns:pic="http://schemas.openxmlformats.org/drawingml/2006/picture">
+            <wp:extent cx="5892816" cy="2896882"/>
+            <wp:docPr id="1" name="image:1:2" title="image:1:2" descr="Image imported from PDF"/>
+            <wp:cNvGraphicFramePr>
+              <a:graphicFrameLocks noChangeAspect="1"/>
+            </wp:cNvGraphicFramePr>
+            <a:graphic>
+              <a:graphicData uri="http://schemas.openxmlformats.org/drawingml/2006/picture">
+                <pic:pic>
+                  <pic:nvPicPr>
+                    <pic:cNvPr id="0" name="image.png"/>
+                    <pic:cNvPicPr/>
+                  </pic:nvPicPr>
+                  <pic:blipFill>
+                    <a:blip r:embed="rId11"/>
+                    <a:stretch>
+                      <a:fillRect/>
+                    </a:stretch>
+                  </pic:blipFill>
+                  <pic:spPr>
+                    <a:xfrm>
+                      <a:off x="0" y="0"/>
+                      <a:ext cx="5892816" cy="2896882"/>
+                    </a:xfrm>
+                    <a:prstGeom prst="rect"/>
+                  </pic:spPr>
+                </pic:pic>
+              </a:graphicData>
+            </a:graphic>
+          </wp:inline>
+        </w:drawing>
+      </w:r>
+    </w:p>
+    <w:p>
+      <w:pPr>
         <w:keepLines/>
         <w:widowControl w:val="0"/>
-        <w:spacing w:before="840" w:after="0" w:line="240" w:lineRule="auto"/>
+        <w:spacing w:before="124" w:after="0" w:line="240" w:lineRule="auto"/>
         <w:ind w:left="0" w:right="0" w:firstLine="0"/>
         <w:jc w:val="left"/>
       </w:pPr>

</xml_diff>

<commit_message>
Step 64G.1.7 - Integrate floating images into render plan
</commit_message>
<xml_diff>
--- a/output/editable.docx
+++ b/output/editable.docx
@@ -2,6 +2,56 @@
 <file path=word/document.xml><?xml version="1.0" encoding="utf-8"?>
 <w:document xmlns:wpc="http://schemas.microsoft.com/office/word/2010/wordprocessingCanvas" xmlns:mo="http://schemas.microsoft.com/office/mac/office/2008/main" xmlns:mc="http://schemas.openxmlformats.org/markup-compatibility/2006" xmlns:mv="urn:schemas-microsoft-com:mac:vml" xmlns:o="urn:schemas-microsoft-com:office:office" xmlns:r="http://schemas.openxmlformats.org/officeDocument/2006/relationships" xmlns:m="http://schemas.openxmlformats.org/officeDocument/2006/math" xmlns:v="urn:schemas-microsoft-com:vml" xmlns:wp14="http://schemas.microsoft.com/office/word/2010/wordprocessingDrawing" xmlns:wp="http://schemas.openxmlformats.org/drawingml/2006/wordprocessingDrawing" xmlns:w10="urn:schemas-microsoft-com:office:word" xmlns:w="http://schemas.openxmlformats.org/wordprocessingml/2006/main" xmlns:w14="http://schemas.microsoft.com/office/word/2010/wordml" xmlns:wpg="http://schemas.microsoft.com/office/word/2010/wordprocessingGroup" xmlns:wpi="http://schemas.microsoft.com/office/word/2010/wordprocessingInk" xmlns:wne="http://schemas.microsoft.com/office/word/2006/wordml" xmlns:wps="http://schemas.microsoft.com/office/word/2010/wordprocessingShape" mc:Ignorable="w14 wp14">
   <w:body>
+    <w:p>
+      <w:pPr>
+        <w:keepLines/>
+        <w:spacing w:before="0" w:after="0"/>
+        <w:ind w:left="0" w:right="0" w:firstLine="0"/>
+        <w:jc w:val="left"/>
+      </w:pPr>
+      <w:r>
+        <w:drawing>
+          <wp:anchor distT="0" distB="0" distL="0" distR="0" simplePos="0" relativeHeight="251658241" behindDoc="0" locked="0" layoutInCell="1" allowOverlap="1">
+            <wp:simplePos x="0" y="0"/>
+            <wp:positionH relativeFrom="page">
+              <wp:posOffset>731976</wp:posOffset>
+            </wp:positionH>
+            <wp:positionV relativeFrom="page">
+              <wp:posOffset>457161</wp:posOffset>
+            </wp:positionV>
+            <wp:extent cx="900609" cy="612597"/>
+            <wp:wrapNone/>
+            <wp:docPr id="1" name="image:1:1" title="image:1:1" descr="Floating image imported from PDF"/>
+            <wp:cNvGraphicFramePr xmlns:a="http://schemas.openxmlformats.org/drawingml/2006/main">
+              <a:graphicFrameLocks noChangeAspect="1"/>
+            </wp:cNvGraphicFramePr>
+            <a:graphic xmlns:a="http://schemas.openxmlformats.org/drawingml/2006/main" xmlns:pic="http://schemas.openxmlformats.org/drawingml/2006/picture">
+              <a:graphicData uri="http://schemas.openxmlformats.org/drawingml/2006/picture">
+                <pic:pic>
+                  <pic:nvPicPr>
+                    <pic:cNvPr id="0" name="image.png"/>
+                    <pic:cNvPicPr/>
+                  </pic:nvPicPr>
+                  <pic:blipFill>
+                    <a:blip r:embed="rId11"/>
+                    <a:stretch>
+                      <a:fillRect/>
+                    </a:stretch>
+                  </pic:blipFill>
+                  <pic:spPr>
+                    <a:xfrm>
+                      <a:off x="0" y="0"/>
+                      <a:ext cx="900609" cy="612597"/>
+                    </a:xfrm>
+                    <a:prstGeom prst="rect"/>
+                  </pic:spPr>
+                </pic:pic>
+              </a:graphicData>
+            </a:graphic>
+          </wp:anchor>
+        </w:drawing>
+      </w:r>
+    </w:p>
     <w:p>
       <w:pPr>
         <w:keepLines/>
@@ -510,7 +560,7 @@
         <w:drawing>
           <wp:inline xmlns:a="http://schemas.openxmlformats.org/drawingml/2006/main" xmlns:pic="http://schemas.openxmlformats.org/drawingml/2006/picture">
             <wp:extent cx="5892816" cy="2896882"/>
-            <wp:docPr id="1" name="image:1:2" title="image:1:2" descr="Image imported from PDF"/>
+            <wp:docPr id="2" name="image:1:2" title="image:1:2" descr="Image imported from PDF"/>
             <wp:cNvGraphicFramePr>
               <a:graphicFrameLocks noChangeAspect="1"/>
             </wp:cNvGraphicFramePr>
@@ -522,7 +572,7 @@
                     <pic:cNvPicPr/>
                   </pic:nvPicPr>
                   <pic:blipFill>
-                    <a:blip r:embed="rId11"/>
+                    <a:blip r:embed="rId12"/>
                     <a:stretch>
                       <a:fillRect/>
                     </a:stretch>
@@ -637,6 +687,56 @@
           <w:sz w:val="22"/>
         </w:rPr>
         <w:t>Note that the index has been sorted according to the specification in the bookmark file, and that pages within the file are created according to the original order in the data file.</w:t>
+      </w:r>
+    </w:p>
+    <w:p>
+      <w:pPr>
+        <w:keepLines/>
+        <w:spacing w:before="0" w:after="0"/>
+        <w:ind w:left="0" w:right="0" w:firstLine="0"/>
+        <w:jc w:val="left"/>
+      </w:pPr>
+      <w:r>
+        <w:drawing>
+          <wp:anchor distT="0" distB="0" distL="0" distR="0" simplePos="0" relativeHeight="251658243" behindDoc="0" locked="0" layoutInCell="1" allowOverlap="1">
+            <wp:simplePos x="0" y="0"/>
+            <wp:positionH relativeFrom="page">
+              <wp:posOffset>731976</wp:posOffset>
+            </wp:positionH>
+            <wp:positionV relativeFrom="page">
+              <wp:posOffset>457161</wp:posOffset>
+            </wp:positionV>
+            <wp:extent cx="900609" cy="612597"/>
+            <wp:wrapNone/>
+            <wp:docPr id="3" name="image:2:1" title="image:2:1" descr="Floating image imported from PDF"/>
+            <wp:cNvGraphicFramePr xmlns:a="http://schemas.openxmlformats.org/drawingml/2006/main">
+              <a:graphicFrameLocks noChangeAspect="1"/>
+            </wp:cNvGraphicFramePr>
+            <a:graphic xmlns:a="http://schemas.openxmlformats.org/drawingml/2006/main" xmlns:pic="http://schemas.openxmlformats.org/drawingml/2006/picture">
+              <a:graphicData uri="http://schemas.openxmlformats.org/drawingml/2006/picture">
+                <pic:pic>
+                  <pic:nvPicPr>
+                    <pic:cNvPr id="0" name="image.png"/>
+                    <pic:cNvPicPr/>
+                  </pic:nvPicPr>
+                  <pic:blipFill>
+                    <a:blip r:embed="rId11"/>
+                    <a:stretch>
+                      <a:fillRect/>
+                    </a:stretch>
+                  </pic:blipFill>
+                  <pic:spPr>
+                    <a:xfrm>
+                      <a:off x="0" y="0"/>
+                      <a:ext cx="900609" cy="612597"/>
+                    </a:xfrm>
+                    <a:prstGeom prst="rect"/>
+                  </pic:spPr>
+                </pic:pic>
+              </a:graphicData>
+            </a:graphic>
+          </wp:anchor>
+        </w:drawing>
       </w:r>
     </w:p>
     <w:p>
@@ -1124,6 +1224,56 @@
           <w:sz w:val="22"/>
         </w:rPr>
         <w:t>Invoices sorted, descending, by transaction amount.</w:t>
+      </w:r>
+    </w:p>
+    <w:p>
+      <w:pPr>
+        <w:keepLines/>
+        <w:spacing w:before="0" w:after="0"/>
+        <w:ind w:left="0" w:right="0" w:firstLine="0"/>
+        <w:jc w:val="left"/>
+      </w:pPr>
+      <w:r>
+        <w:drawing>
+          <wp:anchor distT="0" distB="0" distL="0" distR="0" simplePos="0" relativeHeight="251658244" behindDoc="0" locked="0" layoutInCell="1" allowOverlap="1">
+            <wp:simplePos x="0" y="0"/>
+            <wp:positionH relativeFrom="page">
+              <wp:posOffset>731976</wp:posOffset>
+            </wp:positionH>
+            <wp:positionV relativeFrom="page">
+              <wp:posOffset>457161</wp:posOffset>
+            </wp:positionV>
+            <wp:extent cx="900609" cy="612597"/>
+            <wp:wrapNone/>
+            <wp:docPr id="4" name="image:3:1" title="image:3:1" descr="Floating image imported from PDF"/>
+            <wp:cNvGraphicFramePr xmlns:a="http://schemas.openxmlformats.org/drawingml/2006/main">
+              <a:graphicFrameLocks noChangeAspect="1"/>
+            </wp:cNvGraphicFramePr>
+            <a:graphic xmlns:a="http://schemas.openxmlformats.org/drawingml/2006/main" xmlns:pic="http://schemas.openxmlformats.org/drawingml/2006/picture">
+              <a:graphicData uri="http://schemas.openxmlformats.org/drawingml/2006/picture">
+                <pic:pic>
+                  <pic:nvPicPr>
+                    <pic:cNvPr id="0" name="image.png"/>
+                    <pic:cNvPicPr/>
+                  </pic:nvPicPr>
+                  <pic:blipFill>
+                    <a:blip r:embed="rId11"/>
+                    <a:stretch>
+                      <a:fillRect/>
+                    </a:stretch>
+                  </pic:blipFill>
+                  <pic:spPr>
+                    <a:xfrm>
+                      <a:off x="0" y="0"/>
+                      <a:ext cx="900609" cy="612597"/>
+                    </a:xfrm>
+                    <a:prstGeom prst="rect"/>
+                  </pic:spPr>
+                </pic:pic>
+              </a:graphicData>
+            </a:graphic>
+          </wp:anchor>
+        </w:drawing>
       </w:r>
     </w:p>
     <w:p>
@@ -2410,6 +2560,56 @@
     </w:tbl>
     <w:p>
       <w:pPr>
+        <w:keepLines/>
+        <w:spacing w:before="0" w:after="0"/>
+        <w:ind w:left="0" w:right="0" w:firstLine="0"/>
+        <w:jc w:val="left"/>
+      </w:pPr>
+      <w:r>
+        <w:drawing>
+          <wp:anchor distT="0" distB="0" distL="0" distR="0" simplePos="0" relativeHeight="251658245" behindDoc="0" locked="0" layoutInCell="1" allowOverlap="1">
+            <wp:simplePos x="0" y="0"/>
+            <wp:positionH relativeFrom="page">
+              <wp:posOffset>731976</wp:posOffset>
+            </wp:positionH>
+            <wp:positionV relativeFrom="page">
+              <wp:posOffset>457161</wp:posOffset>
+            </wp:positionV>
+            <wp:extent cx="900609" cy="612597"/>
+            <wp:wrapNone/>
+            <wp:docPr id="5" name="image:4:1" title="image:4:1" descr="Floating image imported from PDF"/>
+            <wp:cNvGraphicFramePr xmlns:a="http://schemas.openxmlformats.org/drawingml/2006/main">
+              <a:graphicFrameLocks noChangeAspect="1"/>
+            </wp:cNvGraphicFramePr>
+            <a:graphic xmlns:a="http://schemas.openxmlformats.org/drawingml/2006/main" xmlns:pic="http://schemas.openxmlformats.org/drawingml/2006/picture">
+              <a:graphicData uri="http://schemas.openxmlformats.org/drawingml/2006/picture">
+                <pic:pic>
+                  <pic:nvPicPr>
+                    <pic:cNvPr id="0" name="image.png"/>
+                    <pic:cNvPicPr/>
+                  </pic:nvPicPr>
+                  <pic:blipFill>
+                    <a:blip r:embed="rId11"/>
+                    <a:stretch>
+                      <a:fillRect/>
+                    </a:stretch>
+                  </pic:blipFill>
+                  <pic:spPr>
+                    <a:xfrm>
+                      <a:off x="0" y="0"/>
+                      <a:ext cx="900609" cy="612597"/>
+                    </a:xfrm>
+                    <a:prstGeom prst="rect"/>
+                  </pic:spPr>
+                </pic:pic>
+              </a:graphicData>
+            </a:graphic>
+          </wp:anchor>
+        </w:drawing>
+      </w:r>
+    </w:p>
+    <w:p>
+      <w:pPr>
         <w:numPr>
           <w:ilvl w:val="0"/>
           <w:numId w:val="13"/>

</xml_diff>